<commit_message>
feat: ajout backend Flask + base de données MySQL
- Création du projet homelink-backend avec Flask
- Configuration de la connexion MySQL via SQLAlchemy
- Création du fichier homelink.sql avec toutes les tables
- Tables : utilisateurs, quartiers, biens_immobiliers, annonces, photos, messages, avis
- Environnement virtuel Python configuré
</commit_message>
<xml_diff>
--- a/HomeLink.docx
+++ b/HomeLink.docx
@@ -1,6 +1,6 @@
 
 <file path=word/document.xml><?xml version="1.0" encoding="utf-8"?>
-<w:document xmlns:wpc="http://schemas.microsoft.com/office/word/2010/wordprocessingCanvas" xmlns:cx="http://schemas.microsoft.com/office/drawing/2014/chartex" xmlns:cx1="http://schemas.microsoft.com/office/drawing/2015/9/8/chartex" xmlns:cx2="http://schemas.microsoft.com/office/drawing/2015/10/21/chartex" xmlns:cx3="http://schemas.microsoft.com/office/drawing/2016/5/9/chartex" xmlns:cx4="http://schemas.microsoft.com/office/drawing/2016/5/10/chartex" xmlns:cx5="http://schemas.microsoft.com/office/drawing/2016/5/11/chartex" xmlns:cx6="http://schemas.microsoft.com/office/drawing/2016/5/12/chartex" xmlns:cx7="http://schemas.microsoft.com/office/drawing/2016/5/13/chartex" xmlns:cx8="http://schemas.microsoft.com/office/drawing/2016/5/14/chartex" xmlns:mc="http://schemas.openxmlformats.org/markup-compatibility/2006" xmlns:aink="http://schemas.microsoft.com/office/drawing/2016/ink" xmlns:am3d="http://schemas.microsoft.com/office/drawing/2017/model3d" xmlns:o="urn:schemas-microsoft-com:office:office" xmlns:oel="http://schemas.microsoft.com/office/2019/extlst" xmlns:r="http://schemas.openxmlformats.org/officeDocument/2006/relationships" xmlns:m="http://schemas.openxmlformats.org/officeDocument/2006/math" xmlns:v="urn:schemas-microsoft-com:vml" xmlns:wp14="http://schemas.microsoft.com/office/word/2010/wordprocessingDrawing" xmlns:wp="http://schemas.openxmlformats.org/drawingml/2006/wordprocessingDrawing" xmlns:w10="urn:schemas-microsoft-com:office:word" xmlns:w="http://schemas.openxmlformats.org/wordprocessingml/2006/main" xmlns:w14="http://schemas.microsoft.com/office/word/2010/wordml" xmlns:w15="http://schemas.microsoft.com/office/word/2012/wordml" xmlns:w16cex="http://schemas.microsoft.com/office/word/2018/wordml/cex" xmlns:w16cid="http://schemas.microsoft.com/office/word/2016/wordml/cid" xmlns:w16="http://schemas.microsoft.com/office/word/2018/wordml" xmlns:w16du="http://schemas.microsoft.com/office/word/2023/wordml/word16du" xmlns:w16sdtdh="http://schemas.microsoft.com/office/word/2020/wordml/sdtdatahash" xmlns:w16sdtfl="http://schemas.microsoft.com/office/word/2024/wordml/sdtformatlock" xmlns:w16se="http://schemas.microsoft.com/office/word/2015/wordml/symex" xmlns:wpg="http://schemas.microsoft.com/office/word/2010/wordprocessingGroup" xmlns:wpi="http://schemas.microsoft.com/office/word/2010/wordprocessingInk" xmlns:wne="http://schemas.microsoft.com/office/word/2006/wordml" xmlns:wps="http://schemas.microsoft.com/office/word/2010/wordprocessingShape" mc:Ignorable="w14 w15 w16se w16cid w16 w16cex w16sdtdh w16sdtfl w16du wp14">
+<w:document xmlns:wpc="http://schemas.microsoft.com/office/word/2010/wordprocessingCanvas" xmlns:cx="http://schemas.microsoft.com/office/drawing/2014/chartex" xmlns:cx1="http://schemas.microsoft.com/office/drawing/2015/9/8/chartex" xmlns:cx2="http://schemas.microsoft.com/office/drawing/2015/10/21/chartex" xmlns:cx3="http://schemas.microsoft.com/office/drawing/2016/5/9/chartex" xmlns:cx4="http://schemas.microsoft.com/office/drawing/2016/5/10/chartex" xmlns:cx5="http://schemas.microsoft.com/office/drawing/2016/5/11/chartex" xmlns:cx6="http://schemas.microsoft.com/office/drawing/2016/5/12/chartex" xmlns:cx7="http://schemas.microsoft.com/office/drawing/2016/5/13/chartex" xmlns:cx8="http://schemas.microsoft.com/office/drawing/2016/5/14/chartex" xmlns:mc="http://schemas.openxmlformats.org/markup-compatibility/2006" xmlns:m="http://schemas.openxmlformats.org/officeDocument/2006/math" xmlns:aink="http://schemas.microsoft.com/office/drawing/2016/ink" xmlns:am3d="http://schemas.microsoft.com/office/drawing/2017/model3d" xmlns:oel="http://schemas.microsoft.com/office/2019/extlst" xmlns:r="http://schemas.openxmlformats.org/officeDocument/2006/relationships" xmlns:wp14="http://schemas.microsoft.com/office/word/2010/wordprocessingDrawing" xmlns:wp="http://schemas.openxmlformats.org/drawingml/2006/wordprocessingDrawing" xmlns:wpg="http://schemas.microsoft.com/office/word/2010/wordprocessingGroup" xmlns:wpi="http://schemas.microsoft.com/office/word/2010/wordprocessingInk" xmlns:wps="http://schemas.microsoft.com/office/word/2010/wordprocessingShape" xmlns:o="urn:schemas-microsoft-com:office:office" xmlns:v="urn:schemas-microsoft-com:vml" xmlns:w10="urn:schemas-microsoft-com:office:word" xmlns:w="http://schemas.openxmlformats.org/wordprocessingml/2006/main" xmlns:w14="http://schemas.microsoft.com/office/word/2010/wordml" xmlns:w15="http://schemas.microsoft.com/office/word/2012/wordml" xmlns:w16cex="http://schemas.microsoft.com/office/word/2018/wordml/cex" xmlns:w16cid="http://schemas.microsoft.com/office/word/2016/wordml/cid" xmlns:w16="http://schemas.microsoft.com/office/word/2018/wordml" xmlns:w16sdtdh="http://schemas.microsoft.com/office/word/2020/wordml/sdtdatahash" xmlns:w16sdtfl="http://schemas.microsoft.com/office/word/2024/wordml/sdtformatlock" xmlns:w16se="http://schemas.microsoft.com/office/word/2015/wordml/symex" xmlns:w16du="http://schemas.microsoft.com/office/word/2023/wordml/word16du" xmlns:wne="http://schemas.microsoft.com/office/word/2006/wordml" mc:Ignorable="w14 w15 w16se w16cid w16 w16cex w16sdtdh w16sdtfl w16du wp14">
   <w:body>
     <w:p>
       <w:pPr>
@@ -7244,30 +7244,1355 @@
     </w:p>
     <w:p>
       <w:pPr>
-        <w:jc w:val="both"/>
-        <w:rPr>
-          <w:rFonts w:ascii="Times New Roman" w:hAnsi="Times New Roman" w:cs="Times New Roman"/>
+        <w:pStyle w:val="font-claude-response-body"/>
+        <w:jc w:val="both"/>
+      </w:pPr>
+      <w:r>
+        <w:rPr>
+          <w:rStyle w:val="lev"/>
+        </w:rPr>
+        <w:lastRenderedPageBreak/>
+        <w:t>Chapitre 2 : Outils utilisés et Résultats obtenus</w:t>
+      </w:r>
+    </w:p>
+    <w:p>
+      <w:pPr>
+        <w:pStyle w:val="font-claude-response-body"/>
+        <w:jc w:val="both"/>
+      </w:pPr>
+      <w:r>
+        <w:rPr>
+          <w:rStyle w:val="lev"/>
+        </w:rPr>
+        <w:t>I. Outils utilisés</w:t>
+      </w:r>
+      <w:r>
+        <w:rPr>
+          <w:rStyle w:val="lev"/>
+        </w:rPr>
+        <w:t> :</w:t>
+      </w:r>
+    </w:p>
+    <w:p>
+      <w:pPr>
+        <w:pStyle w:val="font-claude-response-body"/>
+        <w:jc w:val="both"/>
+      </w:pPr>
+      <w:r>
+        <w:rPr>
+          <w:rStyle w:val="lev"/>
+        </w:rPr>
+        <w:t>1.0 Langages de programmation utilisés :</w:t>
+      </w:r>
+    </w:p>
+    <w:p>
+      <w:pPr>
+        <w:pStyle w:val="font-claude-response-body"/>
+        <w:jc w:val="both"/>
+      </w:pPr>
+      <w:r>
+        <w:rPr>
+          <w:rStyle w:val="lev"/>
+        </w:rPr>
+        <w:t>HTML / CSS :</w:t>
+      </w:r>
+    </w:p>
+    <w:p>
+      <w:pPr>
+        <w:pStyle w:val="font-claude-response-body"/>
+        <w:jc w:val="both"/>
+      </w:pPr>
+      <w:r>
+        <w:t xml:space="preserve">HTML (HyperText Markup </w:t>
+      </w:r>
+      <w:proofErr w:type="spellStart"/>
+      <w:r>
+        <w:t>Language</w:t>
+      </w:r>
+      <w:proofErr w:type="spellEnd"/>
+      <w:r>
+        <w:t>) est le langage de balisage utilisé pour structurer les pages web. CSS (</w:t>
+      </w:r>
+      <w:proofErr w:type="spellStart"/>
+      <w:r>
+        <w:t>Cascading</w:t>
+      </w:r>
+      <w:proofErr w:type="spellEnd"/>
+      <w:r>
+        <w:t xml:space="preserve"> Style Sheets) est le langage de mise en forme qui permet de définir l'apparence visuelle des éléments HTML. Ces deux langages ont été utilisés conjointement pour construire et styliser l'interface de la plateforme HomeLink.</w:t>
+      </w:r>
+    </w:p>
+    <w:p>
+      <w:pPr>
+        <w:pStyle w:val="font-claude-response-body"/>
+        <w:jc w:val="both"/>
+      </w:pPr>
+      <w:r>
+        <w:rPr>
+          <w:noProof/>
+        </w:rPr>
+        <w:drawing>
+          <wp:inline distT="0" distB="0" distL="0" distR="0" wp14:anchorId="1170AF11" wp14:editId="28BE6AEF">
+            <wp:extent cx="1866900" cy="1092200"/>
+            <wp:effectExtent l="0" t="0" r="0" b="0"/>
+            <wp:docPr id="201173904" name="Image 1"/>
+            <wp:cNvGraphicFramePr>
+              <a:graphicFrameLocks xmlns:a="http://schemas.openxmlformats.org/drawingml/2006/main" noChangeAspect="1"/>
+            </wp:cNvGraphicFramePr>
+            <a:graphic xmlns:a="http://schemas.openxmlformats.org/drawingml/2006/main">
+              <a:graphicData uri="http://schemas.openxmlformats.org/drawingml/2006/picture">
+                <pic:pic xmlns:pic="http://schemas.openxmlformats.org/drawingml/2006/picture">
+                  <pic:nvPicPr>
+                    <pic:cNvPr id="201173904" name="Image 201173904"/>
+                    <pic:cNvPicPr/>
+                  </pic:nvPicPr>
+                  <pic:blipFill>
+                    <a:blip r:embed="rId12">
+                      <a:extLst>
+                        <a:ext uri="{28A0092B-C50C-407E-A947-70E740481C1C}">
+                          <a14:useLocalDpi xmlns:a14="http://schemas.microsoft.com/office/drawing/2010/main" val="0"/>
+                        </a:ext>
+                      </a:extLst>
+                    </a:blip>
+                    <a:stretch>
+                      <a:fillRect/>
+                    </a:stretch>
+                  </pic:blipFill>
+                  <pic:spPr>
+                    <a:xfrm>
+                      <a:off x="0" y="0"/>
+                      <a:ext cx="1866900" cy="1092200"/>
+                    </a:xfrm>
+                    <a:prstGeom prst="rect">
+                      <a:avLst/>
+                    </a:prstGeom>
+                  </pic:spPr>
+                </pic:pic>
+              </a:graphicData>
+            </a:graphic>
+          </wp:inline>
+        </w:drawing>
+      </w:r>
+    </w:p>
+    <w:p>
+      <w:pPr>
+        <w:pStyle w:val="font-claude-response-body"/>
+        <w:jc w:val="both"/>
+      </w:pPr>
+      <w:r>
+        <w:rPr>
+          <w:rStyle w:val="lev"/>
+        </w:rPr>
+        <w:t>JavaScript :</w:t>
+      </w:r>
+    </w:p>
+    <w:p>
+      <w:pPr>
+        <w:pStyle w:val="font-claude-response-body"/>
+        <w:jc w:val="both"/>
+      </w:pPr>
+      <w:r>
+        <w:t xml:space="preserve">JavaScript est un langage de programmation interprété, orienté web, qui permet d'ajouter de l'interactivité aux pages. Il constitue la base du </w:t>
+      </w:r>
+      <w:proofErr w:type="spellStart"/>
+      <w:r>
+        <w:t>framework</w:t>
+      </w:r>
+      <w:proofErr w:type="spellEnd"/>
+      <w:r>
+        <w:t xml:space="preserve"> React.js utilisé pour le développement du frontend de HomeLink.</w:t>
+      </w:r>
+    </w:p>
+    <w:p>
+      <w:pPr>
+        <w:pStyle w:val="font-claude-response-body"/>
+        <w:jc w:val="both"/>
+      </w:pPr>
+      <w:r>
+        <w:rPr>
+          <w:noProof/>
+        </w:rPr>
+        <w:drawing>
+          <wp:inline distT="0" distB="0" distL="0" distR="0" wp14:anchorId="002B784C" wp14:editId="48A028E8">
+            <wp:extent cx="1803400" cy="1117600"/>
+            <wp:effectExtent l="0" t="0" r="0" b="0"/>
+            <wp:docPr id="1364405825" name="Image 2"/>
+            <wp:cNvGraphicFramePr>
+              <a:graphicFrameLocks xmlns:a="http://schemas.openxmlformats.org/drawingml/2006/main" noChangeAspect="1"/>
+            </wp:cNvGraphicFramePr>
+            <a:graphic xmlns:a="http://schemas.openxmlformats.org/drawingml/2006/main">
+              <a:graphicData uri="http://schemas.openxmlformats.org/drawingml/2006/picture">
+                <pic:pic xmlns:pic="http://schemas.openxmlformats.org/drawingml/2006/picture">
+                  <pic:nvPicPr>
+                    <pic:cNvPr id="1364405825" name="Image 1364405825"/>
+                    <pic:cNvPicPr/>
+                  </pic:nvPicPr>
+                  <pic:blipFill>
+                    <a:blip r:embed="rId13">
+                      <a:extLst>
+                        <a:ext uri="{28A0092B-C50C-407E-A947-70E740481C1C}">
+                          <a14:useLocalDpi xmlns:a14="http://schemas.microsoft.com/office/drawing/2010/main" val="0"/>
+                        </a:ext>
+                      </a:extLst>
+                    </a:blip>
+                    <a:stretch>
+                      <a:fillRect/>
+                    </a:stretch>
+                  </pic:blipFill>
+                  <pic:spPr>
+                    <a:xfrm>
+                      <a:off x="0" y="0"/>
+                      <a:ext cx="1803400" cy="1117600"/>
+                    </a:xfrm>
+                    <a:prstGeom prst="rect">
+                      <a:avLst/>
+                    </a:prstGeom>
+                  </pic:spPr>
+                </pic:pic>
+              </a:graphicData>
+            </a:graphic>
+          </wp:inline>
+        </w:drawing>
+      </w:r>
+    </w:p>
+    <w:p>
+      <w:pPr>
+        <w:pStyle w:val="font-claude-response-body"/>
+        <w:jc w:val="both"/>
+      </w:pPr>
+      <w:r>
+        <w:rPr>
+          <w:rStyle w:val="lev"/>
+        </w:rPr>
+        <w:t>Python :</w:t>
+      </w:r>
+    </w:p>
+    <w:p>
+      <w:pPr>
+        <w:pStyle w:val="font-claude-response-body"/>
+        <w:jc w:val="both"/>
+      </w:pPr>
+      <w:r>
+        <w:t xml:space="preserve">Python est un langage de programmation polyvalent et facile à prendre en main. Il a été utilisé pour développer le backend de la plateforme HomeLink à travers le </w:t>
+      </w:r>
+      <w:proofErr w:type="spellStart"/>
+      <w:r>
+        <w:t>framework</w:t>
+      </w:r>
+      <w:proofErr w:type="spellEnd"/>
+      <w:r>
+        <w:t xml:space="preserve"> Flask. Python gère la logique métier, le traitement des requêtes HTTP et la communication avec la base de données.</w:t>
+      </w:r>
+    </w:p>
+    <w:p>
+      <w:pPr>
+        <w:pStyle w:val="font-claude-response-body"/>
+        <w:jc w:val="both"/>
+      </w:pPr>
+      <w:r>
+        <w:rPr>
+          <w:noProof/>
+        </w:rPr>
+        <w:drawing>
+          <wp:inline distT="0" distB="0" distL="0" distR="0" wp14:anchorId="0A9413F2" wp14:editId="0C1EC7EB">
+            <wp:extent cx="1422400" cy="1422400"/>
+            <wp:effectExtent l="0" t="0" r="0" b="0"/>
+            <wp:docPr id="1346886276" name="Image 3"/>
+            <wp:cNvGraphicFramePr>
+              <a:graphicFrameLocks xmlns:a="http://schemas.openxmlformats.org/drawingml/2006/main" noChangeAspect="1"/>
+            </wp:cNvGraphicFramePr>
+            <a:graphic xmlns:a="http://schemas.openxmlformats.org/drawingml/2006/main">
+              <a:graphicData uri="http://schemas.openxmlformats.org/drawingml/2006/picture">
+                <pic:pic xmlns:pic="http://schemas.openxmlformats.org/drawingml/2006/picture">
+                  <pic:nvPicPr>
+                    <pic:cNvPr id="1346886276" name="Image 1346886276"/>
+                    <pic:cNvPicPr/>
+                  </pic:nvPicPr>
+                  <pic:blipFill>
+                    <a:blip r:embed="rId14">
+                      <a:extLst>
+                        <a:ext uri="{28A0092B-C50C-407E-A947-70E740481C1C}">
+                          <a14:useLocalDpi xmlns:a14="http://schemas.microsoft.com/office/drawing/2010/main" val="0"/>
+                        </a:ext>
+                      </a:extLst>
+                    </a:blip>
+                    <a:stretch>
+                      <a:fillRect/>
+                    </a:stretch>
+                  </pic:blipFill>
+                  <pic:spPr>
+                    <a:xfrm>
+                      <a:off x="0" y="0"/>
+                      <a:ext cx="1422400" cy="1422400"/>
+                    </a:xfrm>
+                    <a:prstGeom prst="rect">
+                      <a:avLst/>
+                    </a:prstGeom>
+                  </pic:spPr>
+                </pic:pic>
+              </a:graphicData>
+            </a:graphic>
+          </wp:inline>
+        </w:drawing>
+      </w:r>
+    </w:p>
+    <w:p>
+      <w:pPr>
+        <w:pStyle w:val="font-claude-response-body"/>
+        <w:jc w:val="both"/>
+      </w:pPr>
+      <w:r>
+        <w:rPr>
+          <w:rStyle w:val="lev"/>
+        </w:rPr>
+        <w:lastRenderedPageBreak/>
+        <w:t>SQL :</w:t>
+      </w:r>
+    </w:p>
+    <w:p>
+      <w:pPr>
+        <w:pStyle w:val="font-claude-response-body"/>
+        <w:jc w:val="both"/>
+      </w:pPr>
+      <w:r>
+        <w:t>SQL (</w:t>
+      </w:r>
+      <w:proofErr w:type="spellStart"/>
+      <w:r>
+        <w:t>Structured</w:t>
+      </w:r>
+      <w:proofErr w:type="spellEnd"/>
+      <w:r>
+        <w:t xml:space="preserve"> Query </w:t>
+      </w:r>
+      <w:proofErr w:type="spellStart"/>
+      <w:r>
+        <w:t>Language</w:t>
+      </w:r>
+      <w:proofErr w:type="spellEnd"/>
+      <w:r>
+        <w:t>) est le langage standard pour interagir avec les bases de données relationnelles. Il a été utilisé pour créer les tables, insérer les données et effectuer les requêtes nécessaires au bon fonctionnement de la plateforme HomeLink via MySQL.</w:t>
+      </w:r>
+    </w:p>
+    <w:p>
+      <w:pPr>
+        <w:pStyle w:val="font-claude-response-body"/>
+        <w:jc w:val="both"/>
+        <w:rPr>
+          <w:rStyle w:val="lev"/>
+        </w:rPr>
+      </w:pPr>
+      <w:r>
+        <w:rPr>
           <w:b/>
           <w:bCs/>
-          <w:color w:val="000000" w:themeColor="text1"/>
-          <w:sz w:val="24"/>
-          <w:szCs w:val="24"/>
-        </w:rPr>
-      </w:pPr>
-      <w:r>
-        <w:rPr>
-          <w:rFonts w:ascii="Times New Roman" w:hAnsi="Times New Roman" w:cs="Times New Roman"/>
+          <w:noProof/>
+        </w:rPr>
+        <w:drawing>
+          <wp:inline distT="0" distB="0" distL="0" distR="0" wp14:anchorId="21F7A79B" wp14:editId="6B4D98B6">
+            <wp:extent cx="1905000" cy="1066800"/>
+            <wp:effectExtent l="0" t="0" r="0" b="0"/>
+            <wp:docPr id="1302665704" name="Image 4"/>
+            <wp:cNvGraphicFramePr>
+              <a:graphicFrameLocks xmlns:a="http://schemas.openxmlformats.org/drawingml/2006/main" noChangeAspect="1"/>
+            </wp:cNvGraphicFramePr>
+            <a:graphic xmlns:a="http://schemas.openxmlformats.org/drawingml/2006/main">
+              <a:graphicData uri="http://schemas.openxmlformats.org/drawingml/2006/picture">
+                <pic:pic xmlns:pic="http://schemas.openxmlformats.org/drawingml/2006/picture">
+                  <pic:nvPicPr>
+                    <pic:cNvPr id="1302665704" name="Image 1302665704"/>
+                    <pic:cNvPicPr/>
+                  </pic:nvPicPr>
+                  <pic:blipFill>
+                    <a:blip r:embed="rId15">
+                      <a:extLst>
+                        <a:ext uri="{28A0092B-C50C-407E-A947-70E740481C1C}">
+                          <a14:useLocalDpi xmlns:a14="http://schemas.microsoft.com/office/drawing/2010/main" val="0"/>
+                        </a:ext>
+                      </a:extLst>
+                    </a:blip>
+                    <a:stretch>
+                      <a:fillRect/>
+                    </a:stretch>
+                  </pic:blipFill>
+                  <pic:spPr>
+                    <a:xfrm>
+                      <a:off x="0" y="0"/>
+                      <a:ext cx="1905000" cy="1066800"/>
+                    </a:xfrm>
+                    <a:prstGeom prst="rect">
+                      <a:avLst/>
+                    </a:prstGeom>
+                  </pic:spPr>
+                </pic:pic>
+              </a:graphicData>
+            </a:graphic>
+          </wp:inline>
+        </w:drawing>
+      </w:r>
+    </w:p>
+    <w:p>
+      <w:pPr>
+        <w:pStyle w:val="font-claude-response-body"/>
+        <w:jc w:val="both"/>
+      </w:pPr>
+      <w:r>
+        <w:rPr>
+          <w:rStyle w:val="lev"/>
+        </w:rPr>
+        <w:t xml:space="preserve">1.1 </w:t>
+      </w:r>
+      <w:proofErr w:type="spellStart"/>
+      <w:r>
+        <w:rPr>
+          <w:rStyle w:val="lev"/>
+        </w:rPr>
+        <w:t>Cursor</w:t>
+      </w:r>
+      <w:proofErr w:type="spellEnd"/>
+      <w:r>
+        <w:rPr>
+          <w:rStyle w:val="lev"/>
+        </w:rPr>
+        <w:t> :</w:t>
+      </w:r>
+    </w:p>
+    <w:p>
+      <w:pPr>
+        <w:pStyle w:val="font-claude-response-body"/>
+        <w:jc w:val="both"/>
+      </w:pPr>
+      <w:proofErr w:type="spellStart"/>
+      <w:r>
+        <w:t>Cursor</w:t>
+      </w:r>
+      <w:proofErr w:type="spellEnd"/>
+      <w:r>
+        <w:t xml:space="preserve"> est un éditeur de code intelligent basé sur Visual Studio Code. Il a été utilisé tout au long du développement du projet pour écrire le code frontend et backend. Son assistance intégrée permet de naviguer rapidement dans les fichiers, de détecter les erreurs en temps réel et d'améliorer la productivité lors de l'écriture du code.</w:t>
+      </w:r>
+    </w:p>
+    <w:p>
+      <w:pPr>
+        <w:pStyle w:val="font-claude-response-body"/>
+        <w:jc w:val="both"/>
+      </w:pPr>
+      <w:r>
+        <w:rPr>
+          <w:noProof/>
+        </w:rPr>
+        <w:drawing>
+          <wp:inline distT="0" distB="0" distL="0" distR="0" wp14:anchorId="58124795" wp14:editId="2694918E">
+            <wp:extent cx="1640840" cy="1446550"/>
+            <wp:effectExtent l="0" t="0" r="0" b="1270"/>
+            <wp:docPr id="1500560047" name="Image 5"/>
+            <wp:cNvGraphicFramePr>
+              <a:graphicFrameLocks xmlns:a="http://schemas.openxmlformats.org/drawingml/2006/main" noChangeAspect="1"/>
+            </wp:cNvGraphicFramePr>
+            <a:graphic xmlns:a="http://schemas.openxmlformats.org/drawingml/2006/main">
+              <a:graphicData uri="http://schemas.openxmlformats.org/drawingml/2006/picture">
+                <pic:pic xmlns:pic="http://schemas.openxmlformats.org/drawingml/2006/picture">
+                  <pic:nvPicPr>
+                    <pic:cNvPr id="1500560047" name="Image 1500560047"/>
+                    <pic:cNvPicPr/>
+                  </pic:nvPicPr>
+                  <pic:blipFill>
+                    <a:blip r:embed="rId16" cstate="print">
+                      <a:extLst>
+                        <a:ext uri="{28A0092B-C50C-407E-A947-70E740481C1C}">
+                          <a14:useLocalDpi xmlns:a14="http://schemas.microsoft.com/office/drawing/2010/main" val="0"/>
+                        </a:ext>
+                      </a:extLst>
+                    </a:blip>
+                    <a:stretch>
+                      <a:fillRect/>
+                    </a:stretch>
+                  </pic:blipFill>
+                  <pic:spPr>
+                    <a:xfrm>
+                      <a:off x="0" y="0"/>
+                      <a:ext cx="1657199" cy="1460972"/>
+                    </a:xfrm>
+                    <a:prstGeom prst="rect">
+                      <a:avLst/>
+                    </a:prstGeom>
+                  </pic:spPr>
+                </pic:pic>
+              </a:graphicData>
+            </a:graphic>
+          </wp:inline>
+        </w:drawing>
+      </w:r>
+    </w:p>
+    <w:p>
+      <w:pPr>
+        <w:pStyle w:val="font-claude-response-body"/>
+        <w:jc w:val="both"/>
+      </w:pPr>
+      <w:r>
+        <w:rPr>
+          <w:rStyle w:val="lev"/>
+        </w:rPr>
+        <w:t>1.2 Microsoft Word</w:t>
+      </w:r>
+      <w:r>
+        <w:rPr>
+          <w:rStyle w:val="lev"/>
+        </w:rPr>
+        <w:t> :</w:t>
+      </w:r>
+    </w:p>
+    <w:p>
+      <w:pPr>
+        <w:pStyle w:val="font-claude-response-body"/>
+        <w:jc w:val="both"/>
+      </w:pPr>
+      <w:r>
+        <w:t>Microsoft Word a été utilisé pour la rédaction et la mise en forme de ce rapport de projet. Il a permis de structurer le document avec des titres numérotés, d'insérer les diagrammes et les captures d'écran, et de produire un rendu professionnel adapté aux exigences académiques.</w:t>
+      </w:r>
+    </w:p>
+    <w:p>
+      <w:pPr>
+        <w:pStyle w:val="font-claude-response-body"/>
+        <w:jc w:val="both"/>
+        <w:rPr>
+          <w:rStyle w:val="lev"/>
+        </w:rPr>
+      </w:pPr>
+      <w:r>
+        <w:rPr>
           <w:b/>
           <w:bCs/>
-          <w:color w:val="000000" w:themeColor="text1"/>
-          <w:sz w:val="24"/>
-          <w:szCs w:val="24"/>
-          <w:u w:val="single"/>
-        </w:rPr>
+          <w:noProof/>
+        </w:rPr>
+        <w:drawing>
+          <wp:inline distT="0" distB="0" distL="0" distR="0" wp14:anchorId="617E799E" wp14:editId="15C7C4AE">
+            <wp:extent cx="1422400" cy="1422400"/>
+            <wp:effectExtent l="0" t="0" r="0" b="0"/>
+            <wp:docPr id="807181011" name="Image 6"/>
+            <wp:cNvGraphicFramePr>
+              <a:graphicFrameLocks xmlns:a="http://schemas.openxmlformats.org/drawingml/2006/main" noChangeAspect="1"/>
+            </wp:cNvGraphicFramePr>
+            <a:graphic xmlns:a="http://schemas.openxmlformats.org/drawingml/2006/main">
+              <a:graphicData uri="http://schemas.openxmlformats.org/drawingml/2006/picture">
+                <pic:pic xmlns:pic="http://schemas.openxmlformats.org/drawingml/2006/picture">
+                  <pic:nvPicPr>
+                    <pic:cNvPr id="807181011" name="Image 807181011"/>
+                    <pic:cNvPicPr/>
+                  </pic:nvPicPr>
+                  <pic:blipFill>
+                    <a:blip r:embed="rId17">
+                      <a:extLst>
+                        <a:ext uri="{28A0092B-C50C-407E-A947-70E740481C1C}">
+                          <a14:useLocalDpi xmlns:a14="http://schemas.microsoft.com/office/drawing/2010/main" val="0"/>
+                        </a:ext>
+                      </a:extLst>
+                    </a:blip>
+                    <a:stretch>
+                      <a:fillRect/>
+                    </a:stretch>
+                  </pic:blipFill>
+                  <pic:spPr>
+                    <a:xfrm>
+                      <a:off x="0" y="0"/>
+                      <a:ext cx="1422400" cy="1422400"/>
+                    </a:xfrm>
+                    <a:prstGeom prst="rect">
+                      <a:avLst/>
+                    </a:prstGeom>
+                  </pic:spPr>
+                </pic:pic>
+              </a:graphicData>
+            </a:graphic>
+          </wp:inline>
+        </w:drawing>
+      </w:r>
+    </w:p>
+    <w:p>
+      <w:pPr>
+        <w:pStyle w:val="font-claude-response-body"/>
+        <w:jc w:val="both"/>
+      </w:pPr>
+      <w:r>
+        <w:rPr>
+          <w:rStyle w:val="lev"/>
+        </w:rPr>
+        <w:t xml:space="preserve">1.3 </w:t>
+      </w:r>
+      <w:proofErr w:type="spellStart"/>
+      <w:r>
+        <w:rPr>
+          <w:rStyle w:val="lev"/>
+        </w:rPr>
+        <w:t>PlantUML</w:t>
+      </w:r>
+      <w:proofErr w:type="spellEnd"/>
+      <w:r>
+        <w:rPr>
+          <w:rStyle w:val="lev"/>
+        </w:rPr>
+        <w:t> :</w:t>
+      </w:r>
+    </w:p>
+    <w:p>
+      <w:pPr>
+        <w:pStyle w:val="font-claude-response-body"/>
+        <w:jc w:val="both"/>
+      </w:pPr>
+      <w:proofErr w:type="spellStart"/>
+      <w:r>
+        <w:t>PlantUML</w:t>
+      </w:r>
+      <w:proofErr w:type="spellEnd"/>
+      <w:r>
+        <w:t xml:space="preserve"> est un outil open source permettant de générer des diagrammes UML à partir d'un langage textuel simple. Il a été utilisé pour produire l'ensemble des diagrammes de modélisation du projet : le diagramme de cas d'utilisation, le diagramme de classes ainsi que </w:t>
+      </w:r>
+      <w:r>
         <w:lastRenderedPageBreak/>
-        <w:t>Chapitre 2</w:t>
-      </w:r>
-      <w:r>
+        <w:t>les deux diagrammes de séquence. Le fichier plantuml.jar a été intégré directement dans le projet pour générer les diagrammes en local.</w:t>
+      </w:r>
+    </w:p>
+    <w:p>
+      <w:pPr>
+        <w:pStyle w:val="font-claude-response-body"/>
+        <w:jc w:val="both"/>
+        <w:rPr>
+          <w:rStyle w:val="Accentuation"/>
+          <w:i w:val="0"/>
+          <w:iCs w:val="0"/>
+        </w:rPr>
+      </w:pPr>
+      <w:r>
+        <w:rPr>
+          <w:noProof/>
+        </w:rPr>
+        <w:drawing>
+          <wp:inline distT="0" distB="0" distL="0" distR="0" wp14:anchorId="22717D37" wp14:editId="268AB02B">
+            <wp:extent cx="1663700" cy="1206500"/>
+            <wp:effectExtent l="0" t="0" r="0" b="0"/>
+            <wp:docPr id="2143214180" name="Image 7"/>
+            <wp:cNvGraphicFramePr>
+              <a:graphicFrameLocks xmlns:a="http://schemas.openxmlformats.org/drawingml/2006/main" noChangeAspect="1"/>
+            </wp:cNvGraphicFramePr>
+            <a:graphic xmlns:a="http://schemas.openxmlformats.org/drawingml/2006/main">
+              <a:graphicData uri="http://schemas.openxmlformats.org/drawingml/2006/picture">
+                <pic:pic xmlns:pic="http://schemas.openxmlformats.org/drawingml/2006/picture">
+                  <pic:nvPicPr>
+                    <pic:cNvPr id="2143214180" name="Image 2143214180"/>
+                    <pic:cNvPicPr/>
+                  </pic:nvPicPr>
+                  <pic:blipFill>
+                    <a:blip r:embed="rId18">
+                      <a:extLst>
+                        <a:ext uri="{28A0092B-C50C-407E-A947-70E740481C1C}">
+                          <a14:useLocalDpi xmlns:a14="http://schemas.microsoft.com/office/drawing/2010/main" val="0"/>
+                        </a:ext>
+                      </a:extLst>
+                    </a:blip>
+                    <a:stretch>
+                      <a:fillRect/>
+                    </a:stretch>
+                  </pic:blipFill>
+                  <pic:spPr>
+                    <a:xfrm>
+                      <a:off x="0" y="0"/>
+                      <a:ext cx="1663700" cy="1206500"/>
+                    </a:xfrm>
+                    <a:prstGeom prst="rect">
+                      <a:avLst/>
+                    </a:prstGeom>
+                  </pic:spPr>
+                </pic:pic>
+              </a:graphicData>
+            </a:graphic>
+          </wp:inline>
+        </w:drawing>
+      </w:r>
+    </w:p>
+    <w:p>
+      <w:pPr>
+        <w:pStyle w:val="font-claude-response-body"/>
+        <w:jc w:val="both"/>
+      </w:pPr>
+      <w:r>
+        <w:rPr>
+          <w:rStyle w:val="lev"/>
+        </w:rPr>
+        <w:t>1.4 React.js</w:t>
+      </w:r>
+      <w:r>
+        <w:rPr>
+          <w:rStyle w:val="lev"/>
+        </w:rPr>
+        <w:t> :</w:t>
+      </w:r>
+    </w:p>
+    <w:p>
+      <w:pPr>
+        <w:pStyle w:val="font-claude-response-body"/>
+        <w:jc w:val="both"/>
+      </w:pPr>
+      <w:r>
+        <w:t>React.js est une bibliothèque JavaScript open source développée par Meta, utilisée pour construire des interfaces utilisateur. Dans le cadre de ce projet, React.js a été utilisé pour développer le frontend web de la plateforme HomeLink. Il permet de découper l'interface en composants réutilisables et de mettre à jour dynamiquement les données affichées sans recharger la page.</w:t>
+      </w:r>
+    </w:p>
+    <w:p>
+      <w:pPr>
+        <w:pStyle w:val="font-claude-response-body"/>
+        <w:jc w:val="both"/>
+        <w:rPr>
+          <w:rStyle w:val="Accentuation"/>
+          <w:i w:val="0"/>
+          <w:iCs w:val="0"/>
+        </w:rPr>
+      </w:pPr>
+      <w:r>
+        <w:rPr>
+          <w:noProof/>
+        </w:rPr>
+        <w:drawing>
+          <wp:inline distT="0" distB="0" distL="0" distR="0" wp14:anchorId="0EF9EE14" wp14:editId="1E6E64DC">
+            <wp:extent cx="1892300" cy="1066800"/>
+            <wp:effectExtent l="0" t="0" r="0" b="0"/>
+            <wp:docPr id="953738750" name="Image 8"/>
+            <wp:cNvGraphicFramePr>
+              <a:graphicFrameLocks xmlns:a="http://schemas.openxmlformats.org/drawingml/2006/main" noChangeAspect="1"/>
+            </wp:cNvGraphicFramePr>
+            <a:graphic xmlns:a="http://schemas.openxmlformats.org/drawingml/2006/main">
+              <a:graphicData uri="http://schemas.openxmlformats.org/drawingml/2006/picture">
+                <pic:pic xmlns:pic="http://schemas.openxmlformats.org/drawingml/2006/picture">
+                  <pic:nvPicPr>
+                    <pic:cNvPr id="953738750" name="Image 953738750"/>
+                    <pic:cNvPicPr/>
+                  </pic:nvPicPr>
+                  <pic:blipFill>
+                    <a:blip r:embed="rId19">
+                      <a:extLst>
+                        <a:ext uri="{28A0092B-C50C-407E-A947-70E740481C1C}">
+                          <a14:useLocalDpi xmlns:a14="http://schemas.microsoft.com/office/drawing/2010/main" val="0"/>
+                        </a:ext>
+                      </a:extLst>
+                    </a:blip>
+                    <a:stretch>
+                      <a:fillRect/>
+                    </a:stretch>
+                  </pic:blipFill>
+                  <pic:spPr>
+                    <a:xfrm>
+                      <a:off x="0" y="0"/>
+                      <a:ext cx="1892300" cy="1066800"/>
+                    </a:xfrm>
+                    <a:prstGeom prst="rect">
+                      <a:avLst/>
+                    </a:prstGeom>
+                  </pic:spPr>
+                </pic:pic>
+              </a:graphicData>
+            </a:graphic>
+          </wp:inline>
+        </w:drawing>
+      </w:r>
+    </w:p>
+    <w:p>
+      <w:pPr>
+        <w:pStyle w:val="font-claude-response-body"/>
+        <w:jc w:val="both"/>
+      </w:pPr>
+      <w:r>
+        <w:rPr>
+          <w:rStyle w:val="lev"/>
+        </w:rPr>
+        <w:t>1.5 Flask</w:t>
+      </w:r>
+      <w:r>
+        <w:rPr>
+          <w:rStyle w:val="lev"/>
+        </w:rPr>
+        <w:t> :</w:t>
+      </w:r>
+    </w:p>
+    <w:p>
+      <w:pPr>
+        <w:pStyle w:val="font-claude-response-body"/>
+        <w:jc w:val="both"/>
+      </w:pPr>
+      <w:r>
+        <w:t>Flask est un micro-</w:t>
+      </w:r>
+      <w:proofErr w:type="spellStart"/>
+      <w:r>
+        <w:t>framework</w:t>
+      </w:r>
+      <w:proofErr w:type="spellEnd"/>
+      <w:r>
+        <w:t xml:space="preserve"> web en Python utilisé pour développer le backend de l'application. Il permet de créer des API REST que le frontend </w:t>
+      </w:r>
+      <w:proofErr w:type="spellStart"/>
+      <w:r>
+        <w:t>React</w:t>
+      </w:r>
+      <w:proofErr w:type="spellEnd"/>
+      <w:r>
+        <w:t xml:space="preserve"> appelle pour récupérer ou envoyer des données. Flask a été choisi pour sa simplicité, sa légèreté et sa facilité d'apprentissage.</w:t>
+      </w:r>
+    </w:p>
+    <w:p>
+      <w:pPr>
+        <w:pStyle w:val="font-claude-response-body"/>
+        <w:jc w:val="both"/>
+        <w:rPr>
+          <w:rStyle w:val="Accentuation"/>
+          <w:i w:val="0"/>
+          <w:iCs w:val="0"/>
+        </w:rPr>
+      </w:pPr>
+      <w:r>
+        <w:rPr>
+          <w:noProof/>
+        </w:rPr>
+        <w:drawing>
+          <wp:inline distT="0" distB="0" distL="0" distR="0" wp14:anchorId="2AFDF0A2" wp14:editId="45D5C965">
+            <wp:extent cx="1803400" cy="1117600"/>
+            <wp:effectExtent l="0" t="0" r="0" b="0"/>
+            <wp:docPr id="1860770164" name="Image 9"/>
+            <wp:cNvGraphicFramePr>
+              <a:graphicFrameLocks xmlns:a="http://schemas.openxmlformats.org/drawingml/2006/main" noChangeAspect="1"/>
+            </wp:cNvGraphicFramePr>
+            <a:graphic xmlns:a="http://schemas.openxmlformats.org/drawingml/2006/main">
+              <a:graphicData uri="http://schemas.openxmlformats.org/drawingml/2006/picture">
+                <pic:pic xmlns:pic="http://schemas.openxmlformats.org/drawingml/2006/picture">
+                  <pic:nvPicPr>
+                    <pic:cNvPr id="1860770164" name="Image 1860770164"/>
+                    <pic:cNvPicPr/>
+                  </pic:nvPicPr>
+                  <pic:blipFill>
+                    <a:blip r:embed="rId20">
+                      <a:extLst>
+                        <a:ext uri="{28A0092B-C50C-407E-A947-70E740481C1C}">
+                          <a14:useLocalDpi xmlns:a14="http://schemas.microsoft.com/office/drawing/2010/main" val="0"/>
+                        </a:ext>
+                      </a:extLst>
+                    </a:blip>
+                    <a:stretch>
+                      <a:fillRect/>
+                    </a:stretch>
+                  </pic:blipFill>
+                  <pic:spPr>
+                    <a:xfrm>
+                      <a:off x="0" y="0"/>
+                      <a:ext cx="1803400" cy="1117600"/>
+                    </a:xfrm>
+                    <a:prstGeom prst="rect">
+                      <a:avLst/>
+                    </a:prstGeom>
+                  </pic:spPr>
+                </pic:pic>
+              </a:graphicData>
+            </a:graphic>
+          </wp:inline>
+        </w:drawing>
+      </w:r>
+    </w:p>
+    <w:p>
+      <w:pPr>
+        <w:pStyle w:val="font-claude-response-body"/>
+        <w:jc w:val="both"/>
+      </w:pPr>
+      <w:r>
+        <w:rPr>
+          <w:rStyle w:val="lev"/>
+        </w:rPr>
+        <w:t xml:space="preserve">1.6 </w:t>
+      </w:r>
+      <w:r>
+        <w:rPr>
+          <w:rStyle w:val="lev"/>
+        </w:rPr>
+        <w:t xml:space="preserve">phpMyAdmin pour </w:t>
+      </w:r>
+      <w:r>
+        <w:rPr>
+          <w:rStyle w:val="lev"/>
+        </w:rPr>
+        <w:t>MySQL</w:t>
+      </w:r>
+      <w:r>
+        <w:rPr>
+          <w:rStyle w:val="lev"/>
+        </w:rPr>
+        <w:t> :</w:t>
+      </w:r>
+    </w:p>
+    <w:p>
+      <w:pPr>
+        <w:pStyle w:val="font-claude-response-body"/>
+        <w:jc w:val="both"/>
+      </w:pPr>
+      <w:r>
+        <w:t>MySQL est un système de gestion de base de données relationnelle open source. Il a été utilisé pour stocker toutes les données de la plateforme HomeLink : les utilisateurs, les biens immobiliers, les annonces, les quartiers, les messages et les avis. La structure de la base de données a été conçue directement à partir du diagramme de classes réalisé lors de la phase de conception.</w:t>
+      </w:r>
+    </w:p>
+    <w:p>
+      <w:pPr>
+        <w:pStyle w:val="font-claude-response-body"/>
+        <w:jc w:val="both"/>
+        <w:rPr>
+          <w:rStyle w:val="Accentuation"/>
+          <w:i w:val="0"/>
+          <w:iCs w:val="0"/>
+        </w:rPr>
+      </w:pPr>
+      <w:r>
+        <w:rPr>
+          <w:noProof/>
+        </w:rPr>
+        <w:lastRenderedPageBreak/>
+        <w:drawing>
+          <wp:inline distT="0" distB="0" distL="0" distR="0" wp14:anchorId="1A62406F" wp14:editId="4F8DCE61">
+            <wp:extent cx="1689100" cy="1193800"/>
+            <wp:effectExtent l="0" t="0" r="0" b="0"/>
+            <wp:docPr id="53668812" name="Image 10"/>
+            <wp:cNvGraphicFramePr>
+              <a:graphicFrameLocks xmlns:a="http://schemas.openxmlformats.org/drawingml/2006/main" noChangeAspect="1"/>
+            </wp:cNvGraphicFramePr>
+            <a:graphic xmlns:a="http://schemas.openxmlformats.org/drawingml/2006/main">
+              <a:graphicData uri="http://schemas.openxmlformats.org/drawingml/2006/picture">
+                <pic:pic xmlns:pic="http://schemas.openxmlformats.org/drawingml/2006/picture">
+                  <pic:nvPicPr>
+                    <pic:cNvPr id="53668812" name="Image 53668812"/>
+                    <pic:cNvPicPr/>
+                  </pic:nvPicPr>
+                  <pic:blipFill>
+                    <a:blip r:embed="rId21">
+                      <a:extLst>
+                        <a:ext uri="{28A0092B-C50C-407E-A947-70E740481C1C}">
+                          <a14:useLocalDpi xmlns:a14="http://schemas.microsoft.com/office/drawing/2010/main" val="0"/>
+                        </a:ext>
+                      </a:extLst>
+                    </a:blip>
+                    <a:stretch>
+                      <a:fillRect/>
+                    </a:stretch>
+                  </pic:blipFill>
+                  <pic:spPr>
+                    <a:xfrm>
+                      <a:off x="0" y="0"/>
+                      <a:ext cx="1689100" cy="1193800"/>
+                    </a:xfrm>
+                    <a:prstGeom prst="rect">
+                      <a:avLst/>
+                    </a:prstGeom>
+                  </pic:spPr>
+                </pic:pic>
+              </a:graphicData>
+            </a:graphic>
+          </wp:inline>
+        </w:drawing>
+      </w:r>
+    </w:p>
+    <w:p>
+      <w:pPr>
+        <w:pStyle w:val="font-claude-response-body"/>
+        <w:jc w:val="both"/>
+      </w:pPr>
+      <w:r>
+        <w:rPr>
+          <w:rStyle w:val="lev"/>
+        </w:rPr>
+        <w:t xml:space="preserve">1.7 </w:t>
+      </w:r>
+      <w:proofErr w:type="spellStart"/>
+      <w:r>
+        <w:rPr>
+          <w:rStyle w:val="lev"/>
+        </w:rPr>
+        <w:t>Cloudinary</w:t>
+      </w:r>
+      <w:proofErr w:type="spellEnd"/>
+      <w:r>
+        <w:rPr>
+          <w:rStyle w:val="lev"/>
+        </w:rPr>
+        <w:t> :</w:t>
+      </w:r>
+    </w:p>
+    <w:p>
+      <w:pPr>
+        <w:pStyle w:val="font-claude-response-body"/>
+        <w:jc w:val="both"/>
+      </w:pPr>
+      <w:proofErr w:type="spellStart"/>
+      <w:r>
+        <w:t>Cloudinary</w:t>
+      </w:r>
+      <w:proofErr w:type="spellEnd"/>
+      <w:r>
+        <w:t xml:space="preserve"> est une plateforme cloud spécialisée dans la gestion des images et vidéos. Elle a été utilisée pour stocker les photos des annonces publiées par les propriétaires. </w:t>
+      </w:r>
+      <w:proofErr w:type="spellStart"/>
+      <w:r>
+        <w:t>Cloudinary</w:t>
+      </w:r>
+      <w:proofErr w:type="spellEnd"/>
+      <w:r>
+        <w:t xml:space="preserve"> génère automatiquement des URLs pour chaque image uploadée, ce qui permet de les afficher facilement dans l'application.</w:t>
+      </w:r>
+    </w:p>
+    <w:p>
+      <w:pPr>
+        <w:pStyle w:val="font-claude-response-body"/>
+        <w:jc w:val="both"/>
+        <w:rPr>
+          <w:rStyle w:val="Accentuation"/>
+          <w:i w:val="0"/>
+          <w:iCs w:val="0"/>
+        </w:rPr>
+      </w:pPr>
+      <w:r>
+        <w:rPr>
+          <w:noProof/>
+        </w:rPr>
+        <w:drawing>
+          <wp:inline distT="0" distB="0" distL="0" distR="0" wp14:anchorId="63973D08" wp14:editId="663A7F5C">
+            <wp:extent cx="1701800" cy="1193800"/>
+            <wp:effectExtent l="0" t="0" r="0" b="0"/>
+            <wp:docPr id="189628020" name="Image 11"/>
+            <wp:cNvGraphicFramePr>
+              <a:graphicFrameLocks xmlns:a="http://schemas.openxmlformats.org/drawingml/2006/main" noChangeAspect="1"/>
+            </wp:cNvGraphicFramePr>
+            <a:graphic xmlns:a="http://schemas.openxmlformats.org/drawingml/2006/main">
+              <a:graphicData uri="http://schemas.openxmlformats.org/drawingml/2006/picture">
+                <pic:pic xmlns:pic="http://schemas.openxmlformats.org/drawingml/2006/picture">
+                  <pic:nvPicPr>
+                    <pic:cNvPr id="189628020" name="Image 189628020"/>
+                    <pic:cNvPicPr/>
+                  </pic:nvPicPr>
+                  <pic:blipFill>
+                    <a:blip r:embed="rId22">
+                      <a:extLst>
+                        <a:ext uri="{28A0092B-C50C-407E-A947-70E740481C1C}">
+                          <a14:useLocalDpi xmlns:a14="http://schemas.microsoft.com/office/drawing/2010/main" val="0"/>
+                        </a:ext>
+                      </a:extLst>
+                    </a:blip>
+                    <a:stretch>
+                      <a:fillRect/>
+                    </a:stretch>
+                  </pic:blipFill>
+                  <pic:spPr>
+                    <a:xfrm>
+                      <a:off x="0" y="0"/>
+                      <a:ext cx="1701800" cy="1193800"/>
+                    </a:xfrm>
+                    <a:prstGeom prst="rect">
+                      <a:avLst/>
+                    </a:prstGeom>
+                  </pic:spPr>
+                </pic:pic>
+              </a:graphicData>
+            </a:graphic>
+          </wp:inline>
+        </w:drawing>
+      </w:r>
+    </w:p>
+    <w:p>
+      <w:pPr>
+        <w:pStyle w:val="font-claude-response-body"/>
+        <w:jc w:val="both"/>
+      </w:pPr>
+      <w:r>
+        <w:rPr>
+          <w:rStyle w:val="lev"/>
+        </w:rPr>
+        <w:t>1.8 Postman</w:t>
+      </w:r>
+      <w:r>
+        <w:rPr>
+          <w:rStyle w:val="lev"/>
+        </w:rPr>
+        <w:t> :</w:t>
+      </w:r>
+    </w:p>
+    <w:p>
+      <w:pPr>
+        <w:pStyle w:val="font-claude-response-body"/>
+        <w:jc w:val="both"/>
+      </w:pPr>
+      <w:r>
+        <w:t xml:space="preserve">Postman est un outil permettant de tester les API REST. Il a été utilisé tout au long du développement backend pour vérifier que chaque route Flask retourne bien les données attendues avant de les connecter au frontend </w:t>
+      </w:r>
+      <w:proofErr w:type="spellStart"/>
+      <w:r>
+        <w:t>React</w:t>
+      </w:r>
+      <w:proofErr w:type="spellEnd"/>
+      <w:r>
+        <w:t>. Cela permet de détecter et corriger les erreurs côté backend indépendamment du frontend.</w:t>
+      </w:r>
+    </w:p>
+    <w:p>
+      <w:pPr>
+        <w:pStyle w:val="font-claude-response-body"/>
+        <w:jc w:val="both"/>
+        <w:rPr>
+          <w:rStyle w:val="Accentuation"/>
+          <w:i w:val="0"/>
+          <w:iCs w:val="0"/>
+        </w:rPr>
+      </w:pPr>
+      <w:r>
+        <w:rPr>
+          <w:noProof/>
+        </w:rPr>
+        <w:drawing>
+          <wp:inline distT="0" distB="0" distL="0" distR="0" wp14:anchorId="7088F401" wp14:editId="6247FBBD">
+            <wp:extent cx="1968500" cy="1028700"/>
+            <wp:effectExtent l="0" t="0" r="0" b="0"/>
+            <wp:docPr id="1766167917" name="Image 12"/>
+            <wp:cNvGraphicFramePr>
+              <a:graphicFrameLocks xmlns:a="http://schemas.openxmlformats.org/drawingml/2006/main" noChangeAspect="1"/>
+            </wp:cNvGraphicFramePr>
+            <a:graphic xmlns:a="http://schemas.openxmlformats.org/drawingml/2006/main">
+              <a:graphicData uri="http://schemas.openxmlformats.org/drawingml/2006/picture">
+                <pic:pic xmlns:pic="http://schemas.openxmlformats.org/drawingml/2006/picture">
+                  <pic:nvPicPr>
+                    <pic:cNvPr id="1766167917" name="Image 1766167917"/>
+                    <pic:cNvPicPr/>
+                  </pic:nvPicPr>
+                  <pic:blipFill>
+                    <a:blip r:embed="rId23">
+                      <a:extLst>
+                        <a:ext uri="{28A0092B-C50C-407E-A947-70E740481C1C}">
+                          <a14:useLocalDpi xmlns:a14="http://schemas.microsoft.com/office/drawing/2010/main" val="0"/>
+                        </a:ext>
+                      </a:extLst>
+                    </a:blip>
+                    <a:stretch>
+                      <a:fillRect/>
+                    </a:stretch>
+                  </pic:blipFill>
+                  <pic:spPr>
+                    <a:xfrm>
+                      <a:off x="0" y="0"/>
+                      <a:ext cx="1968500" cy="1028700"/>
+                    </a:xfrm>
+                    <a:prstGeom prst="rect">
+                      <a:avLst/>
+                    </a:prstGeom>
+                  </pic:spPr>
+                </pic:pic>
+              </a:graphicData>
+            </a:graphic>
+          </wp:inline>
+        </w:drawing>
+      </w:r>
+    </w:p>
+    <w:p>
+      <w:pPr>
+        <w:pStyle w:val="font-claude-response-body"/>
+        <w:jc w:val="both"/>
+      </w:pPr>
+      <w:r>
+        <w:rPr>
+          <w:rStyle w:val="lev"/>
+        </w:rPr>
+        <w:t>1.9 GitHub</w:t>
+      </w:r>
+      <w:r>
+        <w:rPr>
+          <w:rStyle w:val="lev"/>
+        </w:rPr>
+        <w:t> :</w:t>
+      </w:r>
+    </w:p>
+    <w:p>
+      <w:pPr>
+        <w:pStyle w:val="font-claude-response-body"/>
+        <w:jc w:val="both"/>
+      </w:pPr>
+      <w:r>
+        <w:t>GitHub est une plateforme de gestion de code source basée sur Git. Elle a été utilisée pour héberger le code du projet, permettre la collaboration entre les trois membres de l'équipe et garder un historique de toutes les modifications apportées au code au fil du développement.</w:t>
+      </w:r>
+    </w:p>
+    <w:p>
+      <w:pPr>
+        <w:pStyle w:val="font-claude-response-body"/>
+        <w:jc w:val="both"/>
+        <w:rPr>
+          <w:rStyle w:val="Accentuation"/>
+          <w:i w:val="0"/>
+          <w:iCs w:val="0"/>
+        </w:rPr>
+      </w:pPr>
+      <w:r>
+        <w:rPr>
+          <w:noProof/>
+        </w:rPr>
+        <w:drawing>
+          <wp:inline distT="0" distB="0" distL="0" distR="0" wp14:anchorId="44487640" wp14:editId="6BDDA416">
+            <wp:extent cx="1790700" cy="1130300"/>
+            <wp:effectExtent l="0" t="0" r="0" b="0"/>
+            <wp:docPr id="43587620" name="Image 13"/>
+            <wp:cNvGraphicFramePr>
+              <a:graphicFrameLocks xmlns:a="http://schemas.openxmlformats.org/drawingml/2006/main" noChangeAspect="1"/>
+            </wp:cNvGraphicFramePr>
+            <a:graphic xmlns:a="http://schemas.openxmlformats.org/drawingml/2006/main">
+              <a:graphicData uri="http://schemas.openxmlformats.org/drawingml/2006/picture">
+                <pic:pic xmlns:pic="http://schemas.openxmlformats.org/drawingml/2006/picture">
+                  <pic:nvPicPr>
+                    <pic:cNvPr id="43587620" name="Image 43587620"/>
+                    <pic:cNvPicPr/>
+                  </pic:nvPicPr>
+                  <pic:blipFill>
+                    <a:blip r:embed="rId24">
+                      <a:extLst>
+                        <a:ext uri="{28A0092B-C50C-407E-A947-70E740481C1C}">
+                          <a14:useLocalDpi xmlns:a14="http://schemas.microsoft.com/office/drawing/2010/main" val="0"/>
+                        </a:ext>
+                      </a:extLst>
+                    </a:blip>
+                    <a:stretch>
+                      <a:fillRect/>
+                    </a:stretch>
+                  </pic:blipFill>
+                  <pic:spPr>
+                    <a:xfrm>
+                      <a:off x="0" y="0"/>
+                      <a:ext cx="1790700" cy="1130300"/>
+                    </a:xfrm>
+                    <a:prstGeom prst="rect">
+                      <a:avLst/>
+                    </a:prstGeom>
+                  </pic:spPr>
+                </pic:pic>
+              </a:graphicData>
+            </a:graphic>
+          </wp:inline>
+        </w:drawing>
+      </w:r>
+    </w:p>
+    <w:p>
+      <w:pPr>
+        <w:pStyle w:val="font-claude-response-body"/>
+        <w:jc w:val="both"/>
+      </w:pPr>
+      <w:r>
+        <w:rPr>
+          <w:rStyle w:val="lev"/>
+        </w:rPr>
+        <w:lastRenderedPageBreak/>
+        <w:t>1.10 Render</w:t>
+      </w:r>
+      <w:r>
+        <w:rPr>
+          <w:rStyle w:val="lev"/>
+        </w:rPr>
+        <w:t> :</w:t>
+      </w:r>
+    </w:p>
+    <w:p>
+      <w:pPr>
+        <w:pStyle w:val="font-claude-response-body"/>
+        <w:jc w:val="both"/>
+      </w:pPr>
+      <w:r>
+        <w:t xml:space="preserve">Render est une plateforme cloud utilisée pour le déploiement du backend Flask et du frontend </w:t>
+      </w:r>
+      <w:proofErr w:type="spellStart"/>
+      <w:r>
+        <w:t>React</w:t>
+      </w:r>
+      <w:proofErr w:type="spellEnd"/>
+      <w:r>
+        <w:t>. Elle permet de rendre l'application accessible en ligne gratuitement sans configuration complexe.</w:t>
+      </w:r>
+    </w:p>
+    <w:p>
+      <w:pPr>
+        <w:pStyle w:val="font-claude-response-body"/>
+        <w:jc w:val="both"/>
+        <w:rPr>
+          <w:rStyle w:val="Accentuation"/>
+          <w:i w:val="0"/>
+          <w:iCs w:val="0"/>
+        </w:rPr>
+      </w:pPr>
+      <w:r>
+        <w:rPr>
+          <w:noProof/>
+        </w:rPr>
+        <w:drawing>
+          <wp:inline distT="0" distB="0" distL="0" distR="0" wp14:anchorId="0BFA4B49" wp14:editId="1BD37752">
+            <wp:extent cx="1219200" cy="1003300"/>
+            <wp:effectExtent l="0" t="0" r="0" b="0"/>
+            <wp:docPr id="2066262653" name="Image 14"/>
+            <wp:cNvGraphicFramePr>
+              <a:graphicFrameLocks xmlns:a="http://schemas.openxmlformats.org/drawingml/2006/main" noChangeAspect="1"/>
+            </wp:cNvGraphicFramePr>
+            <a:graphic xmlns:a="http://schemas.openxmlformats.org/drawingml/2006/main">
+              <a:graphicData uri="http://schemas.openxmlformats.org/drawingml/2006/picture">
+                <pic:pic xmlns:pic="http://schemas.openxmlformats.org/drawingml/2006/picture">
+                  <pic:nvPicPr>
+                    <pic:cNvPr id="2066262653" name="Image 2066262653"/>
+                    <pic:cNvPicPr/>
+                  </pic:nvPicPr>
+                  <pic:blipFill>
+                    <a:blip r:embed="rId25">
+                      <a:extLst>
+                        <a:ext uri="{28A0092B-C50C-407E-A947-70E740481C1C}">
+                          <a14:useLocalDpi xmlns:a14="http://schemas.microsoft.com/office/drawing/2010/main" val="0"/>
+                        </a:ext>
+                      </a:extLst>
+                    </a:blip>
+                    <a:stretch>
+                      <a:fillRect/>
+                    </a:stretch>
+                  </pic:blipFill>
+                  <pic:spPr>
+                    <a:xfrm>
+                      <a:off x="0" y="0"/>
+                      <a:ext cx="1219200" cy="1003300"/>
+                    </a:xfrm>
+                    <a:prstGeom prst="rect">
+                      <a:avLst/>
+                    </a:prstGeom>
+                  </pic:spPr>
+                </pic:pic>
+              </a:graphicData>
+            </a:graphic>
+          </wp:inline>
+        </w:drawing>
+      </w:r>
+    </w:p>
+    <w:p>
+      <w:pPr>
+        <w:pStyle w:val="font-claude-response-body"/>
+        <w:jc w:val="both"/>
+      </w:pPr>
+      <w:r>
+        <w:rPr>
+          <w:rStyle w:val="lev"/>
+        </w:rPr>
+        <w:t>1.11 Railway</w:t>
+      </w:r>
+      <w:r>
+        <w:rPr>
+          <w:rStyle w:val="lev"/>
+        </w:rPr>
+        <w:t> :</w:t>
+      </w:r>
+    </w:p>
+    <w:p>
+      <w:pPr>
+        <w:pStyle w:val="font-claude-response-body"/>
+        <w:jc w:val="both"/>
+      </w:pPr>
+      <w:r>
+        <w:t>Railway est une plateforme cloud utilisée pour héberger la base de données MySQL en ligne. Elle permet d'accéder à la base de données depuis n'importe où, ce qui facilite la collaboration entre les membres de l'équipe.</w:t>
+      </w:r>
+    </w:p>
+    <w:p>
+      <w:pPr>
+        <w:jc w:val="both"/>
         <w:rPr>
           <w:rFonts w:ascii="Times New Roman" w:hAnsi="Times New Roman" w:cs="Times New Roman"/>
           <w:b/>
@@ -7276,20 +8601,63 @@
           <w:sz w:val="24"/>
           <w:szCs w:val="24"/>
         </w:rPr>
-        <w:t xml:space="preserve"> : </w:t>
-      </w:r>
+      </w:pPr>
       <w:r>
         <w:rPr>
           <w:rFonts w:ascii="Times New Roman" w:hAnsi="Times New Roman" w:cs="Times New Roman"/>
           <w:b/>
           <w:bCs/>
-          <w:color w:val="000000" w:themeColor="text1"/>
-          <w:sz w:val="24"/>
-          <w:szCs w:val="24"/>
-        </w:rPr>
-        <w:t>R</w:t>
-      </w:r>
-      <w:r>
+          <w:noProof/>
+          <w:color w:val="000000" w:themeColor="text1"/>
+          <w:sz w:val="24"/>
+          <w:szCs w:val="24"/>
+        </w:rPr>
+        <w:drawing>
+          <wp:inline distT="0" distB="0" distL="0" distR="0" wp14:anchorId="3EFB8947" wp14:editId="5006F9B1">
+            <wp:extent cx="1968500" cy="1028700"/>
+            <wp:effectExtent l="0" t="0" r="0" b="0"/>
+            <wp:docPr id="681672316" name="Image 15"/>
+            <wp:cNvGraphicFramePr>
+              <a:graphicFrameLocks xmlns:a="http://schemas.openxmlformats.org/drawingml/2006/main" noChangeAspect="1"/>
+            </wp:cNvGraphicFramePr>
+            <a:graphic xmlns:a="http://schemas.openxmlformats.org/drawingml/2006/main">
+              <a:graphicData uri="http://schemas.openxmlformats.org/drawingml/2006/picture">
+                <pic:pic xmlns:pic="http://schemas.openxmlformats.org/drawingml/2006/picture">
+                  <pic:nvPicPr>
+                    <pic:cNvPr id="681672316" name="Image 681672316"/>
+                    <pic:cNvPicPr/>
+                  </pic:nvPicPr>
+                  <pic:blipFill>
+                    <a:blip r:embed="rId26">
+                      <a:extLst>
+                        <a:ext uri="{28A0092B-C50C-407E-A947-70E740481C1C}">
+                          <a14:useLocalDpi xmlns:a14="http://schemas.microsoft.com/office/drawing/2010/main" val="0"/>
+                        </a:ext>
+                      </a:extLst>
+                    </a:blip>
+                    <a:stretch>
+                      <a:fillRect/>
+                    </a:stretch>
+                  </pic:blipFill>
+                  <pic:spPr>
+                    <a:xfrm>
+                      <a:off x="0" y="0"/>
+                      <a:ext cx="1968500" cy="1028700"/>
+                    </a:xfrm>
+                    <a:prstGeom prst="rect">
+                      <a:avLst/>
+                    </a:prstGeom>
+                  </pic:spPr>
+                </pic:pic>
+              </a:graphicData>
+            </a:graphic>
+          </wp:inline>
+        </w:drawing>
+      </w:r>
+    </w:p>
+    <w:p>
+      <w:pPr>
+        <w:jc w:val="both"/>
         <w:rPr>
           <w:rFonts w:ascii="Times New Roman" w:hAnsi="Times New Roman" w:cs="Times New Roman"/>
           <w:b/>
@@ -7298,8 +8666,7 @@
           <w:sz w:val="24"/>
           <w:szCs w:val="24"/>
         </w:rPr>
-        <w:t>ésultats</w:t>
-      </w:r>
+      </w:pPr>
     </w:p>
     <w:p>
       <w:pPr>
@@ -7313,15 +8680,7 @@
           <w:szCs w:val="24"/>
         </w:rPr>
       </w:pPr>
-    </w:p>
-    <w:p>
-      <w:pPr>
-        <w:pStyle w:val="Titre5"/>
-        <w:numPr>
-          <w:ilvl w:val="0"/>
-          <w:numId w:val="4"/>
-        </w:numPr>
-        <w:jc w:val="both"/>
+      <w:r>
         <w:rPr>
           <w:rFonts w:ascii="Times New Roman" w:hAnsi="Times New Roman" w:cs="Times New Roman"/>
           <w:b/>
@@ -7330,7 +8689,8 @@
           <w:sz w:val="24"/>
           <w:szCs w:val="24"/>
         </w:rPr>
-      </w:pPr>
+        <w:t>II. Résultats obtenus</w:t>
+      </w:r>
       <w:r>
         <w:rPr>
           <w:rFonts w:ascii="Times New Roman" w:hAnsi="Times New Roman" w:cs="Times New Roman"/>
@@ -7340,502 +8700,12 @@
           <w:sz w:val="24"/>
           <w:szCs w:val="24"/>
         </w:rPr>
-        <w:t>Les besoins fonctionnels</w:t>
-      </w:r>
-      <w:r>
-        <w:rPr>
-          <w:rFonts w:ascii="Times New Roman" w:hAnsi="Times New Roman" w:cs="Times New Roman"/>
-          <w:color w:val="000000" w:themeColor="text1"/>
-          <w:sz w:val="24"/>
-          <w:szCs w:val="24"/>
-        </w:rPr>
-        <w:t> </w:t>
-      </w:r>
-      <w:r>
-        <w:rPr>
-          <w:rFonts w:ascii="Times New Roman" w:hAnsi="Times New Roman" w:cs="Times New Roman"/>
-          <w:b/>
-          <w:bCs/>
-          <w:color w:val="000000" w:themeColor="text1"/>
-          <w:sz w:val="24"/>
-          <w:szCs w:val="24"/>
-        </w:rPr>
-        <w:t>:</w:t>
-      </w:r>
-    </w:p>
-    <w:p>
-      <w:pPr>
-        <w:pStyle w:val="font-claude-response-body"/>
-        <w:jc w:val="both"/>
-        <w:rPr>
-          <w:color w:val="000000" w:themeColor="text1"/>
-        </w:rPr>
-      </w:pPr>
-      <w:r>
-        <w:rPr>
-          <w:color w:val="000000" w:themeColor="text1"/>
-        </w:rPr>
-        <w:t>Le diagramme de cas d'utilisation présente les interactions entre les différents acteurs du système et les fonctionnalités offertes par la plateforme HomeLink. Quatre acteurs ont été identifiés : le Visiteur, le Locataire, le Propriétaire et l'Administrateur. Le Locataire et le Propriétaire héritent tous deux du Visiteur, ce qui signifie qu'ils disposent des mêmes fonctionnalités de base, en plus de celles qui leur sont propres.</w:t>
-      </w:r>
-    </w:p>
-    <w:p>
-      <w:pPr>
-        <w:pStyle w:val="font-claude-response-body"/>
-        <w:jc w:val="both"/>
-        <w:rPr>
-          <w:color w:val="000000" w:themeColor="text1"/>
-        </w:rPr>
-      </w:pPr>
-      <w:r>
-        <w:rPr>
-          <w:color w:val="000000" w:themeColor="text1"/>
-        </w:rPr>
-        <w:t>Parmi les fonctionnalités modélisées, on retrouve notamment : s'inscrire, se connecter, rechercher un logement, consulter une annonce, publier une annonce, contacter un propriétaire, déposer un avis, ainsi que des fonctionnalités d'administration comme valider ou rejeter une annonce, modérer les avis et gérer les comptes utilisateurs.</w:t>
-      </w:r>
-    </w:p>
-    <w:p>
-      <w:pPr>
-        <w:pStyle w:val="Titre5"/>
-        <w:numPr>
-          <w:ilvl w:val="0"/>
-          <w:numId w:val="4"/>
-        </w:numPr>
-        <w:jc w:val="both"/>
-        <w:rPr>
-          <w:rFonts w:ascii="Times New Roman" w:hAnsi="Times New Roman" w:cs="Times New Roman"/>
-          <w:b/>
-          <w:bCs/>
-          <w:color w:val="000000" w:themeColor="text1"/>
-          <w:sz w:val="24"/>
-          <w:szCs w:val="24"/>
-        </w:rPr>
-      </w:pPr>
-      <w:r>
-        <w:rPr>
-          <w:rFonts w:ascii="Times New Roman" w:hAnsi="Times New Roman" w:cs="Times New Roman"/>
-          <w:b/>
-          <w:bCs/>
-          <w:color w:val="000000" w:themeColor="text1"/>
-          <w:sz w:val="24"/>
-          <w:szCs w:val="24"/>
-        </w:rPr>
-        <w:t>Fonctionnalité</w:t>
-      </w:r>
-      <w:r>
-        <w:rPr>
-          <w:rFonts w:ascii="Times New Roman" w:hAnsi="Times New Roman" w:cs="Times New Roman"/>
-          <w:b/>
-          <w:bCs/>
-          <w:color w:val="000000" w:themeColor="text1"/>
-          <w:sz w:val="24"/>
-          <w:szCs w:val="24"/>
-        </w:rPr>
-        <w:t xml:space="preserve">s </w:t>
-      </w:r>
-      <w:r>
-        <w:rPr>
-          <w:rFonts w:ascii="Times New Roman" w:hAnsi="Times New Roman" w:cs="Times New Roman"/>
-          <w:b/>
-          <w:bCs/>
-          <w:color w:val="000000" w:themeColor="text1"/>
-          <w:sz w:val="24"/>
-          <w:szCs w:val="24"/>
-        </w:rPr>
-        <w:t>:</w:t>
-      </w:r>
-    </w:p>
-    <w:p>
-      <w:pPr>
-        <w:pStyle w:val="font-claude-response-body"/>
-        <w:jc w:val="both"/>
-        <w:rPr>
-          <w:color w:val="000000" w:themeColor="text1"/>
-        </w:rPr>
-      </w:pPr>
-      <w:r>
-        <w:rPr>
-          <w:color w:val="000000" w:themeColor="text1"/>
-        </w:rPr>
-        <w:t>Deux diagrammes de séquence ont été réalisés afin de modéliser le comportement dynamique du système pour les scénarios les plus importants.</w:t>
-      </w:r>
-    </w:p>
-    <w:p>
-      <w:pPr>
-        <w:pStyle w:val="font-claude-response-body"/>
-        <w:jc w:val="both"/>
-        <w:rPr>
-          <w:color w:val="000000" w:themeColor="text1"/>
-        </w:rPr>
-      </w:pPr>
-      <w:r>
-        <w:rPr>
-          <w:rStyle w:val="lev"/>
-          <w:color w:val="000000" w:themeColor="text1"/>
-        </w:rPr>
-        <w:t xml:space="preserve">Scénario 1 — Rechercher un logement </w:t>
-      </w:r>
-      <w:r>
-        <w:rPr>
-          <w:rStyle w:val="lev"/>
-          <w:color w:val="000000" w:themeColor="text1"/>
-        </w:rPr>
-        <w:t xml:space="preserve">( </w:t>
-      </w:r>
-      <w:r>
-        <w:rPr>
-          <w:color w:val="000000" w:themeColor="text1"/>
-        </w:rPr>
-        <w:t>Fonctionnalité du Locataire</w:t>
-      </w:r>
-      <w:r>
-        <w:rPr>
-          <w:rStyle w:val="lev"/>
-          <w:color w:val="000000" w:themeColor="text1"/>
-        </w:rPr>
-        <w:t xml:space="preserve"> )</w:t>
-      </w:r>
-      <w:r>
-        <w:rPr>
-          <w:rStyle w:val="lev"/>
-          <w:color w:val="000000" w:themeColor="text1"/>
-        </w:rPr>
-        <w:t>:</w:t>
-      </w:r>
-      <w:r>
-        <w:rPr>
-          <w:color w:val="000000" w:themeColor="text1"/>
-        </w:rPr>
-        <w:t xml:space="preserve"> Ce diagramme décrit les interactions entre l'utilisateur et le système lors d'une recherche de logement. L'utilisateur saisit ses critères (quartier, type de logement, budget, disponibilité) et lance la recherche. Le système interroge la base de données et affiche les résultats triés par pertinence. En cas d'absence de résultats, le système propose d'élargir les filtres.</w:t>
-      </w:r>
-    </w:p>
-    <w:p>
-      <w:pPr>
-        <w:pStyle w:val="font-claude-response-body"/>
-        <w:jc w:val="both"/>
-        <w:rPr>
-          <w:color w:val="000000" w:themeColor="text1"/>
-        </w:rPr>
-      </w:pPr>
-      <w:r>
-        <w:rPr>
-          <w:rStyle w:val="lev"/>
-          <w:color w:val="000000" w:themeColor="text1"/>
-        </w:rPr>
-        <w:t>Scénario 2 — Publier une annonce</w:t>
-      </w:r>
-      <w:r>
-        <w:rPr>
-          <w:rStyle w:val="lev"/>
-          <w:color w:val="000000" w:themeColor="text1"/>
-        </w:rPr>
-        <w:t xml:space="preserve"> ( </w:t>
-      </w:r>
-      <w:r>
-        <w:rPr>
-          <w:color w:val="000000" w:themeColor="text1"/>
-        </w:rPr>
-        <w:t xml:space="preserve">Fonctionnalité du </w:t>
-      </w:r>
-      <w:r>
-        <w:rPr>
-          <w:color w:val="000000" w:themeColor="text1"/>
-        </w:rPr>
-        <w:t>Proprietaire</w:t>
-      </w:r>
-      <w:r>
-        <w:rPr>
-          <w:rStyle w:val="lev"/>
-          <w:color w:val="000000" w:themeColor="text1"/>
-        </w:rPr>
-        <w:t>)</w:t>
-      </w:r>
-      <w:r>
-        <w:rPr>
-          <w:rStyle w:val="lev"/>
-          <w:color w:val="000000" w:themeColor="text1"/>
-        </w:rPr>
-        <w:t xml:space="preserve"> :</w:t>
-      </w:r>
-      <w:r>
-        <w:rPr>
-          <w:color w:val="000000" w:themeColor="text1"/>
-        </w:rPr>
-        <w:t xml:space="preserve"> Ce diagramme illustre le processus de publication d'une annonce par un propriétaire. Après avoir saisi les informations du logement et téléchargé les photos, le propriétaire soumet le formulaire. Le système valide les données et enregistre l'annonce avec le statut </w:t>
-      </w:r>
-      <w:r>
-        <w:rPr>
-          <w:rStyle w:val="CodeHTML"/>
-          <w:rFonts w:ascii="Times New Roman" w:hAnsi="Times New Roman" w:cs="Times New Roman"/>
-          <w:color w:val="000000" w:themeColor="text1"/>
-          <w:sz w:val="24"/>
-          <w:szCs w:val="24"/>
-        </w:rPr>
-        <w:t>EN_ATTENTE</w:t>
-      </w:r>
-      <w:r>
-        <w:rPr>
-          <w:color w:val="000000" w:themeColor="text1"/>
-        </w:rPr>
-        <w:t>, dans l'attente d'une validation par l'administrateur.</w:t>
-      </w:r>
-    </w:p>
-    <w:p>
-      <w:pPr>
-        <w:pStyle w:val="Titre5"/>
-        <w:numPr>
-          <w:ilvl w:val="0"/>
-          <w:numId w:val="4"/>
-        </w:numPr>
-        <w:jc w:val="both"/>
-        <w:rPr>
-          <w:rFonts w:ascii="Times New Roman" w:hAnsi="Times New Roman" w:cs="Times New Roman"/>
-          <w:b/>
-          <w:bCs/>
-          <w:color w:val="000000" w:themeColor="text1"/>
-          <w:sz w:val="24"/>
-          <w:szCs w:val="24"/>
-        </w:rPr>
-      </w:pPr>
-      <w:r>
-        <w:rPr>
-          <w:rFonts w:ascii="Times New Roman" w:hAnsi="Times New Roman" w:cs="Times New Roman"/>
-          <w:b/>
-          <w:bCs/>
-          <w:color w:val="000000" w:themeColor="text1"/>
-          <w:sz w:val="24"/>
-          <w:szCs w:val="24"/>
-        </w:rPr>
-        <w:t>Modèle du domaine métier</w:t>
-      </w:r>
-      <w:r>
-        <w:rPr>
-          <w:rFonts w:ascii="Times New Roman" w:hAnsi="Times New Roman" w:cs="Times New Roman"/>
-          <w:b/>
-          <w:bCs/>
-          <w:color w:val="000000" w:themeColor="text1"/>
-          <w:sz w:val="24"/>
-          <w:szCs w:val="24"/>
-        </w:rPr>
-        <w:t xml:space="preserve"> </w:t>
-      </w:r>
-      <w:r>
-        <w:rPr>
-          <w:rFonts w:ascii="Times New Roman" w:hAnsi="Times New Roman" w:cs="Times New Roman"/>
-          <w:b/>
-          <w:bCs/>
-          <w:color w:val="000000" w:themeColor="text1"/>
-          <w:sz w:val="24"/>
-          <w:szCs w:val="24"/>
-        </w:rPr>
-        <w:t>:</w:t>
-      </w:r>
-    </w:p>
-    <w:p>
-      <w:pPr>
-        <w:pStyle w:val="font-claude-response-body"/>
-        <w:jc w:val="both"/>
-        <w:rPr>
-          <w:color w:val="000000" w:themeColor="text1"/>
-        </w:rPr>
-      </w:pPr>
-      <w:r>
-        <w:rPr>
-          <w:color w:val="000000" w:themeColor="text1"/>
-        </w:rPr>
-        <w:t xml:space="preserve">Le diagramme de classes représente la structure statique du système. Il met en évidence les entités principales et leurs relations. La classe abstraite </w:t>
-      </w:r>
-      <w:r>
-        <w:rPr>
-          <w:rStyle w:val="CodeHTML"/>
-          <w:rFonts w:ascii="Times New Roman" w:hAnsi="Times New Roman" w:cs="Times New Roman"/>
-          <w:color w:val="000000" w:themeColor="text1"/>
-          <w:sz w:val="24"/>
-          <w:szCs w:val="24"/>
-        </w:rPr>
-        <w:t>Utilisateur</w:t>
-      </w:r>
-      <w:r>
-        <w:rPr>
-          <w:color w:val="000000" w:themeColor="text1"/>
-        </w:rPr>
-        <w:t xml:space="preserve"> est la classe mère dont héritent </w:t>
-      </w:r>
-      <w:r>
-        <w:rPr>
-          <w:rStyle w:val="CodeHTML"/>
-          <w:rFonts w:ascii="Times New Roman" w:hAnsi="Times New Roman" w:cs="Times New Roman"/>
-          <w:color w:val="000000" w:themeColor="text1"/>
-          <w:sz w:val="24"/>
-          <w:szCs w:val="24"/>
-        </w:rPr>
-        <w:t>Proprietaire</w:t>
-      </w:r>
-      <w:r>
-        <w:rPr>
-          <w:color w:val="000000" w:themeColor="text1"/>
-        </w:rPr>
-        <w:t xml:space="preserve">, </w:t>
-      </w:r>
-      <w:r>
-        <w:rPr>
-          <w:rStyle w:val="CodeHTML"/>
-          <w:rFonts w:ascii="Times New Roman" w:hAnsi="Times New Roman" w:cs="Times New Roman"/>
-          <w:color w:val="000000" w:themeColor="text1"/>
-          <w:sz w:val="24"/>
-          <w:szCs w:val="24"/>
-        </w:rPr>
-        <w:t>Locataire</w:t>
-      </w:r>
-      <w:r>
-        <w:rPr>
-          <w:color w:val="000000" w:themeColor="text1"/>
-        </w:rPr>
-        <w:t xml:space="preserve"> et </w:t>
-      </w:r>
-      <w:r>
-        <w:rPr>
-          <w:rStyle w:val="CodeHTML"/>
-          <w:rFonts w:ascii="Times New Roman" w:hAnsi="Times New Roman" w:cs="Times New Roman"/>
-          <w:color w:val="000000" w:themeColor="text1"/>
-          <w:sz w:val="24"/>
-          <w:szCs w:val="24"/>
-        </w:rPr>
-        <w:t>Administrateur</w:t>
-      </w:r>
-      <w:r>
-        <w:rPr>
-          <w:color w:val="000000" w:themeColor="text1"/>
-        </w:rPr>
-        <w:t xml:space="preserve">. Les autres classes identifiées sont : </w:t>
-      </w:r>
-      <w:r>
-        <w:rPr>
-          <w:rStyle w:val="CodeHTML"/>
-          <w:rFonts w:ascii="Times New Roman" w:hAnsi="Times New Roman" w:cs="Times New Roman"/>
-          <w:color w:val="000000" w:themeColor="text1"/>
-          <w:sz w:val="24"/>
-          <w:szCs w:val="24"/>
-        </w:rPr>
-        <w:t>BienImmobilier</w:t>
-      </w:r>
-      <w:r>
-        <w:rPr>
-          <w:color w:val="000000" w:themeColor="text1"/>
-        </w:rPr>
-        <w:t xml:space="preserve">, </w:t>
-      </w:r>
-      <w:r>
-        <w:rPr>
-          <w:rStyle w:val="CodeHTML"/>
-          <w:rFonts w:ascii="Times New Roman" w:hAnsi="Times New Roman" w:cs="Times New Roman"/>
-          <w:color w:val="000000" w:themeColor="text1"/>
-          <w:sz w:val="24"/>
-          <w:szCs w:val="24"/>
-        </w:rPr>
-        <w:t>Quartier</w:t>
-      </w:r>
-      <w:r>
-        <w:rPr>
-          <w:color w:val="000000" w:themeColor="text1"/>
-        </w:rPr>
-        <w:t xml:space="preserve">, </w:t>
-      </w:r>
-      <w:r>
-        <w:rPr>
-          <w:rStyle w:val="CodeHTML"/>
-          <w:rFonts w:ascii="Times New Roman" w:hAnsi="Times New Roman" w:cs="Times New Roman"/>
-          <w:color w:val="000000" w:themeColor="text1"/>
-          <w:sz w:val="24"/>
-          <w:szCs w:val="24"/>
-        </w:rPr>
-        <w:t>Annonce</w:t>
-      </w:r>
-      <w:r>
-        <w:rPr>
-          <w:color w:val="000000" w:themeColor="text1"/>
-        </w:rPr>
-        <w:t xml:space="preserve">, </w:t>
-      </w:r>
-      <w:r>
-        <w:rPr>
-          <w:rStyle w:val="CodeHTML"/>
-          <w:rFonts w:ascii="Times New Roman" w:hAnsi="Times New Roman" w:cs="Times New Roman"/>
-          <w:color w:val="000000" w:themeColor="text1"/>
-          <w:sz w:val="24"/>
-          <w:szCs w:val="24"/>
-        </w:rPr>
-        <w:t>Photo</w:t>
-      </w:r>
-      <w:r>
-        <w:rPr>
-          <w:color w:val="000000" w:themeColor="text1"/>
-        </w:rPr>
-        <w:t xml:space="preserve">, </w:t>
-      </w:r>
-      <w:r>
-        <w:rPr>
-          <w:rStyle w:val="CodeHTML"/>
-          <w:rFonts w:ascii="Times New Roman" w:hAnsi="Times New Roman" w:cs="Times New Roman"/>
-          <w:color w:val="000000" w:themeColor="text1"/>
-          <w:sz w:val="24"/>
-          <w:szCs w:val="24"/>
-        </w:rPr>
-        <w:t>Message</w:t>
-      </w:r>
-      <w:r>
-        <w:rPr>
-          <w:color w:val="000000" w:themeColor="text1"/>
-        </w:rPr>
-        <w:t xml:space="preserve"> et </w:t>
-      </w:r>
-      <w:r>
-        <w:rPr>
-          <w:rStyle w:val="CodeHTML"/>
-          <w:rFonts w:ascii="Times New Roman" w:hAnsi="Times New Roman" w:cs="Times New Roman"/>
-          <w:color w:val="000000" w:themeColor="text1"/>
-          <w:sz w:val="24"/>
-          <w:szCs w:val="24"/>
-        </w:rPr>
-        <w:t>Avis</w:t>
-      </w:r>
-      <w:r>
-        <w:rPr>
-          <w:color w:val="000000" w:themeColor="text1"/>
-        </w:rPr>
-        <w:t>.</w:t>
-      </w:r>
-    </w:p>
-    <w:p>
-      <w:pPr>
-        <w:pStyle w:val="font-claude-response-body"/>
-        <w:jc w:val="both"/>
-        <w:rPr>
-          <w:color w:val="000000" w:themeColor="text1"/>
-        </w:rPr>
-      </w:pPr>
-      <w:r>
-        <w:rPr>
-          <w:color w:val="000000" w:themeColor="text1"/>
-        </w:rPr>
-        <w:t>Les relations entre ces classes traduisent les règles métier du système : un propriétaire possède un ou plusieurs biens immobiliers, un bien se situe dans un quartier, une annonce concerne un bien et contient des photos, un locataire peut rédiger des avis sur un bien, et les utilisateurs peuvent s'échanger des messages.</w:t>
-      </w:r>
-    </w:p>
-    <w:p>
-      <w:pPr>
-        <w:jc w:val="both"/>
-        <w:rPr>
-          <w:rFonts w:ascii="Times New Roman" w:hAnsi="Times New Roman" w:cs="Times New Roman"/>
-          <w:b/>
-          <w:bCs/>
-          <w:color w:val="000000" w:themeColor="text1"/>
-          <w:sz w:val="24"/>
-          <w:szCs w:val="24"/>
-        </w:rPr>
-      </w:pPr>
+        <w:t> :</w:t>
+      </w:r>
     </w:p>
     <w:sectPr>
-      <w:headerReference w:type="default" r:id="rId12"/>
-      <w:footerReference w:type="default" r:id="rId13"/>
+      <w:headerReference w:type="default" r:id="rId27"/>
+      <w:footerReference w:type="default" r:id="rId28"/>
       <w:pgSz w:w="11906" w:h="16838"/>
       <w:pgMar w:top="1440" w:right="1440" w:bottom="1440" w:left="1440" w:header="708" w:footer="708" w:gutter="0"/>
       <w:cols w:space="720"/>
@@ -7846,7 +8716,7 @@
 </file>
 
 <file path=word/endnotes.xml><?xml version="1.0" encoding="utf-8"?>
-<w:endnotes xmlns:wpc="http://schemas.microsoft.com/office/word/2010/wordprocessingCanvas" xmlns:cx="http://schemas.microsoft.com/office/drawing/2014/chartex" xmlns:cx1="http://schemas.microsoft.com/office/drawing/2015/9/8/chartex" xmlns:cx2="http://schemas.microsoft.com/office/drawing/2015/10/21/chartex" xmlns:cx3="http://schemas.microsoft.com/office/drawing/2016/5/9/chartex" xmlns:cx4="http://schemas.microsoft.com/office/drawing/2016/5/10/chartex" xmlns:cx5="http://schemas.microsoft.com/office/drawing/2016/5/11/chartex" xmlns:cx6="http://schemas.microsoft.com/office/drawing/2016/5/12/chartex" xmlns:cx7="http://schemas.microsoft.com/office/drawing/2016/5/13/chartex" xmlns:cx8="http://schemas.microsoft.com/office/drawing/2016/5/14/chartex" xmlns:mc="http://schemas.openxmlformats.org/markup-compatibility/2006" xmlns:aink="http://schemas.microsoft.com/office/drawing/2016/ink" xmlns:am3d="http://schemas.microsoft.com/office/drawing/2017/model3d" xmlns:o="urn:schemas-microsoft-com:office:office" xmlns:oel="http://schemas.microsoft.com/office/2019/extlst" xmlns:r="http://schemas.openxmlformats.org/officeDocument/2006/relationships" xmlns:m="http://schemas.openxmlformats.org/officeDocument/2006/math" xmlns:v="urn:schemas-microsoft-com:vml" xmlns:wp14="http://schemas.microsoft.com/office/word/2010/wordprocessingDrawing" xmlns:wp="http://schemas.openxmlformats.org/drawingml/2006/wordprocessingDrawing" xmlns:w10="urn:schemas-microsoft-com:office:word" xmlns:w="http://schemas.openxmlformats.org/wordprocessingml/2006/main" xmlns:w14="http://schemas.microsoft.com/office/word/2010/wordml" xmlns:w15="http://schemas.microsoft.com/office/word/2012/wordml" xmlns:w16cex="http://schemas.microsoft.com/office/word/2018/wordml/cex" xmlns:w16cid="http://schemas.microsoft.com/office/word/2016/wordml/cid" xmlns:w16="http://schemas.microsoft.com/office/word/2018/wordml" xmlns:w16du="http://schemas.microsoft.com/office/word/2023/wordml/word16du" xmlns:w16sdtdh="http://schemas.microsoft.com/office/word/2020/wordml/sdtdatahash" xmlns:w16sdtfl="http://schemas.microsoft.com/office/word/2024/wordml/sdtformatlock" xmlns:w16se="http://schemas.microsoft.com/office/word/2015/wordml/symex" xmlns:wpg="http://schemas.microsoft.com/office/word/2010/wordprocessingGroup" xmlns:wpi="http://schemas.microsoft.com/office/word/2010/wordprocessingInk" xmlns:wne="http://schemas.microsoft.com/office/word/2006/wordml" xmlns:wps="http://schemas.microsoft.com/office/word/2010/wordprocessingShape" mc:Ignorable="w14 w15 w16se w16cid w16 w16cex w16sdtdh w16sdtfl w16du wp14">
+<w:endnotes xmlns:wpc="http://schemas.microsoft.com/office/word/2010/wordprocessingCanvas" xmlns:cx="http://schemas.microsoft.com/office/drawing/2014/chartex" xmlns:cx1="http://schemas.microsoft.com/office/drawing/2015/9/8/chartex" xmlns:cx2="http://schemas.microsoft.com/office/drawing/2015/10/21/chartex" xmlns:cx3="http://schemas.microsoft.com/office/drawing/2016/5/9/chartex" xmlns:cx4="http://schemas.microsoft.com/office/drawing/2016/5/10/chartex" xmlns:cx5="http://schemas.microsoft.com/office/drawing/2016/5/11/chartex" xmlns:cx6="http://schemas.microsoft.com/office/drawing/2016/5/12/chartex" xmlns:cx7="http://schemas.microsoft.com/office/drawing/2016/5/13/chartex" xmlns:cx8="http://schemas.microsoft.com/office/drawing/2016/5/14/chartex" xmlns:mc="http://schemas.openxmlformats.org/markup-compatibility/2006" xmlns:m="http://schemas.openxmlformats.org/officeDocument/2006/math" xmlns:aink="http://schemas.microsoft.com/office/drawing/2016/ink" xmlns:am3d="http://schemas.microsoft.com/office/drawing/2017/model3d" xmlns:oel="http://schemas.microsoft.com/office/2019/extlst" xmlns:r="http://schemas.openxmlformats.org/officeDocument/2006/relationships" xmlns:wp14="http://schemas.microsoft.com/office/word/2010/wordprocessingDrawing" xmlns:wp="http://schemas.openxmlformats.org/drawingml/2006/wordprocessingDrawing" xmlns:wpg="http://schemas.microsoft.com/office/word/2010/wordprocessingGroup" xmlns:wpi="http://schemas.microsoft.com/office/word/2010/wordprocessingInk" xmlns:wps="http://schemas.microsoft.com/office/word/2010/wordprocessingShape" xmlns:o="urn:schemas-microsoft-com:office:office" xmlns:v="urn:schemas-microsoft-com:vml" xmlns:w10="urn:schemas-microsoft-com:office:word" xmlns:w="http://schemas.openxmlformats.org/wordprocessingml/2006/main" xmlns:w14="http://schemas.microsoft.com/office/word/2010/wordml" xmlns:w15="http://schemas.microsoft.com/office/word/2012/wordml" xmlns:w16cex="http://schemas.microsoft.com/office/word/2018/wordml/cex" xmlns:w16cid="http://schemas.microsoft.com/office/word/2016/wordml/cid" xmlns:w16="http://schemas.microsoft.com/office/word/2018/wordml" xmlns:w16sdtdh="http://schemas.microsoft.com/office/word/2020/wordml/sdtdatahash" xmlns:w16sdtfl="http://schemas.microsoft.com/office/word/2024/wordml/sdtformatlock" xmlns:w16se="http://schemas.microsoft.com/office/word/2015/wordml/symex" xmlns:w16du="http://schemas.microsoft.com/office/word/2023/wordml/word16du" xmlns:wne="http://schemas.microsoft.com/office/word/2006/wordml" mc:Ignorable="w14 w15 w16se w16cid w16 w16cex w16sdtdh w16sdtfl w16du wp14">
   <w:endnote w:type="separator" w:id="-1">
     <w:p>
       <w:r>
@@ -7865,7 +8735,7 @@
 </file>
 
 <file path=word/footer1.xml><?xml version="1.0" encoding="utf-8"?>
-<w:ftr xmlns:wpc="http://schemas.microsoft.com/office/word/2010/wordprocessingCanvas" xmlns:cx="http://schemas.microsoft.com/office/drawing/2014/chartex" xmlns:cx1="http://schemas.microsoft.com/office/drawing/2015/9/8/chartex" xmlns:cx2="http://schemas.microsoft.com/office/drawing/2015/10/21/chartex" xmlns:cx3="http://schemas.microsoft.com/office/drawing/2016/5/9/chartex" xmlns:cx4="http://schemas.microsoft.com/office/drawing/2016/5/10/chartex" xmlns:cx5="http://schemas.microsoft.com/office/drawing/2016/5/11/chartex" xmlns:cx6="http://schemas.microsoft.com/office/drawing/2016/5/12/chartex" xmlns:cx7="http://schemas.microsoft.com/office/drawing/2016/5/13/chartex" xmlns:cx8="http://schemas.microsoft.com/office/drawing/2016/5/14/chartex" xmlns:mc="http://schemas.openxmlformats.org/markup-compatibility/2006" xmlns:aink="http://schemas.microsoft.com/office/drawing/2016/ink" xmlns:am3d="http://schemas.microsoft.com/office/drawing/2017/model3d" xmlns:o="urn:schemas-microsoft-com:office:office" xmlns:oel="http://schemas.microsoft.com/office/2019/extlst" xmlns:r="http://schemas.openxmlformats.org/officeDocument/2006/relationships" xmlns:m="http://schemas.openxmlformats.org/officeDocument/2006/math" xmlns:v="urn:schemas-microsoft-com:vml" xmlns:wp14="http://schemas.microsoft.com/office/word/2010/wordprocessingDrawing" xmlns:wp="http://schemas.openxmlformats.org/drawingml/2006/wordprocessingDrawing" xmlns:w10="urn:schemas-microsoft-com:office:word" xmlns:w="http://schemas.openxmlformats.org/wordprocessingml/2006/main" xmlns:w14="http://schemas.microsoft.com/office/word/2010/wordml" xmlns:w15="http://schemas.microsoft.com/office/word/2012/wordml" xmlns:w16cex="http://schemas.microsoft.com/office/word/2018/wordml/cex" xmlns:w16cid="http://schemas.microsoft.com/office/word/2016/wordml/cid" xmlns:w16="http://schemas.microsoft.com/office/word/2018/wordml" xmlns:w16du="http://schemas.microsoft.com/office/word/2023/wordml/word16du" xmlns:w16sdtdh="http://schemas.microsoft.com/office/word/2020/wordml/sdtdatahash" xmlns:w16sdtfl="http://schemas.microsoft.com/office/word/2024/wordml/sdtformatlock" xmlns:w16se="http://schemas.microsoft.com/office/word/2015/wordml/symex" xmlns:wpg="http://schemas.microsoft.com/office/word/2010/wordprocessingGroup" xmlns:wpi="http://schemas.microsoft.com/office/word/2010/wordprocessingInk" xmlns:wne="http://schemas.microsoft.com/office/word/2006/wordml" xmlns:wps="http://schemas.microsoft.com/office/word/2010/wordprocessingShape" mc:Ignorable="w14 w15 w16se w16cid w16 w16cex w16sdtdh w16sdtfl w16du wp14">
+<w:ftr xmlns:wpc="http://schemas.microsoft.com/office/word/2010/wordprocessingCanvas" xmlns:cx="http://schemas.microsoft.com/office/drawing/2014/chartex" xmlns:cx1="http://schemas.microsoft.com/office/drawing/2015/9/8/chartex" xmlns:cx2="http://schemas.microsoft.com/office/drawing/2015/10/21/chartex" xmlns:cx3="http://schemas.microsoft.com/office/drawing/2016/5/9/chartex" xmlns:cx4="http://schemas.microsoft.com/office/drawing/2016/5/10/chartex" xmlns:cx5="http://schemas.microsoft.com/office/drawing/2016/5/11/chartex" xmlns:cx6="http://schemas.microsoft.com/office/drawing/2016/5/12/chartex" xmlns:cx7="http://schemas.microsoft.com/office/drawing/2016/5/13/chartex" xmlns:cx8="http://schemas.microsoft.com/office/drawing/2016/5/14/chartex" xmlns:mc="http://schemas.openxmlformats.org/markup-compatibility/2006" xmlns:m="http://schemas.openxmlformats.org/officeDocument/2006/math" xmlns:aink="http://schemas.microsoft.com/office/drawing/2016/ink" xmlns:am3d="http://schemas.microsoft.com/office/drawing/2017/model3d" xmlns:oel="http://schemas.microsoft.com/office/2019/extlst" xmlns:r="http://schemas.openxmlformats.org/officeDocument/2006/relationships" xmlns:wp14="http://schemas.microsoft.com/office/word/2010/wordprocessingDrawing" xmlns:wp="http://schemas.openxmlformats.org/drawingml/2006/wordprocessingDrawing" xmlns:wpg="http://schemas.microsoft.com/office/word/2010/wordprocessingGroup" xmlns:wpi="http://schemas.microsoft.com/office/word/2010/wordprocessingInk" xmlns:wps="http://schemas.microsoft.com/office/word/2010/wordprocessingShape" xmlns:o="urn:schemas-microsoft-com:office:office" xmlns:v="urn:schemas-microsoft-com:vml" xmlns:w10="urn:schemas-microsoft-com:office:word" xmlns:w="http://schemas.openxmlformats.org/wordprocessingml/2006/main" xmlns:w14="http://schemas.microsoft.com/office/word/2010/wordml" xmlns:w15="http://schemas.microsoft.com/office/word/2012/wordml" xmlns:w16cex="http://schemas.microsoft.com/office/word/2018/wordml/cex" xmlns:w16cid="http://schemas.microsoft.com/office/word/2016/wordml/cid" xmlns:w16="http://schemas.microsoft.com/office/word/2018/wordml" xmlns:w16sdtdh="http://schemas.microsoft.com/office/word/2020/wordml/sdtdatahash" xmlns:w16sdtfl="http://schemas.microsoft.com/office/word/2024/wordml/sdtformatlock" xmlns:w16se="http://schemas.microsoft.com/office/word/2015/wordml/symex" xmlns:w16du="http://schemas.microsoft.com/office/word/2023/wordml/word16du" xmlns:wne="http://schemas.microsoft.com/office/word/2006/wordml" mc:Ignorable="w14 w15 w16se w16cid w16 w16cex w16sdtdh w16sdtfl w16du wp14">
   <w:p>
     <w:pPr>
       <w:pBdr>
@@ -7970,7 +8840,7 @@
 </file>
 
 <file path=word/footnotes.xml><?xml version="1.0" encoding="utf-8"?>
-<w:footnotes xmlns:wpc="http://schemas.microsoft.com/office/word/2010/wordprocessingCanvas" xmlns:cx="http://schemas.microsoft.com/office/drawing/2014/chartex" xmlns:cx1="http://schemas.microsoft.com/office/drawing/2015/9/8/chartex" xmlns:cx2="http://schemas.microsoft.com/office/drawing/2015/10/21/chartex" xmlns:cx3="http://schemas.microsoft.com/office/drawing/2016/5/9/chartex" xmlns:cx4="http://schemas.microsoft.com/office/drawing/2016/5/10/chartex" xmlns:cx5="http://schemas.microsoft.com/office/drawing/2016/5/11/chartex" xmlns:cx6="http://schemas.microsoft.com/office/drawing/2016/5/12/chartex" xmlns:cx7="http://schemas.microsoft.com/office/drawing/2016/5/13/chartex" xmlns:cx8="http://schemas.microsoft.com/office/drawing/2016/5/14/chartex" xmlns:mc="http://schemas.openxmlformats.org/markup-compatibility/2006" xmlns:aink="http://schemas.microsoft.com/office/drawing/2016/ink" xmlns:am3d="http://schemas.microsoft.com/office/drawing/2017/model3d" xmlns:o="urn:schemas-microsoft-com:office:office" xmlns:oel="http://schemas.microsoft.com/office/2019/extlst" xmlns:r="http://schemas.openxmlformats.org/officeDocument/2006/relationships" xmlns:m="http://schemas.openxmlformats.org/officeDocument/2006/math" xmlns:v="urn:schemas-microsoft-com:vml" xmlns:wp14="http://schemas.microsoft.com/office/word/2010/wordprocessingDrawing" xmlns:wp="http://schemas.openxmlformats.org/drawingml/2006/wordprocessingDrawing" xmlns:w10="urn:schemas-microsoft-com:office:word" xmlns:w="http://schemas.openxmlformats.org/wordprocessingml/2006/main" xmlns:w14="http://schemas.microsoft.com/office/word/2010/wordml" xmlns:w15="http://schemas.microsoft.com/office/word/2012/wordml" xmlns:w16cex="http://schemas.microsoft.com/office/word/2018/wordml/cex" xmlns:w16cid="http://schemas.microsoft.com/office/word/2016/wordml/cid" xmlns:w16="http://schemas.microsoft.com/office/word/2018/wordml" xmlns:w16du="http://schemas.microsoft.com/office/word/2023/wordml/word16du" xmlns:w16sdtdh="http://schemas.microsoft.com/office/word/2020/wordml/sdtdatahash" xmlns:w16sdtfl="http://schemas.microsoft.com/office/word/2024/wordml/sdtformatlock" xmlns:w16se="http://schemas.microsoft.com/office/word/2015/wordml/symex" xmlns:wpg="http://schemas.microsoft.com/office/word/2010/wordprocessingGroup" xmlns:wpi="http://schemas.microsoft.com/office/word/2010/wordprocessingInk" xmlns:wne="http://schemas.microsoft.com/office/word/2006/wordml" xmlns:wps="http://schemas.microsoft.com/office/word/2010/wordprocessingShape" mc:Ignorable="w14 w15 w16se w16cid w16 w16cex w16sdtdh w16sdtfl w16du wp14">
+<w:footnotes xmlns:wpc="http://schemas.microsoft.com/office/word/2010/wordprocessingCanvas" xmlns:cx="http://schemas.microsoft.com/office/drawing/2014/chartex" xmlns:cx1="http://schemas.microsoft.com/office/drawing/2015/9/8/chartex" xmlns:cx2="http://schemas.microsoft.com/office/drawing/2015/10/21/chartex" xmlns:cx3="http://schemas.microsoft.com/office/drawing/2016/5/9/chartex" xmlns:cx4="http://schemas.microsoft.com/office/drawing/2016/5/10/chartex" xmlns:cx5="http://schemas.microsoft.com/office/drawing/2016/5/11/chartex" xmlns:cx6="http://schemas.microsoft.com/office/drawing/2016/5/12/chartex" xmlns:cx7="http://schemas.microsoft.com/office/drawing/2016/5/13/chartex" xmlns:cx8="http://schemas.microsoft.com/office/drawing/2016/5/14/chartex" xmlns:mc="http://schemas.openxmlformats.org/markup-compatibility/2006" xmlns:m="http://schemas.openxmlformats.org/officeDocument/2006/math" xmlns:aink="http://schemas.microsoft.com/office/drawing/2016/ink" xmlns:am3d="http://schemas.microsoft.com/office/drawing/2017/model3d" xmlns:oel="http://schemas.microsoft.com/office/2019/extlst" xmlns:r="http://schemas.openxmlformats.org/officeDocument/2006/relationships" xmlns:wp14="http://schemas.microsoft.com/office/word/2010/wordprocessingDrawing" xmlns:wp="http://schemas.openxmlformats.org/drawingml/2006/wordprocessingDrawing" xmlns:wpg="http://schemas.microsoft.com/office/word/2010/wordprocessingGroup" xmlns:wpi="http://schemas.microsoft.com/office/word/2010/wordprocessingInk" xmlns:wps="http://schemas.microsoft.com/office/word/2010/wordprocessingShape" xmlns:o="urn:schemas-microsoft-com:office:office" xmlns:v="urn:schemas-microsoft-com:vml" xmlns:w10="urn:schemas-microsoft-com:office:word" xmlns:w="http://schemas.openxmlformats.org/wordprocessingml/2006/main" xmlns:w14="http://schemas.microsoft.com/office/word/2010/wordml" xmlns:w15="http://schemas.microsoft.com/office/word/2012/wordml" xmlns:w16cex="http://schemas.microsoft.com/office/word/2018/wordml/cex" xmlns:w16cid="http://schemas.microsoft.com/office/word/2016/wordml/cid" xmlns:w16="http://schemas.microsoft.com/office/word/2018/wordml" xmlns:w16sdtdh="http://schemas.microsoft.com/office/word/2020/wordml/sdtdatahash" xmlns:w16sdtfl="http://schemas.microsoft.com/office/word/2024/wordml/sdtformatlock" xmlns:w16se="http://schemas.microsoft.com/office/word/2015/wordml/symex" xmlns:w16du="http://schemas.microsoft.com/office/word/2023/wordml/word16du" xmlns:wne="http://schemas.microsoft.com/office/word/2006/wordml" mc:Ignorable="w14 w15 w16se w16cid w16 w16cex w16sdtdh w16sdtfl w16du wp14">
   <w:footnote w:type="separator" w:id="-1">
     <w:p>
       <w:r>
@@ -7989,7 +8859,7 @@
 </file>
 
 <file path=word/header1.xml><?xml version="1.0" encoding="utf-8"?>
-<w:hdr xmlns:wpc="http://schemas.microsoft.com/office/word/2010/wordprocessingCanvas" xmlns:cx="http://schemas.microsoft.com/office/drawing/2014/chartex" xmlns:cx1="http://schemas.microsoft.com/office/drawing/2015/9/8/chartex" xmlns:cx2="http://schemas.microsoft.com/office/drawing/2015/10/21/chartex" xmlns:cx3="http://schemas.microsoft.com/office/drawing/2016/5/9/chartex" xmlns:cx4="http://schemas.microsoft.com/office/drawing/2016/5/10/chartex" xmlns:cx5="http://schemas.microsoft.com/office/drawing/2016/5/11/chartex" xmlns:cx6="http://schemas.microsoft.com/office/drawing/2016/5/12/chartex" xmlns:cx7="http://schemas.microsoft.com/office/drawing/2016/5/13/chartex" xmlns:cx8="http://schemas.microsoft.com/office/drawing/2016/5/14/chartex" xmlns:mc="http://schemas.openxmlformats.org/markup-compatibility/2006" xmlns:aink="http://schemas.microsoft.com/office/drawing/2016/ink" xmlns:am3d="http://schemas.microsoft.com/office/drawing/2017/model3d" xmlns:o="urn:schemas-microsoft-com:office:office" xmlns:oel="http://schemas.microsoft.com/office/2019/extlst" xmlns:r="http://schemas.openxmlformats.org/officeDocument/2006/relationships" xmlns:m="http://schemas.openxmlformats.org/officeDocument/2006/math" xmlns:v="urn:schemas-microsoft-com:vml" xmlns:wp14="http://schemas.microsoft.com/office/word/2010/wordprocessingDrawing" xmlns:wp="http://schemas.openxmlformats.org/drawingml/2006/wordprocessingDrawing" xmlns:w10="urn:schemas-microsoft-com:office:word" xmlns:w="http://schemas.openxmlformats.org/wordprocessingml/2006/main" xmlns:w14="http://schemas.microsoft.com/office/word/2010/wordml" xmlns:w15="http://schemas.microsoft.com/office/word/2012/wordml" xmlns:w16cex="http://schemas.microsoft.com/office/word/2018/wordml/cex" xmlns:w16cid="http://schemas.microsoft.com/office/word/2016/wordml/cid" xmlns:w16="http://schemas.microsoft.com/office/word/2018/wordml" xmlns:w16du="http://schemas.microsoft.com/office/word/2023/wordml/word16du" xmlns:w16sdtdh="http://schemas.microsoft.com/office/word/2020/wordml/sdtdatahash" xmlns:w16sdtfl="http://schemas.microsoft.com/office/word/2024/wordml/sdtformatlock" xmlns:w16se="http://schemas.microsoft.com/office/word/2015/wordml/symex" xmlns:wpg="http://schemas.microsoft.com/office/word/2010/wordprocessingGroup" xmlns:wpi="http://schemas.microsoft.com/office/word/2010/wordprocessingInk" xmlns:wne="http://schemas.microsoft.com/office/word/2006/wordml" xmlns:wps="http://schemas.microsoft.com/office/word/2010/wordprocessingShape" mc:Ignorable="w14 w15 w16se w16cid w16 w16cex w16sdtdh w16sdtfl w16du wp14">
+<w:hdr xmlns:wpc="http://schemas.microsoft.com/office/word/2010/wordprocessingCanvas" xmlns:cx="http://schemas.microsoft.com/office/drawing/2014/chartex" xmlns:cx1="http://schemas.microsoft.com/office/drawing/2015/9/8/chartex" xmlns:cx2="http://schemas.microsoft.com/office/drawing/2015/10/21/chartex" xmlns:cx3="http://schemas.microsoft.com/office/drawing/2016/5/9/chartex" xmlns:cx4="http://schemas.microsoft.com/office/drawing/2016/5/10/chartex" xmlns:cx5="http://schemas.microsoft.com/office/drawing/2016/5/11/chartex" xmlns:cx6="http://schemas.microsoft.com/office/drawing/2016/5/12/chartex" xmlns:cx7="http://schemas.microsoft.com/office/drawing/2016/5/13/chartex" xmlns:cx8="http://schemas.microsoft.com/office/drawing/2016/5/14/chartex" xmlns:mc="http://schemas.openxmlformats.org/markup-compatibility/2006" xmlns:m="http://schemas.openxmlformats.org/officeDocument/2006/math" xmlns:aink="http://schemas.microsoft.com/office/drawing/2016/ink" xmlns:am3d="http://schemas.microsoft.com/office/drawing/2017/model3d" xmlns:oel="http://schemas.microsoft.com/office/2019/extlst" xmlns:r="http://schemas.openxmlformats.org/officeDocument/2006/relationships" xmlns:wp14="http://schemas.microsoft.com/office/word/2010/wordprocessingDrawing" xmlns:wp="http://schemas.openxmlformats.org/drawingml/2006/wordprocessingDrawing" xmlns:wpg="http://schemas.microsoft.com/office/word/2010/wordprocessingGroup" xmlns:wpi="http://schemas.microsoft.com/office/word/2010/wordprocessingInk" xmlns:wps="http://schemas.microsoft.com/office/word/2010/wordprocessingShape" xmlns:o="urn:schemas-microsoft-com:office:office" xmlns:v="urn:schemas-microsoft-com:vml" xmlns:w10="urn:schemas-microsoft-com:office:word" xmlns:w="http://schemas.openxmlformats.org/wordprocessingml/2006/main" xmlns:w14="http://schemas.microsoft.com/office/word/2010/wordml" xmlns:w15="http://schemas.microsoft.com/office/word/2012/wordml" xmlns:w16cex="http://schemas.microsoft.com/office/word/2018/wordml/cex" xmlns:w16cid="http://schemas.microsoft.com/office/word/2016/wordml/cid" xmlns:w16="http://schemas.microsoft.com/office/word/2018/wordml" xmlns:w16sdtdh="http://schemas.microsoft.com/office/word/2020/wordml/sdtdatahash" xmlns:w16sdtfl="http://schemas.microsoft.com/office/word/2024/wordml/sdtformatlock" xmlns:w16se="http://schemas.microsoft.com/office/word/2015/wordml/symex" xmlns:w16du="http://schemas.microsoft.com/office/word/2023/wordml/word16du" xmlns:wne="http://schemas.microsoft.com/office/word/2006/wordml" mc:Ignorable="w14 w15 w16se w16cid w16 w16cex w16sdtdh w16sdtfl w16du wp14">
   <w:p>
     <w:pPr>
       <w:pBdr>
@@ -8011,7 +8881,7 @@
 </file>
 
 <file path=word/numbering.xml><?xml version="1.0" encoding="utf-8"?>
-<w:numbering xmlns:wpc="http://schemas.microsoft.com/office/word/2010/wordprocessingCanvas" xmlns:cx="http://schemas.microsoft.com/office/drawing/2014/chartex" xmlns:cx1="http://schemas.microsoft.com/office/drawing/2015/9/8/chartex" xmlns:cx2="http://schemas.microsoft.com/office/drawing/2015/10/21/chartex" xmlns:cx3="http://schemas.microsoft.com/office/drawing/2016/5/9/chartex" xmlns:cx4="http://schemas.microsoft.com/office/drawing/2016/5/10/chartex" xmlns:cx5="http://schemas.microsoft.com/office/drawing/2016/5/11/chartex" xmlns:cx6="http://schemas.microsoft.com/office/drawing/2016/5/12/chartex" xmlns:cx7="http://schemas.microsoft.com/office/drawing/2016/5/13/chartex" xmlns:cx8="http://schemas.microsoft.com/office/drawing/2016/5/14/chartex" xmlns:mc="http://schemas.openxmlformats.org/markup-compatibility/2006" xmlns:aink="http://schemas.microsoft.com/office/drawing/2016/ink" xmlns:am3d="http://schemas.microsoft.com/office/drawing/2017/model3d" xmlns:o="urn:schemas-microsoft-com:office:office" xmlns:oel="http://schemas.microsoft.com/office/2019/extlst" xmlns:r="http://schemas.openxmlformats.org/officeDocument/2006/relationships" xmlns:m="http://schemas.openxmlformats.org/officeDocument/2006/math" xmlns:v="urn:schemas-microsoft-com:vml" xmlns:wp14="http://schemas.microsoft.com/office/word/2010/wordprocessingDrawing" xmlns:wp="http://schemas.openxmlformats.org/drawingml/2006/wordprocessingDrawing" xmlns:w10="urn:schemas-microsoft-com:office:word" xmlns:w="http://schemas.openxmlformats.org/wordprocessingml/2006/main" xmlns:w14="http://schemas.microsoft.com/office/word/2010/wordml" xmlns:w15="http://schemas.microsoft.com/office/word/2012/wordml" xmlns:w16cex="http://schemas.microsoft.com/office/word/2018/wordml/cex" xmlns:w16cid="http://schemas.microsoft.com/office/word/2016/wordml/cid" xmlns:w16="http://schemas.microsoft.com/office/word/2018/wordml" xmlns:w16du="http://schemas.microsoft.com/office/word/2023/wordml/word16du" xmlns:w16sdtdh="http://schemas.microsoft.com/office/word/2020/wordml/sdtdatahash" xmlns:w16sdtfl="http://schemas.microsoft.com/office/word/2024/wordml/sdtformatlock" xmlns:w16se="http://schemas.microsoft.com/office/word/2015/wordml/symex" xmlns:wpg="http://schemas.microsoft.com/office/word/2010/wordprocessingGroup" xmlns:wpi="http://schemas.microsoft.com/office/word/2010/wordprocessingInk" xmlns:wne="http://schemas.microsoft.com/office/word/2006/wordml" xmlns:wps="http://schemas.microsoft.com/office/word/2010/wordprocessingShape" mc:Ignorable="w14 w15 w16se w16cid w16 w16cex w16sdtdh w16sdtfl w16du wp14">
+<w:numbering xmlns:wpc="http://schemas.microsoft.com/office/word/2010/wordprocessingCanvas" xmlns:cx="http://schemas.microsoft.com/office/drawing/2014/chartex" xmlns:cx1="http://schemas.microsoft.com/office/drawing/2015/9/8/chartex" xmlns:cx2="http://schemas.microsoft.com/office/drawing/2015/10/21/chartex" xmlns:cx3="http://schemas.microsoft.com/office/drawing/2016/5/9/chartex" xmlns:cx4="http://schemas.microsoft.com/office/drawing/2016/5/10/chartex" xmlns:cx5="http://schemas.microsoft.com/office/drawing/2016/5/11/chartex" xmlns:cx6="http://schemas.microsoft.com/office/drawing/2016/5/12/chartex" xmlns:cx7="http://schemas.microsoft.com/office/drawing/2016/5/13/chartex" xmlns:cx8="http://schemas.microsoft.com/office/drawing/2016/5/14/chartex" xmlns:mc="http://schemas.openxmlformats.org/markup-compatibility/2006" xmlns:m="http://schemas.openxmlformats.org/officeDocument/2006/math" xmlns:aink="http://schemas.microsoft.com/office/drawing/2016/ink" xmlns:am3d="http://schemas.microsoft.com/office/drawing/2017/model3d" xmlns:oel="http://schemas.microsoft.com/office/2019/extlst" xmlns:r="http://schemas.openxmlformats.org/officeDocument/2006/relationships" xmlns:wp14="http://schemas.microsoft.com/office/word/2010/wordprocessingDrawing" xmlns:wp="http://schemas.openxmlformats.org/drawingml/2006/wordprocessingDrawing" xmlns:wpg="http://schemas.microsoft.com/office/word/2010/wordprocessingGroup" xmlns:wpi="http://schemas.microsoft.com/office/word/2010/wordprocessingInk" xmlns:wps="http://schemas.microsoft.com/office/word/2010/wordprocessingShape" xmlns:o="urn:schemas-microsoft-com:office:office" xmlns:v="urn:schemas-microsoft-com:vml" xmlns:w10="urn:schemas-microsoft-com:office:word" xmlns:w="http://schemas.openxmlformats.org/wordprocessingml/2006/main" xmlns:w14="http://schemas.microsoft.com/office/word/2010/wordml" xmlns:w15="http://schemas.microsoft.com/office/word/2012/wordml" xmlns:w16cex="http://schemas.microsoft.com/office/word/2018/wordml/cex" xmlns:w16cid="http://schemas.microsoft.com/office/word/2016/wordml/cid" xmlns:w16="http://schemas.microsoft.com/office/word/2018/wordml" xmlns:w16sdtdh="http://schemas.microsoft.com/office/word/2020/wordml/sdtdatahash" xmlns:w16sdtfl="http://schemas.microsoft.com/office/word/2024/wordml/sdtformatlock" xmlns:w16se="http://schemas.microsoft.com/office/word/2015/wordml/symex" xmlns:w16du="http://schemas.microsoft.com/office/word/2023/wordml/word16du" xmlns:wne="http://schemas.microsoft.com/office/word/2006/wordml" mc:Ignorable="w14 w15 w16se w16cid w16 w16cex w16sdtdh w16sdtfl w16du wp14">
   <w:abstractNum w:abstractNumId="0" w15:restartNumberingAfterBreak="0">
     <w:nsid w:val="2BD7026E"/>
     <w:multiLevelType w:val="hybridMultilevel"/>
@@ -8430,7 +9300,7 @@
 </file>
 
 <file path=word/styles.xml><?xml version="1.0" encoding="utf-8"?>
-<w:styles xmlns:mc="http://schemas.openxmlformats.org/markup-compatibility/2006" xmlns:r="http://schemas.openxmlformats.org/officeDocument/2006/relationships" xmlns:w="http://schemas.openxmlformats.org/wordprocessingml/2006/main" xmlns:w14="http://schemas.microsoft.com/office/word/2010/wordml" xmlns:w15="http://schemas.microsoft.com/office/word/2012/wordml" xmlns:w16cex="http://schemas.microsoft.com/office/word/2018/wordml/cex" xmlns:w16cid="http://schemas.microsoft.com/office/word/2016/wordml/cid" xmlns:w16="http://schemas.microsoft.com/office/word/2018/wordml" xmlns:w16du="http://schemas.microsoft.com/office/word/2023/wordml/word16du" xmlns:w16sdtdh="http://schemas.microsoft.com/office/word/2020/wordml/sdtdatahash" xmlns:w16sdtfl="http://schemas.microsoft.com/office/word/2024/wordml/sdtformatlock" xmlns:w16se="http://schemas.microsoft.com/office/word/2015/wordml/symex" mc:Ignorable="w14 w15 w16se w16cid w16 w16cex w16sdtdh w16sdtfl w16du">
+<w:styles xmlns:mc="http://schemas.openxmlformats.org/markup-compatibility/2006" xmlns:r="http://schemas.openxmlformats.org/officeDocument/2006/relationships" xmlns:w="http://schemas.openxmlformats.org/wordprocessingml/2006/main" xmlns:w14="http://schemas.microsoft.com/office/word/2010/wordml" xmlns:w15="http://schemas.microsoft.com/office/word/2012/wordml" xmlns:w16cex="http://schemas.microsoft.com/office/word/2018/wordml/cex" xmlns:w16cid="http://schemas.microsoft.com/office/word/2016/wordml/cid" xmlns:w16="http://schemas.microsoft.com/office/word/2018/wordml" xmlns:w16sdtdh="http://schemas.microsoft.com/office/word/2020/wordml/sdtdatahash" xmlns:w16sdtfl="http://schemas.microsoft.com/office/word/2024/wordml/sdtformatlock" xmlns:w16se="http://schemas.microsoft.com/office/word/2015/wordml/symex" xmlns:w16du="http://schemas.microsoft.com/office/word/2023/wordml/word16du" mc:Ignorable="w14 w15 w16se w16cid w16 w16cex w16sdtdh w16sdtfl w16du">
   <w:docDefaults>
     <w:rPrDefault>
       <w:rPr>
@@ -9101,6 +9971,17 @@
       <w:bCs/>
     </w:rPr>
   </w:style>
+  <w:style w:type="character" w:styleId="Accentuation">
+    <w:name w:val="Emphasis"/>
+    <w:basedOn w:val="Policepardfaut"/>
+    <w:uiPriority w:val="20"/>
+    <w:qFormat/>
+    <w:rsid w:val="0097455E"/>
+    <w:rPr>
+      <w:i/>
+      <w:iCs/>
+    </w:rPr>
+  </w:style>
 </w:styles>
 </file>
 

</xml_diff>

<commit_message>
feat: email verification on registration
</commit_message>
<xml_diff>
--- a/HomeLink.docx
+++ b/HomeLink.docx
@@ -639,7 +639,7 @@
           <w:sz w:val="24"/>
           <w:szCs w:val="24"/>
         </w:rPr>
-        <w:t>CISSSE</w:t>
+        <w:t>CISSE</w:t>
       </w:r>
     </w:p>
     <w:p>
@@ -653,6 +653,7 @@
           <w:spacing w:val="-2"/>
           <w:sz w:val="24"/>
           <w:szCs w:val="24"/>
+          <w:lang w:val="en-US"/>
         </w:rPr>
       </w:pPr>
       <w:r>
@@ -662,6 +663,7 @@
           <w:spacing w:val="-2"/>
           <w:sz w:val="24"/>
           <w:szCs w:val="24"/>
+          <w:lang w:val="en-US"/>
         </w:rPr>
         <w:t>Sokhna</w:t>
       </w:r>
@@ -672,6 +674,7 @@
           <w:spacing w:val="-2"/>
           <w:sz w:val="24"/>
           <w:szCs w:val="24"/>
+          <w:lang w:val="en-US"/>
         </w:rPr>
         <w:t xml:space="preserve"> Aïchatou</w:t>
       </w:r>
@@ -682,9 +685,11 @@
           <w:spacing w:val="-2"/>
           <w:sz w:val="24"/>
           <w:szCs w:val="24"/>
-        </w:rPr>
-        <w:t xml:space="preserve"> Amanatou</w:t>
-      </w:r>
+          <w:lang w:val="en-US"/>
+        </w:rPr>
+        <w:t xml:space="preserve"> </w:t>
+      </w:r>
+      <w:proofErr w:type="spellStart"/>
       <w:r>
         <w:rPr>
           <w:rFonts w:ascii="Times New Roman" w:hAnsi="Times New Roman" w:cs="Times New Roman"/>
@@ -692,9 +697,22 @@
           <w:spacing w:val="-2"/>
           <w:sz w:val="24"/>
           <w:szCs w:val="24"/>
+          <w:lang w:val="en-US"/>
+        </w:rPr>
+        <w:t>Amanatou</w:t>
+      </w:r>
+      <w:r>
+        <w:rPr>
+          <w:rFonts w:ascii="Times New Roman" w:hAnsi="Times New Roman" w:cs="Times New Roman"/>
+          <w:color w:val="000000" w:themeColor="text1"/>
+          <w:spacing w:val="-2"/>
+          <w:sz w:val="24"/>
+          <w:szCs w:val="24"/>
+          <w:lang w:val="en-US"/>
         </w:rPr>
         <w:t>laye</w:t>
       </w:r>
+      <w:proofErr w:type="spellEnd"/>
       <w:r>
         <w:rPr>
           <w:rFonts w:ascii="Times New Roman" w:hAnsi="Times New Roman" w:cs="Times New Roman"/>
@@ -702,6 +720,7 @@
           <w:spacing w:val="-2"/>
           <w:sz w:val="24"/>
           <w:szCs w:val="24"/>
+          <w:lang w:val="en-US"/>
         </w:rPr>
         <w:t xml:space="preserve"> FALL</w:t>
       </w:r>
@@ -717,6 +736,7 @@
           <w:spacing w:val="-2"/>
           <w:sz w:val="24"/>
           <w:szCs w:val="24"/>
+          <w:lang w:val="en-US"/>
         </w:rPr>
       </w:pPr>
       <w:r>
@@ -726,6 +746,7 @@
           <w:spacing w:val="-2"/>
           <w:sz w:val="24"/>
           <w:szCs w:val="24"/>
+          <w:lang w:val="en-US"/>
         </w:rPr>
         <w:t>Abdoulaye GUEYE</w:t>
       </w:r>
@@ -739,6 +760,7 @@
           <w:color w:val="000000" w:themeColor="text1"/>
           <w:sz w:val="24"/>
           <w:szCs w:val="24"/>
+          <w:lang w:val="en-US"/>
         </w:rPr>
       </w:pPr>
     </w:p>
@@ -751,6 +773,7 @@
           <w:color w:val="000000" w:themeColor="text1"/>
           <w:sz w:val="24"/>
           <w:szCs w:val="24"/>
+          <w:lang w:val="en-US"/>
         </w:rPr>
       </w:pPr>
     </w:p>
@@ -763,6 +786,7 @@
           <w:color w:val="000000" w:themeColor="text1"/>
           <w:sz w:val="24"/>
           <w:szCs w:val="24"/>
+          <w:lang w:val="en-US"/>
         </w:rPr>
       </w:pPr>
     </w:p>
@@ -778,6 +802,7 @@
           <w:color w:val="000000" w:themeColor="text1"/>
           <w:sz w:val="24"/>
           <w:szCs w:val="24"/>
+          <w:lang w:val="en-US"/>
         </w:rPr>
       </w:pPr>
     </w:p>
@@ -793,6 +818,7 @@
           <w:color w:val="000000" w:themeColor="text1"/>
           <w:sz w:val="24"/>
           <w:szCs w:val="24"/>
+          <w:lang w:val="en-US"/>
         </w:rPr>
       </w:pPr>
     </w:p>
@@ -808,6 +834,7 @@
           <w:color w:val="000000" w:themeColor="text1"/>
           <w:sz w:val="24"/>
           <w:szCs w:val="24"/>
+          <w:lang w:val="en-US"/>
         </w:rPr>
       </w:pPr>
     </w:p>
@@ -823,6 +850,7 @@
           <w:color w:val="000000" w:themeColor="text1"/>
           <w:sz w:val="24"/>
           <w:szCs w:val="24"/>
+          <w:lang w:val="en-US"/>
         </w:rPr>
       </w:pPr>
     </w:p>
@@ -7681,7 +7709,7 @@
           <w:noProof/>
         </w:rPr>
         <w:drawing>
-          <wp:inline distT="0" distB="0" distL="0" distR="0" wp14:anchorId="58124795" wp14:editId="2694918E">
+          <wp:inline distT="0" distB="0" distL="0" distR="0" wp14:anchorId="58124795" wp14:editId="23946100">
             <wp:extent cx="1640840" cy="1446550"/>
             <wp:effectExtent l="0" t="0" r="0" b="1270"/>
             <wp:docPr id="1500560047" name="Image 5"/>
@@ -8024,15 +8052,7 @@
       </w:r>
       <w:proofErr w:type="spellEnd"/>
       <w:r>
-        <w:t xml:space="preserve"> web en Python utilisé pour développer le backend de l'application. Il permet de créer des API REST que le frontend </w:t>
-      </w:r>
-      <w:proofErr w:type="spellStart"/>
-      <w:r>
-        <w:t>React</w:t>
-      </w:r>
-      <w:proofErr w:type="spellEnd"/>
-      <w:r>
-        <w:t xml:space="preserve"> appelle pour récupérer ou envoyer des données. Flask a été choisi pour sa simplicité, sa légèreté et sa facilité d'apprentissage.</w:t>
+        <w:t xml:space="preserve"> web en Python utilisé pour développer le backend de l'application. Il permet de créer des API REST que le frontend React appelle pour récupérer ou envoyer des données. Flask a été choisi pour sa simplicité, sa légèreté et sa facilité d'apprentissage.</w:t>
       </w:r>
     </w:p>
     <w:p>
@@ -8198,20 +8218,12 @@
         <w:rPr>
           <w:rStyle w:val="lev"/>
         </w:rPr>
-        <w:t xml:space="preserve">1.7 </w:t>
-      </w:r>
-      <w:proofErr w:type="spellStart"/>
+        <w:t>1.7 Cloudinary</w:t>
+      </w:r>
       <w:r>
         <w:rPr>
           <w:rStyle w:val="lev"/>
         </w:rPr>
-        <w:t>Cloudinary</w:t>
-      </w:r>
-      <w:proofErr w:type="spellEnd"/>
-      <w:r>
-        <w:rPr>
-          <w:rStyle w:val="lev"/>
-        </w:rPr>
         <w:t> :</w:t>
       </w:r>
     </w:p>
@@ -8220,21 +8232,8 @@
         <w:pStyle w:val="font-claude-response-body"/>
         <w:jc w:val="both"/>
       </w:pPr>
-      <w:proofErr w:type="spellStart"/>
-      <w:r>
-        <w:t>Cloudinary</w:t>
-      </w:r>
-      <w:proofErr w:type="spellEnd"/>
-      <w:r>
-        <w:t xml:space="preserve"> est une plateforme cloud spécialisée dans la gestion des images et vidéos. Elle a été utilisée pour stocker les photos des annonces publiées par les propriétaires. </w:t>
-      </w:r>
-      <w:proofErr w:type="spellStart"/>
-      <w:r>
-        <w:t>Cloudinary</w:t>
-      </w:r>
-      <w:proofErr w:type="spellEnd"/>
-      <w:r>
-        <w:t xml:space="preserve"> génère automatiquement des URLs pour chaque image uploadée, ce qui permet de les afficher facilement dans l'application.</w:t>
+      <w:r>
+        <w:t>Cloudinary est une plateforme cloud spécialisée dans la gestion des images et vidéos. Elle a été utilisée pour stocker les photos des annonces publiées par les propriétaires. Cloudinary génère automatiquement des URLs pour chaque image uploadée, ce qui permet de les afficher facilement dans l'application.</w:t>
       </w:r>
     </w:p>
     <w:p>
@@ -8318,15 +8317,7 @@
         <w:jc w:val="both"/>
       </w:pPr>
       <w:r>
-        <w:t xml:space="preserve">Postman est un outil permettant de tester les API REST. Il a été utilisé tout au long du développement backend pour vérifier que chaque route Flask retourne bien les données attendues avant de les connecter au frontend </w:t>
-      </w:r>
-      <w:proofErr w:type="spellStart"/>
-      <w:r>
-        <w:t>React</w:t>
-      </w:r>
-      <w:proofErr w:type="spellEnd"/>
-      <w:r>
-        <w:t>. Cela permet de détecter et corriger les erreurs côté backend indépendamment du frontend.</w:t>
+        <w:t>Postman est un outil permettant de tester les API REST. Il a été utilisé tout au long du développement backend pour vérifier que chaque route Flask retourne bien les données attendues avant de les connecter au frontend React. Cela permet de détecter et corriger les erreurs côté backend indépendamment du frontend.</w:t>
       </w:r>
     </w:p>
     <w:p>
@@ -8474,6 +8465,9 @@
       <w:pPr>
         <w:pStyle w:val="font-claude-response-body"/>
         <w:jc w:val="both"/>
+        <w:rPr>
+          <w:rStyle w:val="lev"/>
+        </w:rPr>
       </w:pPr>
       <w:r>
         <w:rPr>
@@ -8495,15 +8489,13 @@
         <w:jc w:val="both"/>
       </w:pPr>
       <w:r>
-        <w:t xml:space="preserve">Render est une plateforme cloud utilisée pour le déploiement du backend Flask et du frontend </w:t>
-      </w:r>
-      <w:proofErr w:type="spellStart"/>
-      <w:r>
-        <w:t>React</w:t>
-      </w:r>
-      <w:proofErr w:type="spellEnd"/>
-      <w:r>
-        <w:t>. Elle permet de rendre l'application accessible en ligne gratuitement sans configuration complexe.</w:t>
+        <w:rPr>
+          <w:rStyle w:val="lev"/>
+        </w:rPr>
+        <w:t>Render</w:t>
+      </w:r>
+      <w:r>
+        <w:t xml:space="preserve"> est une plateforme cloud utilisée pour le déploiement du backend Flask. Elle héberge l'API et permet de configurer les variables d'environnement (MAIL, JWT, Cloudinary, base de données) directement depuis l'interface sans configuration complexe.</w:t>
       </w:r>
     </w:p>
     <w:p>
@@ -8567,56 +8559,54 @@
       <w:pPr>
         <w:pStyle w:val="font-claude-response-body"/>
         <w:jc w:val="both"/>
-      </w:pPr>
-      <w:r>
-        <w:rPr>
-          <w:rStyle w:val="lev"/>
-        </w:rPr>
-        <w:t>1.11 Railway</w:t>
-      </w:r>
-      <w:r>
-        <w:rPr>
-          <w:rStyle w:val="lev"/>
-        </w:rPr>
-        <w:t> :</w:t>
-      </w:r>
-    </w:p>
-    <w:p>
-      <w:pPr>
-        <w:pStyle w:val="font-claude-response-body"/>
-        <w:jc w:val="both"/>
-      </w:pPr>
-      <w:r>
-        <w:t>Railway est une plateforme cloud utilisée pour héberger la base de données MySQL en ligne. Elle permet d'accéder à la base de données depuis n'importe où, ce qui facilite la collaboration entre les membres de l'équipe.</w:t>
-      </w:r>
-    </w:p>
-    <w:p>
-      <w:pPr>
-        <w:jc w:val="both"/>
-        <w:rPr>
-          <w:rFonts w:ascii="Times New Roman" w:hAnsi="Times New Roman" w:cs="Times New Roman"/>
+        <w:rPr>
+          <w:rStyle w:val="Accentuation"/>
           <w:b/>
           <w:bCs/>
-          <w:color w:val="000000" w:themeColor="text1"/>
-          <w:sz w:val="24"/>
-          <w:szCs w:val="24"/>
-        </w:rPr>
-      </w:pPr>
-      <w:r>
-        <w:rPr>
-          <w:rFonts w:ascii="Times New Roman" w:hAnsi="Times New Roman" w:cs="Times New Roman"/>
+          <w:i w:val="0"/>
+          <w:iCs w:val="0"/>
+        </w:rPr>
+      </w:pPr>
+      <w:r>
+        <w:rPr>
+          <w:rStyle w:val="Accentuation"/>
           <w:b/>
           <w:bCs/>
+          <w:i w:val="0"/>
+          <w:iCs w:val="0"/>
+        </w:rPr>
+        <w:t>1.11 Vercel :</w:t>
+      </w:r>
+    </w:p>
+    <w:p>
+      <w:pPr>
+        <w:pStyle w:val="font-claude-response-body"/>
+        <w:jc w:val="both"/>
+      </w:pPr>
+      <w:r>
+        <w:rPr>
+          <w:rStyle w:val="lev"/>
+        </w:rPr>
+        <w:t>Vercel</w:t>
+      </w:r>
+      <w:r>
+        <w:t xml:space="preserve"> est une plateforme spécialisée dans le déploiement de applications frontend. Elle héberge le frontend React/Vite et assure un déploiement automatique à chaque push sur GitHub.</w:t>
+      </w:r>
+    </w:p>
+    <w:p>
+      <w:pPr>
+        <w:pStyle w:val="font-claude-response-body"/>
+        <w:jc w:val="both"/>
+      </w:pPr>
+      <w:r>
+        <w:rPr>
           <w:noProof/>
-          <w:color w:val="000000" w:themeColor="text1"/>
-          <w:sz w:val="24"/>
-          <w:szCs w:val="24"/>
         </w:rPr>
         <w:drawing>
-          <wp:inline distT="0" distB="0" distL="0" distR="0" wp14:anchorId="3EFB8947" wp14:editId="5006F9B1">
-            <wp:extent cx="1968500" cy="1028700"/>
+          <wp:inline distT="0" distB="0" distL="0" distR="0" wp14:anchorId="33D02663" wp14:editId="411842E4">
+            <wp:extent cx="1816100" cy="1117600"/>
             <wp:effectExtent l="0" t="0" r="0" b="0"/>
-            <wp:docPr id="681672316" name="Image 15"/>
+            <wp:docPr id="702224009" name="Image 2"/>
             <wp:cNvGraphicFramePr>
               <a:graphicFrameLocks xmlns:a="http://schemas.openxmlformats.org/drawingml/2006/main" noChangeAspect="1"/>
             </wp:cNvGraphicFramePr>
@@ -8624,7 +8614,7 @@
               <a:graphicData uri="http://schemas.openxmlformats.org/drawingml/2006/picture">
                 <pic:pic xmlns:pic="http://schemas.openxmlformats.org/drawingml/2006/picture">
                   <pic:nvPicPr>
-                    <pic:cNvPr id="681672316" name="Image 681672316"/>
+                    <pic:cNvPr id="702224009" name="Image 702224009"/>
                     <pic:cNvPicPr/>
                   </pic:nvPicPr>
                   <pic:blipFill>
@@ -8642,7 +8632,7 @@
                   <pic:spPr>
                     <a:xfrm>
                       <a:off x="0" y="0"/>
-                      <a:ext cx="1968500" cy="1028700"/>
+                      <a:ext cx="1816100" cy="1117600"/>
                     </a:xfrm>
                     <a:prstGeom prst="rect">
                       <a:avLst/>
@@ -8657,45 +8647,145 @@
     </w:p>
     <w:p>
       <w:pPr>
-        <w:jc w:val="both"/>
-        <w:rPr>
-          <w:rFonts w:ascii="Times New Roman" w:hAnsi="Times New Roman" w:cs="Times New Roman"/>
+        <w:pStyle w:val="font-claude-response-body"/>
+        <w:jc w:val="both"/>
+        <w:rPr>
           <w:b/>
           <w:bCs/>
-          <w:color w:val="000000" w:themeColor="text1"/>
-          <w:sz w:val="24"/>
-          <w:szCs w:val="24"/>
-        </w:rPr>
-      </w:pPr>
-    </w:p>
-    <w:p>
-      <w:pPr>
-        <w:jc w:val="both"/>
-        <w:rPr>
-          <w:rFonts w:ascii="Times New Roman" w:hAnsi="Times New Roman" w:cs="Times New Roman"/>
+        </w:rPr>
+      </w:pPr>
+      <w:r>
+        <w:rPr>
           <w:b/>
           <w:bCs/>
-          <w:color w:val="000000" w:themeColor="text1"/>
-          <w:sz w:val="24"/>
-          <w:szCs w:val="24"/>
-        </w:rPr>
-      </w:pPr>
-      <w:r>
-        <w:rPr>
-          <w:rFonts w:ascii="Times New Roman" w:hAnsi="Times New Roman" w:cs="Times New Roman"/>
+        </w:rPr>
+        <w:t xml:space="preserve">1.12 </w:t>
+      </w:r>
+      <w:r>
+        <w:rPr>
+          <w:rStyle w:val="lev"/>
+        </w:rPr>
+        <w:t>FreeSQLDatabase</w:t>
+      </w:r>
+      <w:r>
+        <w:t> </w:t>
+      </w:r>
+      <w:r>
+        <w:rPr>
           <w:b/>
           <w:bCs/>
-          <w:color w:val="000000" w:themeColor="text1"/>
-          <w:sz w:val="24"/>
-          <w:szCs w:val="24"/>
-        </w:rPr>
-        <w:t>II. Résultats obtenus</w:t>
-      </w:r>
-      <w:r>
-        <w:rPr>
-          <w:rFonts w:ascii="Times New Roman" w:hAnsi="Times New Roman" w:cs="Times New Roman"/>
+        </w:rPr>
+        <w:t>:</w:t>
+      </w:r>
+    </w:p>
+    <w:p>
+      <w:pPr>
+        <w:pStyle w:val="font-claude-response-body"/>
+        <w:jc w:val="both"/>
+        <w:rPr>
           <w:b/>
           <w:bCs/>
+        </w:rPr>
+      </w:pPr>
+      <w:r>
+        <w:rPr>
+          <w:b/>
+          <w:bCs/>
+          <w:noProof/>
+        </w:rPr>
+        <w:drawing>
+          <wp:inline distT="0" distB="0" distL="0" distR="0" wp14:anchorId="51D20FBB" wp14:editId="5ACB0C9A">
+            <wp:extent cx="3522689" cy="2113280"/>
+            <wp:effectExtent l="0" t="0" r="0" b="0"/>
+            <wp:docPr id="821196591" name="Image 1"/>
+            <wp:cNvGraphicFramePr>
+              <a:graphicFrameLocks xmlns:a="http://schemas.openxmlformats.org/drawingml/2006/main" noChangeAspect="1"/>
+            </wp:cNvGraphicFramePr>
+            <a:graphic xmlns:a="http://schemas.openxmlformats.org/drawingml/2006/main">
+              <a:graphicData uri="http://schemas.openxmlformats.org/drawingml/2006/picture">
+                <pic:pic xmlns:pic="http://schemas.openxmlformats.org/drawingml/2006/picture">
+                  <pic:nvPicPr>
+                    <pic:cNvPr id="821196591" name="Image 821196591"/>
+                    <pic:cNvPicPr/>
+                  </pic:nvPicPr>
+                  <pic:blipFill>
+                    <a:blip r:embed="rId27" cstate="print">
+                      <a:extLst>
+                        <a:ext uri="{28A0092B-C50C-407E-A947-70E740481C1C}">
+                          <a14:useLocalDpi xmlns:a14="http://schemas.microsoft.com/office/drawing/2010/main" val="0"/>
+                        </a:ext>
+                      </a:extLst>
+                    </a:blip>
+                    <a:stretch>
+                      <a:fillRect/>
+                    </a:stretch>
+                  </pic:blipFill>
+                  <pic:spPr>
+                    <a:xfrm>
+                      <a:off x="0" y="0"/>
+                      <a:ext cx="3535043" cy="2120691"/>
+                    </a:xfrm>
+                    <a:prstGeom prst="rect">
+                      <a:avLst/>
+                    </a:prstGeom>
+                  </pic:spPr>
+                </pic:pic>
+              </a:graphicData>
+            </a:graphic>
+          </wp:inline>
+        </w:drawing>
+      </w:r>
+    </w:p>
+    <w:p>
+      <w:pPr>
+        <w:pStyle w:val="font-claude-response-body"/>
+        <w:jc w:val="both"/>
+        <w:rPr>
+          <w:rStyle w:val="Accentuation"/>
+          <w:i w:val="0"/>
+          <w:iCs w:val="0"/>
+        </w:rPr>
+      </w:pPr>
+      <w:r>
+        <w:rPr>
+          <w:rStyle w:val="lev"/>
+          <w:b w:val="0"/>
+          <w:bCs w:val="0"/>
+        </w:rPr>
+        <w:t>FreeSQLDatabase</w:t>
+      </w:r>
+      <w:r>
+        <w:t xml:space="preserve"> est un service d'hébergement MySQL gratuit utilisé pour héberger la base de données de l'application en production. Il permet d'importer les tables et données depuis phpMyAdmin.</w:t>
+      </w:r>
+    </w:p>
+    <w:p>
+      <w:pPr>
+        <w:jc w:val="both"/>
+        <w:rPr>
+          <w:rFonts w:ascii="Times New Roman" w:hAnsi="Times New Roman" w:cs="Times New Roman"/>
+          <w:b/>
+          <w:bCs/>
+          <w:color w:val="000000" w:themeColor="text1"/>
+          <w:sz w:val="24"/>
+          <w:szCs w:val="24"/>
+        </w:rPr>
+      </w:pPr>
+      <w:r>
+        <w:rPr>
+          <w:rFonts w:ascii="Times New Roman" w:hAnsi="Times New Roman" w:cs="Times New Roman"/>
+          <w:b/>
+          <w:bCs/>
+          <w:color w:val="000000" w:themeColor="text1"/>
+          <w:sz w:val="24"/>
+          <w:szCs w:val="24"/>
+        </w:rPr>
+        <w:t>II. Résultats obtenus</w:t>
+      </w:r>
+      <w:r>
+        <w:rPr>
+          <w:rFonts w:ascii="Times New Roman" w:hAnsi="Times New Roman" w:cs="Times New Roman"/>
+          <w:b/>
+          <w:bCs/>
           <w:color w:val="000000" w:themeColor="text1"/>
           <w:sz w:val="24"/>
           <w:szCs w:val="24"/>
@@ -8704,8 +8794,8 @@
       </w:r>
     </w:p>
     <w:sectPr>
-      <w:headerReference w:type="default" r:id="rId27"/>
-      <w:footerReference w:type="default" r:id="rId28"/>
+      <w:headerReference w:type="default" r:id="rId28"/>
+      <w:footerReference w:type="default" r:id="rId29"/>
       <w:pgSz w:w="11906" w:h="16838"/>
       <w:pgMar w:top="1440" w:right="1440" w:bottom="1440" w:left="1440" w:header="708" w:footer="708" w:gutter="0"/>
       <w:cols w:space="720"/>

</xml_diff>

<commit_message>
version final de v0
</commit_message>
<xml_diff>
--- a/HomeLink.docx
+++ b/HomeLink.docx
@@ -653,7 +653,6 @@
           <w:spacing w:val="-2"/>
           <w:sz w:val="24"/>
           <w:szCs w:val="24"/>
-          <w:lang w:val="en-US"/>
         </w:rPr>
       </w:pPr>
       <w:r>
@@ -663,7 +662,6 @@
           <w:spacing w:val="-2"/>
           <w:sz w:val="24"/>
           <w:szCs w:val="24"/>
-          <w:lang w:val="en-US"/>
         </w:rPr>
         <w:t>Sokhna</w:t>
       </w:r>
@@ -674,7 +672,6 @@
           <w:spacing w:val="-2"/>
           <w:sz w:val="24"/>
           <w:szCs w:val="24"/>
-          <w:lang w:val="en-US"/>
         </w:rPr>
         <w:t xml:space="preserve"> Aïchatou</w:t>
       </w:r>
@@ -685,11 +682,9 @@
           <w:spacing w:val="-2"/>
           <w:sz w:val="24"/>
           <w:szCs w:val="24"/>
-          <w:lang w:val="en-US"/>
-        </w:rPr>
-        <w:t xml:space="preserve"> </w:t>
-      </w:r>
-      <w:proofErr w:type="spellStart"/>
+        </w:rPr>
+        <w:t xml:space="preserve"> Amanatou</w:t>
+      </w:r>
       <w:r>
         <w:rPr>
           <w:rFonts w:ascii="Times New Roman" w:hAnsi="Times New Roman" w:cs="Times New Roman"/>
@@ -697,9 +692,8 @@
           <w:spacing w:val="-2"/>
           <w:sz w:val="24"/>
           <w:szCs w:val="24"/>
-          <w:lang w:val="en-US"/>
-        </w:rPr>
-        <w:t>Amanatou</w:t>
+        </w:rPr>
+        <w:t>laye</w:t>
       </w:r>
       <w:r>
         <w:rPr>
@@ -708,19 +702,6 @@
           <w:spacing w:val="-2"/>
           <w:sz w:val="24"/>
           <w:szCs w:val="24"/>
-          <w:lang w:val="en-US"/>
-        </w:rPr>
-        <w:t>laye</w:t>
-      </w:r>
-      <w:proofErr w:type="spellEnd"/>
-      <w:r>
-        <w:rPr>
-          <w:rFonts w:ascii="Times New Roman" w:hAnsi="Times New Roman" w:cs="Times New Roman"/>
-          <w:color w:val="000000" w:themeColor="text1"/>
-          <w:spacing w:val="-2"/>
-          <w:sz w:val="24"/>
-          <w:szCs w:val="24"/>
-          <w:lang w:val="en-US"/>
         </w:rPr>
         <w:t xml:space="preserve"> FALL</w:t>
       </w:r>
@@ -736,7 +717,6 @@
           <w:spacing w:val="-2"/>
           <w:sz w:val="24"/>
           <w:szCs w:val="24"/>
-          <w:lang w:val="en-US"/>
         </w:rPr>
       </w:pPr>
       <w:r>
@@ -746,7 +726,6 @@
           <w:spacing w:val="-2"/>
           <w:sz w:val="24"/>
           <w:szCs w:val="24"/>
-          <w:lang w:val="en-US"/>
         </w:rPr>
         <w:t>Abdoulaye GUEYE</w:t>
       </w:r>
@@ -760,7 +739,6 @@
           <w:color w:val="000000" w:themeColor="text1"/>
           <w:sz w:val="24"/>
           <w:szCs w:val="24"/>
-          <w:lang w:val="en-US"/>
         </w:rPr>
       </w:pPr>
     </w:p>
@@ -773,7 +751,6 @@
           <w:color w:val="000000" w:themeColor="text1"/>
           <w:sz w:val="24"/>
           <w:szCs w:val="24"/>
-          <w:lang w:val="en-US"/>
         </w:rPr>
       </w:pPr>
     </w:p>
@@ -786,7 +763,6 @@
           <w:color w:val="000000" w:themeColor="text1"/>
           <w:sz w:val="24"/>
           <w:szCs w:val="24"/>
-          <w:lang w:val="en-US"/>
         </w:rPr>
       </w:pPr>
     </w:p>
@@ -802,7 +778,7 @@
           <w:color w:val="000000" w:themeColor="text1"/>
           <w:sz w:val="24"/>
           <w:szCs w:val="24"/>
-          <w:lang w:val="en-US"/>
+          <w:lang w:val="fr-SN"/>
         </w:rPr>
       </w:pPr>
     </w:p>
@@ -818,7 +794,7 @@
           <w:color w:val="000000" w:themeColor="text1"/>
           <w:sz w:val="24"/>
           <w:szCs w:val="24"/>
-          <w:lang w:val="en-US"/>
+          <w:lang w:val="fr-SN"/>
         </w:rPr>
       </w:pPr>
     </w:p>
@@ -834,7 +810,7 @@
           <w:color w:val="000000" w:themeColor="text1"/>
           <w:sz w:val="24"/>
           <w:szCs w:val="24"/>
-          <w:lang w:val="en-US"/>
+          <w:lang w:val="fr-SN"/>
         </w:rPr>
       </w:pPr>
     </w:p>
@@ -850,7 +826,7 @@
           <w:color w:val="000000" w:themeColor="text1"/>
           <w:sz w:val="24"/>
           <w:szCs w:val="24"/>
-          <w:lang w:val="en-US"/>
+          <w:lang w:val="fr-SN"/>
         </w:rPr>
       </w:pPr>
     </w:p>
@@ -6525,10 +6501,10 @@
         </w:rPr>
         <w:lastRenderedPageBreak/>
         <w:drawing>
-          <wp:inline distT="0" distB="0" distL="0" distR="0" wp14:anchorId="2550F74A" wp14:editId="73CD99E1">
-            <wp:extent cx="6524084" cy="9397980"/>
-            <wp:effectExtent l="0" t="0" r="3810" b="635"/>
-            <wp:docPr id="1930332505" name="Image 1"/>
+          <wp:inline distT="0" distB="0" distL="0" distR="0" wp14:anchorId="51D783FF" wp14:editId="7A0E8D67">
+            <wp:extent cx="5422900" cy="7188200"/>
+            <wp:effectExtent l="0" t="0" r="0" b="0"/>
+            <wp:docPr id="1919195311" name="Image 1"/>
             <wp:cNvGraphicFramePr>
               <a:graphicFrameLocks xmlns:a="http://schemas.openxmlformats.org/drawingml/2006/main" noChangeAspect="1"/>
             </wp:cNvGraphicFramePr>
@@ -6536,7 +6512,7 @@
               <a:graphicData uri="http://schemas.openxmlformats.org/drawingml/2006/picture">
                 <pic:pic xmlns:pic="http://schemas.openxmlformats.org/drawingml/2006/picture">
                   <pic:nvPicPr>
-                    <pic:cNvPr id="1930332505" name="Image 1930332505"/>
+                    <pic:cNvPr id="1919195311" name="Image 1919195311"/>
                     <pic:cNvPicPr/>
                   </pic:nvPicPr>
                   <pic:blipFill>
@@ -6554,7 +6530,7 @@
                   <pic:spPr>
                     <a:xfrm>
                       <a:off x="0" y="0"/>
-                      <a:ext cx="6547157" cy="9431217"/>
+                      <a:ext cx="5422900" cy="7188200"/>
                     </a:xfrm>
                     <a:prstGeom prst="rect">
                       <a:avLst/>
@@ -6585,7 +6561,6 @@
           <w:sz w:val="24"/>
           <w:szCs w:val="24"/>
         </w:rPr>
-        <w:lastRenderedPageBreak/>
         <w:t>Figure 4 — Modèle du domaine métier de HomeLink</w:t>
       </w:r>
     </w:p>
@@ -6747,6 +6722,7 @@
                 <w:sz w:val="24"/>
                 <w:szCs w:val="24"/>
               </w:rPr>
+              <w:lastRenderedPageBreak/>
               <w:t>Utilisateur</w:t>
             </w:r>
           </w:p>
@@ -7061,17 +7037,7 @@
                 <w:sz w:val="24"/>
                 <w:szCs w:val="24"/>
               </w:rPr>
-              <w:t xml:space="preserve">Le BienImmobilier représente la propriété physique mise en location : son adresse, son quartier, sa surface, son nombre de pièces, son étage et son type (chambre, studio, appartement, villa). Il existe indépendamment des annonces — un bien peut être reloué plusieurs fois sans que ses caractéristiques physiques ne changent. C'est </w:t>
-            </w:r>
-            <w:r>
-              <w:rPr>
-                <w:rFonts w:ascii="Times New Roman" w:hAnsi="Times New Roman" w:cs="Times New Roman"/>
-                <w:color w:val="000000" w:themeColor="text1"/>
-                <w:sz w:val="24"/>
-                <w:szCs w:val="24"/>
-              </w:rPr>
-              <w:lastRenderedPageBreak/>
-              <w:t>l'unité centrale autour de laquelle s'organise toute l'offre locative de HomeLink.</w:t>
+              <w:t>Le BienImmobilier représente la propriété physique mise en location : son adresse, son quartier, sa surface, son nombre de pièces, son étage et son type (chambre, studio, appartement, villa). Il existe indépendamment des annonces — un bien peut être reloué plusieurs fois sans que ses caractéristiques physiques ne changent. C'est l'unité centrale autour de laquelle s'organise toute l'offre locative de HomeLink.</w:t>
             </w:r>
           </w:p>
         </w:tc>
@@ -7109,7 +7075,6 @@
                 <w:sz w:val="24"/>
                 <w:szCs w:val="24"/>
               </w:rPr>
-              <w:lastRenderedPageBreak/>
               <w:t>Quartier</w:t>
             </w:r>
           </w:p>
@@ -7142,7 +7107,17 @@
                 <w:sz w:val="24"/>
                 <w:szCs w:val="24"/>
               </w:rPr>
-              <w:t>Le Quartier est la zone géographique où se situe le logement. Il permet aux locataires de filtrer les annonces par localisation et d'accéder à des informations contextuelles sur les commodités, la sécurité et les prix moyens — une aide précieuse pour les nouveaux arrivants.</w:t>
+              <w:t xml:space="preserve">Le Quartier est la zone géographique où se situe le logement. Il permet aux locataires de filtrer les annonces par localisation et d'accéder à des informations contextuelles sur les commodités, la sécurité et les prix </w:t>
+            </w:r>
+            <w:r>
+              <w:rPr>
+                <w:rFonts w:ascii="Times New Roman" w:hAnsi="Times New Roman" w:cs="Times New Roman"/>
+                <w:color w:val="000000" w:themeColor="text1"/>
+                <w:sz w:val="24"/>
+                <w:szCs w:val="24"/>
+              </w:rPr>
+              <w:lastRenderedPageBreak/>
+              <w:t>moyens — une aide précieuse pour les nouveaux arrivants.</w:t>
             </w:r>
           </w:p>
         </w:tc>
@@ -7180,6 +7155,7 @@
                 <w:sz w:val="24"/>
                 <w:szCs w:val="24"/>
               </w:rPr>
+              <w:lastRenderedPageBreak/>
               <w:t>Message</w:t>
             </w:r>
           </w:p>
@@ -8779,18 +8755,7 @@
           <w:sz w:val="24"/>
           <w:szCs w:val="24"/>
         </w:rPr>
-        <w:t>II. Résultats obtenus</w:t>
-      </w:r>
-      <w:r>
-        <w:rPr>
-          <w:rFonts w:ascii="Times New Roman" w:hAnsi="Times New Roman" w:cs="Times New Roman"/>
-          <w:b/>
-          <w:bCs/>
-          <w:color w:val="000000" w:themeColor="text1"/>
-          <w:sz w:val="24"/>
-          <w:szCs w:val="24"/>
-        </w:rPr>
-        <w:t> :</w:t>
+        <w:t>II. Résultats obtenus :</w:t>
       </w:r>
     </w:p>
     <w:sectPr>

</xml_diff>

<commit_message>
ON DELETE CASCADE, ORM configuré en passive_deletes pour éviter les conflits entre la gestion Python et la gestion SQL native.
</commit_message>
<xml_diff>
--- a/HomeLink.docx
+++ b/HomeLink.docx
@@ -3450,7 +3450,7 @@
           <w:sz w:val="24"/>
           <w:szCs w:val="24"/>
         </w:rPr>
-        <w:t>Diagramme de cas d'utilisation du système HomeLink</w:t>
+        <w:t xml:space="preserve">Les acteurs et les fonctionnalités attendues </w:t>
       </w:r>
     </w:p>
     <w:p>
@@ -3731,7 +3731,10 @@
           <w:szCs w:val="24"/>
         </w:rPr>
       </w:pPr>
-      <w:r>
+    </w:p>
+    <w:p>
+      <w:pPr>
+        <w:jc w:val="both"/>
         <w:rPr>
           <w:rFonts w:ascii="Times New Roman" w:hAnsi="Times New Roman" w:cs="Times New Roman"/>
           <w:b/>
@@ -3740,7 +3743,39 @@
           <w:sz w:val="24"/>
           <w:szCs w:val="24"/>
         </w:rPr>
-        <w:t>VIII. Fiches textuelles des cas d'utilisation et Fonctionnalités :</w:t>
+      </w:pPr>
+      <w:r>
+        <w:rPr>
+          <w:rFonts w:ascii="Times New Roman" w:hAnsi="Times New Roman" w:cs="Times New Roman"/>
+          <w:b/>
+          <w:bCs/>
+          <w:color w:val="000000" w:themeColor="text1"/>
+          <w:sz w:val="24"/>
+          <w:szCs w:val="24"/>
+        </w:rPr>
+        <w:t xml:space="preserve">VIII. </w:t>
+      </w:r>
+      <w:r>
+        <w:rPr>
+          <w:rFonts w:ascii="Times New Roman" w:hAnsi="Times New Roman" w:cs="Times New Roman"/>
+          <w:b/>
+          <w:bCs/>
+          <w:color w:val="000000" w:themeColor="text1"/>
+          <w:sz w:val="24"/>
+          <w:szCs w:val="24"/>
+        </w:rPr>
+        <w:t>Description détaillée des fonctionnalités identifiées</w:t>
+      </w:r>
+      <w:r>
+        <w:rPr>
+          <w:rFonts w:ascii="Times New Roman" w:hAnsi="Times New Roman" w:cs="Times New Roman"/>
+          <w:b/>
+          <w:bCs/>
+          <w:color w:val="000000" w:themeColor="text1"/>
+          <w:sz w:val="24"/>
+          <w:szCs w:val="24"/>
+        </w:rPr>
+        <w:t>:</w:t>
       </w:r>
     </w:p>
     <w:p>
@@ -4656,7 +4691,16 @@
           <w:sz w:val="24"/>
           <w:szCs w:val="24"/>
         </w:rPr>
-        <w:t>Diagramme de séquence du cas d'utilisation « Publier une annonce »</w:t>
+        <w:t xml:space="preserve"> Description graphique du cas </w:t>
+      </w:r>
+      <w:r>
+        <w:rPr>
+          <w:rFonts w:ascii="Times New Roman" w:hAnsi="Times New Roman" w:cs="Times New Roman"/>
+          <w:color w:val="000000" w:themeColor="text1"/>
+          <w:sz w:val="24"/>
+          <w:szCs w:val="24"/>
+        </w:rPr>
+        <w:t>« Publier une annonce »</w:t>
       </w:r>
     </w:p>
     <w:p>
@@ -5539,7 +5583,16 @@
           <w:sz w:val="24"/>
           <w:szCs w:val="24"/>
         </w:rPr>
-        <w:t>Diagramme de séquence du cas d'utilisation « Rechercher un logement »</w:t>
+        <w:t xml:space="preserve">Description graphique du cas </w:t>
+      </w:r>
+      <w:r>
+        <w:rPr>
+          <w:rFonts w:ascii="Times New Roman" w:hAnsi="Times New Roman" w:cs="Times New Roman"/>
+          <w:color w:val="000000" w:themeColor="text1"/>
+          <w:sz w:val="24"/>
+          <w:szCs w:val="24"/>
+        </w:rPr>
+        <w:t>« Rechercher un logement »</w:t>
       </w:r>
     </w:p>
     <w:p>
@@ -7131,7 +7184,21 @@
           <w:rStyle w:val="lev"/>
           <w:color w:val="000000" w:themeColor="text1"/>
         </w:rPr>
-        <w:t>1.6 phpMyAdmin pour MySQL :</w:t>
+        <w:t>1.</w:t>
+      </w:r>
+      <w:r>
+        <w:rPr>
+          <w:rStyle w:val="lev"/>
+          <w:color w:val="000000" w:themeColor="text1"/>
+        </w:rPr>
+        <w:t>6</w:t>
+      </w:r>
+      <w:r>
+        <w:rPr>
+          <w:rStyle w:val="lev"/>
+          <w:color w:val="000000" w:themeColor="text1"/>
+        </w:rPr>
+        <w:t xml:space="preserve"> Cloudinary :</w:t>
       </w:r>
     </w:p>
     <w:p>
@@ -7146,7 +7213,7 @@
         <w:rPr>
           <w:color w:val="000000" w:themeColor="text1"/>
         </w:rPr>
-        <w:t>MySQL est un système de gestion de base de données relationnelle open source. Il a été utilisé pour stocker toutes les données de la plateforme HomeLink : les utilisateurs, les biens immobiliers, les annonces, les quartiers, les messages et les avis. La structure de la base de données a été conçue directement à partir du diagramme de classes réalisé lors de la phase de conception.</w:t>
+        <w:t>Cloudinary est une plateforme cloud spécialisée dans la gestion des images et vidéos. Elle a été utilisée pour stocker les photos des annonces publiées par les propriétaires. Cloudinary génère automatiquement des URLs pour chaque image uploadée, ce qui permet de les afficher facilement dans l'application.</w:t>
       </w:r>
     </w:p>
     <w:p>
@@ -7165,97 +7232,6 @@
           <w:noProof/>
           <w:color w:val="000000" w:themeColor="text1"/>
         </w:rPr>
-        <w:drawing>
-          <wp:inline distT="0" distB="0" distL="0" distR="0" wp14:anchorId="1A62406F" wp14:editId="4F8DCE61">
-            <wp:extent cx="1689100" cy="1193800"/>
-            <wp:effectExtent l="0" t="0" r="0" b="0"/>
-            <wp:docPr id="53668812" name="Image 10"/>
-            <wp:cNvGraphicFramePr>
-              <a:graphicFrameLocks xmlns:a="http://schemas.openxmlformats.org/drawingml/2006/main" noChangeAspect="1"/>
-            </wp:cNvGraphicFramePr>
-            <a:graphic xmlns:a="http://schemas.openxmlformats.org/drawingml/2006/main">
-              <a:graphicData uri="http://schemas.openxmlformats.org/drawingml/2006/picture">
-                <pic:pic xmlns:pic="http://schemas.openxmlformats.org/drawingml/2006/picture">
-                  <pic:nvPicPr>
-                    <pic:cNvPr id="53668812" name="Image 53668812"/>
-                    <pic:cNvPicPr/>
-                  </pic:nvPicPr>
-                  <pic:blipFill>
-                    <a:blip r:embed="rId21">
-                      <a:extLst>
-                        <a:ext uri="{28A0092B-C50C-407E-A947-70E740481C1C}">
-                          <a14:useLocalDpi xmlns:a14="http://schemas.microsoft.com/office/drawing/2010/main" val="0"/>
-                        </a:ext>
-                      </a:extLst>
-                    </a:blip>
-                    <a:stretch>
-                      <a:fillRect/>
-                    </a:stretch>
-                  </pic:blipFill>
-                  <pic:spPr>
-                    <a:xfrm>
-                      <a:off x="0" y="0"/>
-                      <a:ext cx="1689100" cy="1193800"/>
-                    </a:xfrm>
-                    <a:prstGeom prst="rect">
-                      <a:avLst/>
-                    </a:prstGeom>
-                  </pic:spPr>
-                </pic:pic>
-              </a:graphicData>
-            </a:graphic>
-          </wp:inline>
-        </w:drawing>
-      </w:r>
-    </w:p>
-    <w:p>
-      <w:pPr>
-        <w:pStyle w:val="font-claude-response-body"/>
-        <w:jc w:val="both"/>
-        <w:rPr>
-          <w:color w:val="000000" w:themeColor="text1"/>
-        </w:rPr>
-      </w:pPr>
-      <w:r>
-        <w:rPr>
-          <w:rStyle w:val="lev"/>
-          <w:color w:val="000000" w:themeColor="text1"/>
-        </w:rPr>
-        <w:t>1.7 Cloudinary :</w:t>
-      </w:r>
-    </w:p>
-    <w:p>
-      <w:pPr>
-        <w:pStyle w:val="font-claude-response-body"/>
-        <w:jc w:val="both"/>
-        <w:rPr>
-          <w:color w:val="000000" w:themeColor="text1"/>
-        </w:rPr>
-      </w:pPr>
-      <w:r>
-        <w:rPr>
-          <w:color w:val="000000" w:themeColor="text1"/>
-        </w:rPr>
-        <w:t>Cloudinary est une plateforme cloud spécialisée dans la gestion des images et vidéos. Elle a été utilisée pour stocker les photos des annonces publiées par les propriétaires. Cloudinary génère automatiquement des URLs pour chaque image uploadée, ce qui permet de les afficher facilement dans l'application.</w:t>
-      </w:r>
-    </w:p>
-    <w:p>
-      <w:pPr>
-        <w:pStyle w:val="font-claude-response-body"/>
-        <w:jc w:val="both"/>
-        <w:rPr>
-          <w:rStyle w:val="Accentuation"/>
-          <w:i w:val="0"/>
-          <w:iCs w:val="0"/>
-          <w:color w:val="000000" w:themeColor="text1"/>
-        </w:rPr>
-      </w:pPr>
-      <w:r>
-        <w:rPr>
-          <w:noProof/>
-          <w:color w:val="000000" w:themeColor="text1"/>
-        </w:rPr>
-        <w:lastRenderedPageBreak/>
         <w:drawing>
           <wp:inline distT="0" distB="0" distL="0" distR="0" wp14:anchorId="63973D08" wp14:editId="663A7F5C">
             <wp:extent cx="1701800" cy="1193800"/>
@@ -7272,7 +7248,7 @@
                     <pic:cNvPicPr/>
                   </pic:nvPicPr>
                   <pic:blipFill>
-                    <a:blip r:embed="rId22">
+                    <a:blip r:embed="rId21">
                       <a:extLst>
                         <a:ext uri="{28A0092B-C50C-407E-A947-70E740481C1C}">
                           <a14:useLocalDpi xmlns:a14="http://schemas.microsoft.com/office/drawing/2010/main" val="0"/>
@@ -7312,7 +7288,21 @@
           <w:rStyle w:val="lev"/>
           <w:color w:val="000000" w:themeColor="text1"/>
         </w:rPr>
-        <w:t>1.8 Postman :</w:t>
+        <w:t>1.</w:t>
+      </w:r>
+      <w:r>
+        <w:rPr>
+          <w:rStyle w:val="lev"/>
+          <w:color w:val="000000" w:themeColor="text1"/>
+        </w:rPr>
+        <w:t>7</w:t>
+      </w:r>
+      <w:r>
+        <w:rPr>
+          <w:rStyle w:val="lev"/>
+          <w:color w:val="000000" w:themeColor="text1"/>
+        </w:rPr>
+        <w:t xml:space="preserve"> Postman :</w:t>
       </w:r>
     </w:p>
     <w:p>
@@ -7346,6 +7336,7 @@
           <w:noProof/>
           <w:color w:val="000000" w:themeColor="text1"/>
         </w:rPr>
+        <w:lastRenderedPageBreak/>
         <w:drawing>
           <wp:inline distT="0" distB="0" distL="0" distR="0" wp14:anchorId="7088F401" wp14:editId="6247FBBD">
             <wp:extent cx="1968500" cy="1028700"/>
@@ -7362,7 +7353,7 @@
                     <pic:cNvPicPr/>
                   </pic:nvPicPr>
                   <pic:blipFill>
-                    <a:blip r:embed="rId23">
+                    <a:blip r:embed="rId22">
                       <a:extLst>
                         <a:ext uri="{28A0092B-C50C-407E-A947-70E740481C1C}">
                           <a14:useLocalDpi xmlns:a14="http://schemas.microsoft.com/office/drawing/2010/main" val="0"/>
@@ -7402,7 +7393,21 @@
           <w:rStyle w:val="lev"/>
           <w:color w:val="000000" w:themeColor="text1"/>
         </w:rPr>
-        <w:t>1.9 GitHub :</w:t>
+        <w:t>1.</w:t>
+      </w:r>
+      <w:r>
+        <w:rPr>
+          <w:rStyle w:val="lev"/>
+          <w:color w:val="000000" w:themeColor="text1"/>
+        </w:rPr>
+        <w:t>8</w:t>
+      </w:r>
+      <w:r>
+        <w:rPr>
+          <w:rStyle w:val="lev"/>
+          <w:color w:val="000000" w:themeColor="text1"/>
+        </w:rPr>
+        <w:t xml:space="preserve"> GitHub :</w:t>
       </w:r>
     </w:p>
     <w:p>
@@ -7452,7 +7457,7 @@
                     <pic:cNvPicPr/>
                   </pic:nvPicPr>
                   <pic:blipFill>
-                    <a:blip r:embed="rId24">
+                    <a:blip r:embed="rId23">
                       <a:extLst>
                         <a:ext uri="{28A0092B-C50C-407E-A947-70E740481C1C}">
                           <a14:useLocalDpi xmlns:a14="http://schemas.microsoft.com/office/drawing/2010/main" val="0"/>
@@ -7493,7 +7498,21 @@
           <w:rStyle w:val="lev"/>
           <w:color w:val="000000" w:themeColor="text1"/>
         </w:rPr>
-        <w:t>1.10 Render :</w:t>
+        <w:t>1.</w:t>
+      </w:r>
+      <w:r>
+        <w:rPr>
+          <w:rStyle w:val="lev"/>
+          <w:color w:val="000000" w:themeColor="text1"/>
+        </w:rPr>
+        <w:t>9</w:t>
+      </w:r>
+      <w:r>
+        <w:rPr>
+          <w:rStyle w:val="lev"/>
+          <w:color w:val="000000" w:themeColor="text1"/>
+        </w:rPr>
+        <w:t xml:space="preserve"> Render :</w:t>
       </w:r>
     </w:p>
     <w:p>
@@ -7550,7 +7569,7 @@
                     <pic:cNvPicPr/>
                   </pic:nvPicPr>
                   <pic:blipFill>
-                    <a:blip r:embed="rId25">
+                    <a:blip r:embed="rId24">
                       <a:extLst>
                         <a:ext uri="{28A0092B-C50C-407E-A947-70E740481C1C}">
                           <a14:useLocalDpi xmlns:a14="http://schemas.microsoft.com/office/drawing/2010/main" val="0"/>
@@ -7599,7 +7618,29 @@
           <w:iCs w:val="0"/>
           <w:color w:val="000000" w:themeColor="text1"/>
         </w:rPr>
-        <w:t>1.11 Vercel :</w:t>
+        <w:t>1.1</w:t>
+      </w:r>
+      <w:r>
+        <w:rPr>
+          <w:rStyle w:val="Accentuation"/>
+          <w:b/>
+          <w:bCs/>
+          <w:i w:val="0"/>
+          <w:iCs w:val="0"/>
+          <w:color w:val="000000" w:themeColor="text1"/>
+        </w:rPr>
+        <w:t>0</w:t>
+      </w:r>
+      <w:r>
+        <w:rPr>
+          <w:rStyle w:val="Accentuation"/>
+          <w:b/>
+          <w:bCs/>
+          <w:i w:val="0"/>
+          <w:iCs w:val="0"/>
+          <w:color w:val="000000" w:themeColor="text1"/>
+        </w:rPr>
+        <w:t xml:space="preserve"> Vercel :</w:t>
       </w:r>
     </w:p>
     <w:p>
@@ -7637,7 +7678,6 @@
           <w:noProof/>
           <w:color w:val="000000" w:themeColor="text1"/>
         </w:rPr>
-        <w:lastRenderedPageBreak/>
         <w:drawing>
           <wp:inline distT="0" distB="0" distL="0" distR="0" wp14:anchorId="33D02663" wp14:editId="411842E4">
             <wp:extent cx="1816100" cy="1117600"/>
@@ -7654,7 +7694,7 @@
                     <pic:cNvPicPr/>
                   </pic:nvPicPr>
                   <pic:blipFill>
-                    <a:blip r:embed="rId26">
+                    <a:blip r:embed="rId25">
                       <a:extLst>
                         <a:ext uri="{28A0092B-C50C-407E-A947-70E740481C1C}">
                           <a14:useLocalDpi xmlns:a14="http://schemas.microsoft.com/office/drawing/2010/main" val="0"/>
@@ -7697,7 +7737,15 @@
           <w:bCs/>
           <w:color w:val="000000" w:themeColor="text1"/>
         </w:rPr>
-        <w:t>1.12</w:t>
+        <w:t>1.1</w:t>
+      </w:r>
+      <w:r>
+        <w:rPr>
+          <w:b/>
+          <w:bCs/>
+          <w:color w:val="000000" w:themeColor="text1"/>
+        </w:rPr>
+        <w:t>1</w:t>
       </w:r>
       <w:r>
         <w:rPr>
@@ -7738,6 +7786,7 @@
           <w:noProof/>
           <w:color w:val="000000" w:themeColor="text1"/>
         </w:rPr>
+        <w:lastRenderedPageBreak/>
         <w:drawing>
           <wp:inline distT="0" distB="0" distL="0" distR="0" wp14:anchorId="21E26A68" wp14:editId="60EB3165">
             <wp:extent cx="1270000" cy="1270000"/>
@@ -7754,7 +7803,7 @@
                     <pic:cNvPicPr/>
                   </pic:nvPicPr>
                   <pic:blipFill>
-                    <a:blip r:embed="rId27">
+                    <a:blip r:embed="rId26">
                       <a:extLst>
                         <a:ext uri="{28A0092B-C50C-407E-A947-70E740481C1C}">
                           <a14:useLocalDpi xmlns:a14="http://schemas.microsoft.com/office/drawing/2010/main" val="0"/>
@@ -7797,7 +7846,21 @@
           <w:rStyle w:val="lev"/>
           <w:color w:val="000000" w:themeColor="text1"/>
         </w:rPr>
-        <w:t>TiDB Cloud</w:t>
+        <w:t>Ti</w:t>
+      </w:r>
+      <w:r>
+        <w:rPr>
+          <w:rStyle w:val="lev"/>
+          <w:color w:val="000000" w:themeColor="text1"/>
+        </w:rPr>
+        <w:t xml:space="preserve">tanium </w:t>
+      </w:r>
+      <w:r>
+        <w:rPr>
+          <w:rStyle w:val="lev"/>
+          <w:color w:val="000000" w:themeColor="text1"/>
+        </w:rPr>
+        <w:t>DB Cloud</w:t>
       </w:r>
       <w:r>
         <w:rPr>
@@ -7846,7 +7909,21 @@
           <w:rStyle w:val="lev"/>
           <w:color w:val="000000" w:themeColor="text1"/>
         </w:rPr>
-        <w:t>1.13 Brevo</w:t>
+        <w:t>1.1</w:t>
+      </w:r>
+      <w:r>
+        <w:rPr>
+          <w:rStyle w:val="lev"/>
+          <w:color w:val="000000" w:themeColor="text1"/>
+        </w:rPr>
+        <w:t>2</w:t>
+      </w:r>
+      <w:r>
+        <w:rPr>
+          <w:rStyle w:val="lev"/>
+          <w:color w:val="000000" w:themeColor="text1"/>
+        </w:rPr>
+        <w:t xml:space="preserve"> Brevo</w:t>
       </w:r>
       <w:r>
         <w:rPr>
@@ -7902,7 +7979,7 @@
                     <pic:cNvPicPr/>
                   </pic:nvPicPr>
                   <pic:blipFill>
-                    <a:blip r:embed="rId28">
+                    <a:blip r:embed="rId27">
                       <a:extLst>
                         <a:ext uri="{28A0092B-C50C-407E-A947-70E740481C1C}">
                           <a14:useLocalDpi xmlns:a14="http://schemas.microsoft.com/office/drawing/2010/main" val="0"/>
@@ -8017,7 +8094,6 @@
           <w:noProof/>
           <w:color w:val="000000" w:themeColor="text1"/>
         </w:rPr>
-        <w:lastRenderedPageBreak/>
         <w:drawing>
           <wp:inline distT="0" distB="0" distL="0" distR="0" wp14:anchorId="22E346D0" wp14:editId="14544A3D">
             <wp:extent cx="3943278" cy="2322017"/>
@@ -8031,6 +8107,94 @@
                 <pic:pic xmlns:pic="http://schemas.openxmlformats.org/drawingml/2006/picture">
                   <pic:nvPicPr>
                     <pic:cNvPr id="600707826" name="Image 600707826"/>
+                    <pic:cNvPicPr/>
+                  </pic:nvPicPr>
+                  <pic:blipFill>
+                    <a:blip r:embed="rId28" cstate="print">
+                      <a:extLst>
+                        <a:ext uri="{28A0092B-C50C-407E-A947-70E740481C1C}">
+                          <a14:useLocalDpi xmlns:a14="http://schemas.microsoft.com/office/drawing/2010/main" val="0"/>
+                        </a:ext>
+                      </a:extLst>
+                    </a:blip>
+                    <a:stretch>
+                      <a:fillRect/>
+                    </a:stretch>
+                  </pic:blipFill>
+                  <pic:spPr>
+                    <a:xfrm>
+                      <a:off x="0" y="0"/>
+                      <a:ext cx="3943278" cy="2322017"/>
+                    </a:xfrm>
+                    <a:prstGeom prst="rect">
+                      <a:avLst/>
+                    </a:prstGeom>
+                  </pic:spPr>
+                </pic:pic>
+              </a:graphicData>
+            </a:graphic>
+          </wp:inline>
+        </w:drawing>
+      </w:r>
+    </w:p>
+    <w:p>
+      <w:pPr>
+        <w:pStyle w:val="font-claude-response-body"/>
+        <w:jc w:val="both"/>
+        <w:rPr>
+          <w:color w:val="000000" w:themeColor="text1"/>
+        </w:rPr>
+      </w:pPr>
+      <w:r>
+        <w:rPr>
+          <w:rStyle w:val="lev"/>
+          <w:color w:val="000000" w:themeColor="text1"/>
+        </w:rPr>
+        <w:t>Figure 6 — Résultats de recherche (vue liste)</w:t>
+      </w:r>
+    </w:p>
+    <w:p>
+      <w:pPr>
+        <w:pStyle w:val="font-claude-response-body"/>
+        <w:jc w:val="both"/>
+        <w:rPr>
+          <w:color w:val="000000" w:themeColor="text1"/>
+        </w:rPr>
+      </w:pPr>
+      <w:r>
+        <w:rPr>
+          <w:color w:val="000000" w:themeColor="text1"/>
+        </w:rPr>
+        <w:lastRenderedPageBreak/>
+        <w:t>Cette vue illustre le cas d'utilisation « Rechercher un logement » : les résultats filtrés par quartier, type et prix s'affichent sous forme de cartes avec photo, statut, prix et caractéristiques.</w:t>
+      </w:r>
+    </w:p>
+    <w:p>
+      <w:pPr>
+        <w:pStyle w:val="font-claude-response-body"/>
+        <w:jc w:val="both"/>
+        <w:rPr>
+          <w:color w:val="000000" w:themeColor="text1"/>
+        </w:rPr>
+      </w:pPr>
+      <w:r>
+        <w:rPr>
+          <w:noProof/>
+          <w:color w:val="000000" w:themeColor="text1"/>
+        </w:rPr>
+        <w:drawing>
+          <wp:inline distT="0" distB="0" distL="0" distR="0" wp14:anchorId="57A6D7AF" wp14:editId="11195811">
+            <wp:extent cx="3943278" cy="2322017"/>
+            <wp:effectExtent l="0" t="0" r="3810" b="3175"/>
+            <wp:docPr id="1272596444" name="Image 2"/>
+            <wp:cNvGraphicFramePr>
+              <a:graphicFrameLocks xmlns:a="http://schemas.openxmlformats.org/drawingml/2006/main" noChangeAspect="1"/>
+            </wp:cNvGraphicFramePr>
+            <a:graphic xmlns:a="http://schemas.openxmlformats.org/drawingml/2006/main">
+              <a:graphicData uri="http://schemas.openxmlformats.org/drawingml/2006/picture">
+                <pic:pic xmlns:pic="http://schemas.openxmlformats.org/drawingml/2006/picture">
+                  <pic:nvPicPr>
+                    <pic:cNvPr id="1272596444" name="Image 1272596444"/>
                     <pic:cNvPicPr/>
                   </pic:nvPicPr>
                   <pic:blipFill>
@@ -8074,7 +8238,7 @@
           <w:rStyle w:val="lev"/>
           <w:color w:val="000000" w:themeColor="text1"/>
         </w:rPr>
-        <w:t>Figure 6 — Résultats de recherche (vue liste)</w:t>
+        <w:t>Figure 7 — Résultats de recherche (vue carte)</w:t>
       </w:r>
     </w:p>
     <w:p>
@@ -8089,7 +8253,7 @@
         <w:rPr>
           <w:color w:val="000000" w:themeColor="text1"/>
         </w:rPr>
-        <w:t>Cette vue illustre le cas d'utilisation « Rechercher un logement » : les résultats filtrés par quartier, type et prix s'affichent sous forme de cartes avec photo, statut, prix et caractéristiques.</w:t>
+        <w:t>Une vue cartographique, basée sur Leaflet et OpenStreetMap, permet de localiser les annonces disponibles sur la carte de Dakar, chaque marqueur affichant le loyer du bien.</w:t>
       </w:r>
     </w:p>
     <w:p>
@@ -8106,10 +8270,10 @@
           <w:color w:val="000000" w:themeColor="text1"/>
         </w:rPr>
         <w:drawing>
-          <wp:inline distT="0" distB="0" distL="0" distR="0" wp14:anchorId="57A6D7AF" wp14:editId="11195811">
+          <wp:inline distT="0" distB="0" distL="0" distR="0" wp14:anchorId="6A457D07" wp14:editId="712E1CF2">
             <wp:extent cx="3943278" cy="2322017"/>
-            <wp:effectExtent l="0" t="0" r="3810" b="3175"/>
-            <wp:docPr id="1272596444" name="Image 2"/>
+            <wp:effectExtent l="0" t="0" r="0" b="3175"/>
+            <wp:docPr id="1816756612" name="Image 3"/>
             <wp:cNvGraphicFramePr>
               <a:graphicFrameLocks xmlns:a="http://schemas.openxmlformats.org/drawingml/2006/main" noChangeAspect="1"/>
             </wp:cNvGraphicFramePr>
@@ -8117,7 +8281,7 @@
               <a:graphicData uri="http://schemas.openxmlformats.org/drawingml/2006/picture">
                 <pic:pic xmlns:pic="http://schemas.openxmlformats.org/drawingml/2006/picture">
                   <pic:nvPicPr>
-                    <pic:cNvPr id="1272596444" name="Image 1272596444"/>
+                    <pic:cNvPr id="1816756612" name="Image 1816756612"/>
                     <pic:cNvPicPr/>
                   </pic:nvPicPr>
                   <pic:blipFill>
@@ -8161,7 +8325,7 @@
           <w:rStyle w:val="lev"/>
           <w:color w:val="000000" w:themeColor="text1"/>
         </w:rPr>
-        <w:t>Figure 7 — Résultats de recherche (vue carte)</w:t>
+        <w:t>Figure 8 — Page de détail d'une annonce</w:t>
       </w:r>
     </w:p>
     <w:p>
@@ -8176,7 +8340,7 @@
         <w:rPr>
           <w:color w:val="000000" w:themeColor="text1"/>
         </w:rPr>
-        <w:t>Une vue cartographique, basée sur Leaflet et OpenStreetMap, permet de localiser les annonces disponibles sur la carte de Dakar, chaque marqueur affichant le loyer du bien.</w:t>
+        <w:t>La page de détail regroupe la galerie photo, les badges de statut, le prix, les caractéristiques du logement (pièces, surface, étage, meublé) et le profil du propriétaire associé.</w:t>
       </w:r>
     </w:p>
     <w:p>
@@ -8192,11 +8356,12 @@
           <w:noProof/>
           <w:color w:val="000000" w:themeColor="text1"/>
         </w:rPr>
+        <w:lastRenderedPageBreak/>
         <w:drawing>
-          <wp:inline distT="0" distB="0" distL="0" distR="0" wp14:anchorId="6A457D07" wp14:editId="712E1CF2">
+          <wp:inline distT="0" distB="0" distL="0" distR="0" wp14:anchorId="6B6FF9C4" wp14:editId="15A4DFE5">
             <wp:extent cx="3943278" cy="2322017"/>
             <wp:effectExtent l="0" t="0" r="0" b="3175"/>
-            <wp:docPr id="1816756612" name="Image 3"/>
+            <wp:docPr id="1313274945" name="Image 4"/>
             <wp:cNvGraphicFramePr>
               <a:graphicFrameLocks xmlns:a="http://schemas.openxmlformats.org/drawingml/2006/main" noChangeAspect="1"/>
             </wp:cNvGraphicFramePr>
@@ -8204,7 +8369,7 @@
               <a:graphicData uri="http://schemas.openxmlformats.org/drawingml/2006/picture">
                 <pic:pic xmlns:pic="http://schemas.openxmlformats.org/drawingml/2006/picture">
                   <pic:nvPicPr>
-                    <pic:cNvPr id="1816756612" name="Image 1816756612"/>
+                    <pic:cNvPr id="1313274945" name="Image 1313274945"/>
                     <pic:cNvPicPr/>
                   </pic:nvPicPr>
                   <pic:blipFill>
@@ -8248,8 +8413,7 @@
           <w:rStyle w:val="lev"/>
           <w:color w:val="000000" w:themeColor="text1"/>
         </w:rPr>
-        <w:lastRenderedPageBreak/>
-        <w:t>Figure 8 — Page de détail d'une annonce</w:t>
+        <w:t>Figure 9 — Suite de la page de détail : description, quartier et avis</w:t>
       </w:r>
     </w:p>
     <w:p>
@@ -8264,7 +8428,7 @@
         <w:rPr>
           <w:color w:val="000000" w:themeColor="text1"/>
         </w:rPr>
-        <w:t>La page de détail regroupe la galerie photo, les badges de statut, le prix, les caractéristiques du logement (pièces, surface, étage, meublé) et le profil du propriétaire associé.</w:t>
+        <w:t>Cette section affiche la description du logement, des informations sur le quartier et les avis laissés par les locataires ayant déjà occupé le bien.</w:t>
       </w:r>
     </w:p>
     <w:p>
@@ -8281,10 +8445,10 @@
           <w:color w:val="000000" w:themeColor="text1"/>
         </w:rPr>
         <w:drawing>
-          <wp:inline distT="0" distB="0" distL="0" distR="0" wp14:anchorId="6B6FF9C4" wp14:editId="15A4DFE5">
+          <wp:inline distT="0" distB="0" distL="0" distR="0" wp14:anchorId="7D896955" wp14:editId="1486E250">
             <wp:extent cx="3943278" cy="2322017"/>
             <wp:effectExtent l="0" t="0" r="0" b="3175"/>
-            <wp:docPr id="1313274945" name="Image 4"/>
+            <wp:docPr id="1128944953" name="Image 5"/>
             <wp:cNvGraphicFramePr>
               <a:graphicFrameLocks xmlns:a="http://schemas.openxmlformats.org/drawingml/2006/main" noChangeAspect="1"/>
             </wp:cNvGraphicFramePr>
@@ -8292,7 +8456,7 @@
               <a:graphicData uri="http://schemas.openxmlformats.org/drawingml/2006/picture">
                 <pic:pic xmlns:pic="http://schemas.openxmlformats.org/drawingml/2006/picture">
                   <pic:nvPicPr>
-                    <pic:cNvPr id="1313274945" name="Image 1313274945"/>
+                    <pic:cNvPr id="1128944953" name="Image 1128944953"/>
                     <pic:cNvPicPr/>
                   </pic:nvPicPr>
                   <pic:blipFill>
@@ -8336,7 +8500,7 @@
           <w:rStyle w:val="lev"/>
           <w:color w:val="000000" w:themeColor="text1"/>
         </w:rPr>
-        <w:t>Figure 9 — Suite de la page de détail : description, quartier et avis</w:t>
+        <w:t>Figure 10 — Messagerie côté locataire</w:t>
       </w:r>
     </w:p>
     <w:p>
@@ -8351,7 +8515,7 @@
         <w:rPr>
           <w:color w:val="000000" w:themeColor="text1"/>
         </w:rPr>
-        <w:t>Cette section affiche la description du logement, des informations sur le quartier et les avis laissés par les locataires ayant déjà occupé le bien.</w:t>
+        <w:t>Le locataire dispose d'un espace de conversation lui permettant de contacter directement un propriétaire, sans passer par un intermédiaire.</w:t>
       </w:r>
     </w:p>
     <w:p>
@@ -8368,10 +8532,10 @@
           <w:color w:val="000000" w:themeColor="text1"/>
         </w:rPr>
         <w:drawing>
-          <wp:inline distT="0" distB="0" distL="0" distR="0" wp14:anchorId="7D896955" wp14:editId="1486E250">
+          <wp:inline distT="0" distB="0" distL="0" distR="0" wp14:anchorId="6760983C" wp14:editId="131E82A6">
             <wp:extent cx="3943278" cy="2322017"/>
             <wp:effectExtent l="0" t="0" r="0" b="3175"/>
-            <wp:docPr id="1128944953" name="Image 5"/>
+            <wp:docPr id="1333524764" name="Image 6"/>
             <wp:cNvGraphicFramePr>
               <a:graphicFrameLocks xmlns:a="http://schemas.openxmlformats.org/drawingml/2006/main" noChangeAspect="1"/>
             </wp:cNvGraphicFramePr>
@@ -8379,7 +8543,7 @@
               <a:graphicData uri="http://schemas.openxmlformats.org/drawingml/2006/picture">
                 <pic:pic xmlns:pic="http://schemas.openxmlformats.org/drawingml/2006/picture">
                   <pic:nvPicPr>
-                    <pic:cNvPr id="1128944953" name="Image 1128944953"/>
+                    <pic:cNvPr id="1333524764" name="Image 1333524764"/>
                     <pic:cNvPicPr/>
                   </pic:nvPicPr>
                   <pic:blipFill>
@@ -8423,7 +8587,8 @@
           <w:rStyle w:val="lev"/>
           <w:color w:val="000000" w:themeColor="text1"/>
         </w:rPr>
-        <w:t>Figure 10 — Messagerie côté locataire</w:t>
+        <w:lastRenderedPageBreak/>
+        <w:t>Figure 11 — Réponse du propriétaire à un locataire</w:t>
       </w:r>
     </w:p>
     <w:p>
@@ -8438,7 +8603,7 @@
         <w:rPr>
           <w:color w:val="000000" w:themeColor="text1"/>
         </w:rPr>
-        <w:t>Le locataire dispose d'un espace de conversation lui permettant de contacter directement un propriétaire, sans passer par un intermédiaire.</w:t>
+        <w:t>Le propriétaire peut répondre aux demandes reçues via sa propre interface de messagerie, concrétisant le contact direct entre les deux parties.</w:t>
       </w:r>
     </w:p>
     <w:p>
@@ -8454,12 +8619,11 @@
           <w:noProof/>
           <w:color w:val="000000" w:themeColor="text1"/>
         </w:rPr>
-        <w:lastRenderedPageBreak/>
         <w:drawing>
-          <wp:inline distT="0" distB="0" distL="0" distR="0" wp14:anchorId="6760983C" wp14:editId="131E82A6">
+          <wp:inline distT="0" distB="0" distL="0" distR="0" wp14:anchorId="731AF250" wp14:editId="6A6DD8AE">
             <wp:extent cx="3943278" cy="2322017"/>
             <wp:effectExtent l="0" t="0" r="0" b="3175"/>
-            <wp:docPr id="1333524764" name="Image 6"/>
+            <wp:docPr id="341726044" name="Image 7"/>
             <wp:cNvGraphicFramePr>
               <a:graphicFrameLocks xmlns:a="http://schemas.openxmlformats.org/drawingml/2006/main" noChangeAspect="1"/>
             </wp:cNvGraphicFramePr>
@@ -8467,7 +8631,7 @@
               <a:graphicData uri="http://schemas.openxmlformats.org/drawingml/2006/picture">
                 <pic:pic xmlns:pic="http://schemas.openxmlformats.org/drawingml/2006/picture">
                   <pic:nvPicPr>
-                    <pic:cNvPr id="1333524764" name="Image 1333524764"/>
+                    <pic:cNvPr id="341726044" name="Image 341726044"/>
                     <pic:cNvPicPr/>
                   </pic:nvPicPr>
                   <pic:blipFill>
@@ -8511,7 +8675,7 @@
           <w:rStyle w:val="lev"/>
           <w:color w:val="000000" w:themeColor="text1"/>
         </w:rPr>
-        <w:t>Figure 11 — Réponse du propriétaire à un locataire</w:t>
+        <w:t>Figure 12 — Espace « Mes favoris » du locataire</w:t>
       </w:r>
     </w:p>
     <w:p>
@@ -8526,7 +8690,7 @@
         <w:rPr>
           <w:color w:val="000000" w:themeColor="text1"/>
         </w:rPr>
-        <w:t>Le propriétaire peut répondre aux demandes reçues via sa propre interface de messagerie, concrétisant le contact direct entre les deux parties.</w:t>
+        <w:t>Le locataire peut sauvegarder des annonces dans un espace personnel « Mes favoris » pour les retrouver facilement.</w:t>
       </w:r>
     </w:p>
     <w:p>
@@ -8543,10 +8707,10 @@
           <w:color w:val="000000" w:themeColor="text1"/>
         </w:rPr>
         <w:drawing>
-          <wp:inline distT="0" distB="0" distL="0" distR="0" wp14:anchorId="731AF250" wp14:editId="6A6DD8AE">
+          <wp:inline distT="0" distB="0" distL="0" distR="0" wp14:anchorId="7E001F8B" wp14:editId="1E5CD541">
             <wp:extent cx="3943278" cy="2322017"/>
             <wp:effectExtent l="0" t="0" r="0" b="3175"/>
-            <wp:docPr id="341726044" name="Image 7"/>
+            <wp:docPr id="595498667" name="Image 8"/>
             <wp:cNvGraphicFramePr>
               <a:graphicFrameLocks xmlns:a="http://schemas.openxmlformats.org/drawingml/2006/main" noChangeAspect="1"/>
             </wp:cNvGraphicFramePr>
@@ -8554,7 +8718,7 @@
               <a:graphicData uri="http://schemas.openxmlformats.org/drawingml/2006/picture">
                 <pic:pic xmlns:pic="http://schemas.openxmlformats.org/drawingml/2006/picture">
                   <pic:nvPicPr>
-                    <pic:cNvPr id="341726044" name="Image 341726044"/>
+                    <pic:cNvPr id="595498667" name="Image 595498667"/>
                     <pic:cNvPicPr/>
                   </pic:nvPicPr>
                   <pic:blipFill>
@@ -8598,7 +8762,7 @@
           <w:rStyle w:val="lev"/>
           <w:color w:val="000000" w:themeColor="text1"/>
         </w:rPr>
-        <w:t>Figure 12 — Espace « Mes favoris » du locataire</w:t>
+        <w:t>Figure 13 — Formulaire de publication d'une annonce (étape 1/3)</w:t>
       </w:r>
     </w:p>
     <w:p>
@@ -8613,7 +8777,7 @@
         <w:rPr>
           <w:color w:val="000000" w:themeColor="text1"/>
         </w:rPr>
-        <w:t>Le locataire peut sauvegarder des annonces dans un espace personnel « Mes favoris » pour les retrouver facilement.</w:t>
+        <w:t>La publication d'une annonce se fait en plusieurs étapes ; la première permet de renseigner le type de logement, le quartier et l'adresse.</w:t>
       </w:r>
     </w:p>
     <w:p>
@@ -8629,11 +8793,12 @@
           <w:noProof/>
           <w:color w:val="000000" w:themeColor="text1"/>
         </w:rPr>
+        <w:lastRenderedPageBreak/>
         <w:drawing>
-          <wp:inline distT="0" distB="0" distL="0" distR="0" wp14:anchorId="7E001F8B" wp14:editId="1E5CD541">
+          <wp:inline distT="0" distB="0" distL="0" distR="0" wp14:anchorId="52D329C8" wp14:editId="4924A864">
             <wp:extent cx="3943278" cy="2322017"/>
             <wp:effectExtent l="0" t="0" r="0" b="3175"/>
-            <wp:docPr id="595498667" name="Image 8"/>
+            <wp:docPr id="352001412" name="Image 9"/>
             <wp:cNvGraphicFramePr>
               <a:graphicFrameLocks xmlns:a="http://schemas.openxmlformats.org/drawingml/2006/main" noChangeAspect="1"/>
             </wp:cNvGraphicFramePr>
@@ -8641,7 +8806,7 @@
               <a:graphicData uri="http://schemas.openxmlformats.org/drawingml/2006/picture">
                 <pic:pic xmlns:pic="http://schemas.openxmlformats.org/drawingml/2006/picture">
                   <pic:nvPicPr>
-                    <pic:cNvPr id="595498667" name="Image 595498667"/>
+                    <pic:cNvPr id="352001412" name="Image 352001412"/>
                     <pic:cNvPicPr/>
                   </pic:nvPicPr>
                   <pic:blipFill>
@@ -8685,8 +8850,7 @@
           <w:rStyle w:val="lev"/>
           <w:color w:val="000000" w:themeColor="text1"/>
         </w:rPr>
-        <w:lastRenderedPageBreak/>
-        <w:t>Figure 13 — Formulaire de publication d'une annonce (étape 1/3)</w:t>
+        <w:t>Figure 14 — Profil et gestion des annonces du propriétaire</w:t>
       </w:r>
     </w:p>
     <w:p>
@@ -8701,7 +8865,7 @@
         <w:rPr>
           <w:color w:val="000000" w:themeColor="text1"/>
         </w:rPr>
-        <w:t>La publication d'une annonce se fait en plusieurs étapes ; la première permet de renseigner le type de logement, le quartier et l'adresse.</w:t>
+        <w:t>Le propriétaire gère ses informations personnelles et l'ensemble de ses annonces (modification, suppression, marquage comme loué) depuis son espace profil.</w:t>
       </w:r>
     </w:p>
     <w:p>
@@ -8718,10 +8882,10 @@
           <w:color w:val="000000" w:themeColor="text1"/>
         </w:rPr>
         <w:drawing>
-          <wp:inline distT="0" distB="0" distL="0" distR="0" wp14:anchorId="52D329C8" wp14:editId="4924A864">
+          <wp:inline distT="0" distB="0" distL="0" distR="0" wp14:anchorId="312A0068" wp14:editId="0B61FC9C">
             <wp:extent cx="3943278" cy="2322017"/>
             <wp:effectExtent l="0" t="0" r="0" b="3175"/>
-            <wp:docPr id="352001412" name="Image 9"/>
+            <wp:docPr id="2062917943" name="Image 10"/>
             <wp:cNvGraphicFramePr>
               <a:graphicFrameLocks xmlns:a="http://schemas.openxmlformats.org/drawingml/2006/main" noChangeAspect="1"/>
             </wp:cNvGraphicFramePr>
@@ -8729,7 +8893,7 @@
               <a:graphicData uri="http://schemas.openxmlformats.org/drawingml/2006/picture">
                 <pic:pic xmlns:pic="http://schemas.openxmlformats.org/drawingml/2006/picture">
                   <pic:nvPicPr>
-                    <pic:cNvPr id="352001412" name="Image 352001412"/>
+                    <pic:cNvPr id="2062917943" name="Image 2062917943"/>
                     <pic:cNvPicPr/>
                   </pic:nvPicPr>
                   <pic:blipFill>
@@ -8773,7 +8937,7 @@
           <w:rStyle w:val="lev"/>
           <w:color w:val="000000" w:themeColor="text1"/>
         </w:rPr>
-        <w:t>Figure 14 — Profil et gestion des annonces du propriétaire</w:t>
+        <w:t>Figure 15 — Tableau de bord de l'administrateur</w:t>
       </w:r>
     </w:p>
     <w:p>
@@ -8788,7 +8952,7 @@
         <w:rPr>
           <w:color w:val="000000" w:themeColor="text1"/>
         </w:rPr>
-        <w:t>Le propriétaire gère ses informations personnelles et l'ensemble de ses annonces (modification, suppression, marquage comme loué) depuis son espace profil.</w:t>
+        <w:t>Le tableau de bord synthétise l'activité de la plateforme (annonces en attente, publiées, propriétaires, locataires) et permet d'agir rapidement sur les annonces à modérer.</w:t>
       </w:r>
     </w:p>
     <w:p>
@@ -8805,10 +8969,10 @@
           <w:color w:val="000000" w:themeColor="text1"/>
         </w:rPr>
         <w:drawing>
-          <wp:inline distT="0" distB="0" distL="0" distR="0" wp14:anchorId="312A0068" wp14:editId="0B61FC9C">
+          <wp:inline distT="0" distB="0" distL="0" distR="0" wp14:anchorId="75BA36DA" wp14:editId="2FA29605">
             <wp:extent cx="3943278" cy="2322017"/>
             <wp:effectExtent l="0" t="0" r="0" b="3175"/>
-            <wp:docPr id="2062917943" name="Image 10"/>
+            <wp:docPr id="257614051" name="Image 11"/>
             <wp:cNvGraphicFramePr>
               <a:graphicFrameLocks xmlns:a="http://schemas.openxmlformats.org/drawingml/2006/main" noChangeAspect="1"/>
             </wp:cNvGraphicFramePr>
@@ -8816,7 +8980,7 @@
               <a:graphicData uri="http://schemas.openxmlformats.org/drawingml/2006/picture">
                 <pic:pic xmlns:pic="http://schemas.openxmlformats.org/drawingml/2006/picture">
                   <pic:nvPicPr>
-                    <pic:cNvPr id="2062917943" name="Image 2062917943"/>
+                    <pic:cNvPr id="257614051" name="Image 257614051"/>
                     <pic:cNvPicPr/>
                   </pic:nvPicPr>
                   <pic:blipFill>
@@ -8860,7 +9024,8 @@
           <w:rStyle w:val="lev"/>
           <w:color w:val="000000" w:themeColor="text1"/>
         </w:rPr>
-        <w:t>Figure 15 — Tableau de bord de l'administrateur</w:t>
+        <w:lastRenderedPageBreak/>
+        <w:t>Figure 16 — Validation des annonces par l'administrateur</w:t>
       </w:r>
     </w:p>
     <w:p>
@@ -8875,7 +9040,7 @@
         <w:rPr>
           <w:color w:val="000000" w:themeColor="text1"/>
         </w:rPr>
-        <w:t>Le tableau de bord synthétise l'activité de la plateforme (annonces en attente, publiées, propriétaires, locataires) et permet d'agir rapidement sur les annonces à modérer.</w:t>
+        <w:t>Cette page liste toutes les annonces avec leur statut ; l'administrateur peut y valider, rejeter ou suspendre un bien, assurant la fiabilité du contenu diffusé</w:t>
       </w:r>
     </w:p>
     <w:p>
@@ -8891,12 +9056,11 @@
           <w:noProof/>
           <w:color w:val="000000" w:themeColor="text1"/>
         </w:rPr>
-        <w:lastRenderedPageBreak/>
         <w:drawing>
-          <wp:inline distT="0" distB="0" distL="0" distR="0" wp14:anchorId="75BA36DA" wp14:editId="2FA29605">
+          <wp:inline distT="0" distB="0" distL="0" distR="0" wp14:anchorId="327B3F76" wp14:editId="27E5A2C8">
             <wp:extent cx="3943278" cy="2322017"/>
             <wp:effectExtent l="0" t="0" r="0" b="3175"/>
-            <wp:docPr id="257614051" name="Image 11"/>
+            <wp:docPr id="1462504660" name="Image 12"/>
             <wp:cNvGraphicFramePr>
               <a:graphicFrameLocks xmlns:a="http://schemas.openxmlformats.org/drawingml/2006/main" noChangeAspect="1"/>
             </wp:cNvGraphicFramePr>
@@ -8904,7 +9068,7 @@
               <a:graphicData uri="http://schemas.openxmlformats.org/drawingml/2006/picture">
                 <pic:pic xmlns:pic="http://schemas.openxmlformats.org/drawingml/2006/picture">
                   <pic:nvPicPr>
-                    <pic:cNvPr id="257614051" name="Image 257614051"/>
+                    <pic:cNvPr id="1462504660" name="Image 1462504660"/>
                     <pic:cNvPicPr/>
                   </pic:nvPicPr>
                   <pic:blipFill>
@@ -8937,93 +9101,6 @@
     </w:p>
     <w:p>
       <w:pPr>
-        <w:pStyle w:val="font-claude-response-body"/>
-        <w:jc w:val="both"/>
-        <w:rPr>
-          <w:color w:val="000000" w:themeColor="text1"/>
-        </w:rPr>
-      </w:pPr>
-      <w:r>
-        <w:rPr>
-          <w:rStyle w:val="lev"/>
-          <w:color w:val="000000" w:themeColor="text1"/>
-        </w:rPr>
-        <w:t>Figure 16 — Validation des annonces par l'administrateur</w:t>
-      </w:r>
-    </w:p>
-    <w:p>
-      <w:pPr>
-        <w:pStyle w:val="font-claude-response-body"/>
-        <w:jc w:val="both"/>
-        <w:rPr>
-          <w:color w:val="000000" w:themeColor="text1"/>
-        </w:rPr>
-      </w:pPr>
-      <w:r>
-        <w:rPr>
-          <w:color w:val="000000" w:themeColor="text1"/>
-        </w:rPr>
-        <w:t>Cette page liste toutes les annonces avec leur statut ; l'administrateur peut y valider, rejeter ou suspendre un bien, assurant la fiabilité du contenu diffusé</w:t>
-      </w:r>
-    </w:p>
-    <w:p>
-      <w:pPr>
-        <w:pStyle w:val="font-claude-response-body"/>
-        <w:jc w:val="both"/>
-        <w:rPr>
-          <w:color w:val="000000" w:themeColor="text1"/>
-        </w:rPr>
-      </w:pPr>
-      <w:r>
-        <w:rPr>
-          <w:noProof/>
-          <w:color w:val="000000" w:themeColor="text1"/>
-        </w:rPr>
-        <w:drawing>
-          <wp:inline distT="0" distB="0" distL="0" distR="0" wp14:anchorId="327B3F76" wp14:editId="27E5A2C8">
-            <wp:extent cx="3943278" cy="2322017"/>
-            <wp:effectExtent l="0" t="0" r="0" b="3175"/>
-            <wp:docPr id="1462504660" name="Image 12"/>
-            <wp:cNvGraphicFramePr>
-              <a:graphicFrameLocks xmlns:a="http://schemas.openxmlformats.org/drawingml/2006/main" noChangeAspect="1"/>
-            </wp:cNvGraphicFramePr>
-            <a:graphic xmlns:a="http://schemas.openxmlformats.org/drawingml/2006/main">
-              <a:graphicData uri="http://schemas.openxmlformats.org/drawingml/2006/picture">
-                <pic:pic xmlns:pic="http://schemas.openxmlformats.org/drawingml/2006/picture">
-                  <pic:nvPicPr>
-                    <pic:cNvPr id="1462504660" name="Image 1462504660"/>
-                    <pic:cNvPicPr/>
-                  </pic:nvPicPr>
-                  <pic:blipFill>
-                    <a:blip r:embed="rId40" cstate="print">
-                      <a:extLst>
-                        <a:ext uri="{28A0092B-C50C-407E-A947-70E740481C1C}">
-                          <a14:useLocalDpi xmlns:a14="http://schemas.microsoft.com/office/drawing/2010/main" val="0"/>
-                        </a:ext>
-                      </a:extLst>
-                    </a:blip>
-                    <a:stretch>
-                      <a:fillRect/>
-                    </a:stretch>
-                  </pic:blipFill>
-                  <pic:spPr>
-                    <a:xfrm>
-                      <a:off x="0" y="0"/>
-                      <a:ext cx="3943278" cy="2322017"/>
-                    </a:xfrm>
-                    <a:prstGeom prst="rect">
-                      <a:avLst/>
-                    </a:prstGeom>
-                  </pic:spPr>
-                </pic:pic>
-              </a:graphicData>
-            </a:graphic>
-          </wp:inline>
-        </w:drawing>
-      </w:r>
-    </w:p>
-    <w:p>
-      <w:pPr>
         <w:pStyle w:val="Titre3"/>
         <w:jc w:val="both"/>
         <w:rPr>
@@ -9089,8 +9166,8 @@
       </w:r>
     </w:p>
     <w:sectPr>
-      <w:headerReference w:type="default" r:id="rId41"/>
-      <w:footerReference w:type="default" r:id="rId42"/>
+      <w:headerReference w:type="default" r:id="rId40"/>
+      <w:footerReference w:type="default" r:id="rId41"/>
       <w:pgSz w:w="11906" w:h="16838"/>
       <w:pgMar w:top="1000" w:right="1200" w:bottom="1000" w:left="1200" w:header="600" w:footer="600" w:gutter="0"/>
       <w:cols w:space="720"/>

</xml_diff>